<commit_message>
Phan 1 chay cac lenh docker
</commit_message>
<xml_diff>
--- a/Tuan04/nguyentrungquyen_22640121_MinhChung.docx
+++ b/Tuan04/nguyentrungquyen_22640121_MinhChung.docx
@@ -3,8 +3,2270 @@
 <w:document xmlns:wpc="http://schemas.microsoft.com/office/word/2010/wordprocessingCanvas" xmlns:mc="http://schemas.openxmlformats.org/markup-compatibility/2006" xmlns:o="urn:schemas-microsoft-com:office:office" xmlns:r="http://schemas.openxmlformats.org/officeDocument/2006/relationships" xmlns:m="http://schemas.openxmlformats.org/officeDocument/2006/math" xmlns:v="urn:schemas-microsoft-com:vml" xmlns:wp14="http://schemas.microsoft.com/office/word/2010/wordprocessingDrawing" xmlns:wp="http://schemas.openxmlformats.org/drawingml/2006/wordprocessingDrawing" xmlns:w10="urn:schemas-microsoft-com:office:word" xmlns:w="http://schemas.openxmlformats.org/wordprocessingml/2006/main" xmlns:w14="http://schemas.microsoft.com/office/word/2010/wordml" xmlns:w15="http://schemas.microsoft.com/office/word/2012/wordml" xmlns:wpg="http://schemas.microsoft.com/office/word/2010/wordprocessingGroup" xmlns:wpi="http://schemas.microsoft.com/office/word/2010/wordprocessingInk" xmlns:wne="http://schemas.microsoft.com/office/word/2006/wordml" xmlns:wps="http://schemas.microsoft.com/office/word/2010/wordprocessingShape" mc:Ignorable="w14 w15 wp14">
   <w:body>
     <w:p>
+      <w:pPr>
+        <w:rPr>
+          <w:rFonts w:ascii="Times New Roman" w:hAnsi="Times New Roman" w:cs="Times New Roman"/>
+          <w:sz w:val="28"/>
+          <w:szCs w:val="28"/>
+        </w:rPr>
+      </w:pPr>
+      <w:r>
+        <w:rPr>
+          <w:rFonts w:ascii="Times New Roman" w:hAnsi="Times New Roman" w:cs="Times New Roman"/>
+          <w:sz w:val="28"/>
+          <w:szCs w:val="28"/>
+        </w:rPr>
+        <w:t>Phần 1: Các lệnh cơ bản thao tác với Docker</w:t>
+      </w:r>
+    </w:p>
+    <w:p>
+      <w:pPr>
+        <w:pStyle w:val="ListParagraph"/>
+        <w:numPr>
+          <w:ilvl w:val="0"/>
+          <w:numId w:val="1"/>
+        </w:numPr>
+        <w:rPr>
+          <w:rFonts w:ascii="Times New Roman" w:hAnsi="Times New Roman" w:cs="Times New Roman"/>
+          <w:sz w:val="28"/>
+          <w:szCs w:val="28"/>
+        </w:rPr>
+      </w:pPr>
+      <w:r>
+        <w:rPr>
+          <w:rFonts w:ascii="Times New Roman" w:hAnsi="Times New Roman" w:cs="Times New Roman"/>
+          <w:sz w:val="28"/>
+          <w:szCs w:val="28"/>
+        </w:rPr>
+        <w:t>Docker –version</w:t>
+      </w:r>
+    </w:p>
+    <w:p>
+      <w:pPr>
+        <w:rPr>
+          <w:rFonts w:ascii="Times New Roman" w:hAnsi="Times New Roman" w:cs="Times New Roman"/>
+          <w:sz w:val="28"/>
+          <w:szCs w:val="28"/>
+        </w:rPr>
+      </w:pPr>
+      <w:r>
+        <w:rPr>
+          <w:rFonts w:ascii="Times New Roman" w:hAnsi="Times New Roman" w:cs="Times New Roman"/>
+          <w:sz w:val="28"/>
+          <w:szCs w:val="28"/>
+        </w:rPr>
+        <w:drawing>
+          <wp:inline distT="0" distB="0" distL="0" distR="0" wp14:anchorId="2DEA8DA6" wp14:editId="366B870C">
+            <wp:extent cx="5943600" cy="3343275"/>
+            <wp:effectExtent l="0" t="0" r="0" b="9525"/>
+            <wp:docPr id="1" name="Picture 1"/>
+            <wp:cNvGraphicFramePr>
+              <a:graphicFrameLocks xmlns:a="http://schemas.openxmlformats.org/drawingml/2006/main" noChangeAspect="1"/>
+            </wp:cNvGraphicFramePr>
+            <a:graphic xmlns:a="http://schemas.openxmlformats.org/drawingml/2006/main">
+              <a:graphicData uri="http://schemas.openxmlformats.org/drawingml/2006/picture">
+                <pic:pic xmlns:pic="http://schemas.openxmlformats.org/drawingml/2006/picture">
+                  <pic:nvPicPr>
+                    <pic:cNvPr id="1" name=""/>
+                    <pic:cNvPicPr/>
+                  </pic:nvPicPr>
+                  <pic:blipFill>
+                    <a:blip r:embed="rId5"/>
+                    <a:stretch>
+                      <a:fillRect/>
+                    </a:stretch>
+                  </pic:blipFill>
+                  <pic:spPr>
+                    <a:xfrm>
+                      <a:off x="0" y="0"/>
+                      <a:ext cx="5943600" cy="3343275"/>
+                    </a:xfrm>
+                    <a:prstGeom prst="rect">
+                      <a:avLst/>
+                    </a:prstGeom>
+                  </pic:spPr>
+                </pic:pic>
+              </a:graphicData>
+            </a:graphic>
+          </wp:inline>
+        </w:drawing>
+      </w:r>
+    </w:p>
+    <w:p>
+      <w:pPr>
+        <w:pStyle w:val="ListParagraph"/>
+        <w:numPr>
+          <w:ilvl w:val="0"/>
+          <w:numId w:val="1"/>
+        </w:numPr>
+        <w:rPr>
+          <w:rFonts w:ascii="Times New Roman" w:hAnsi="Times New Roman" w:cs="Times New Roman"/>
+          <w:sz w:val="28"/>
+          <w:szCs w:val="28"/>
+        </w:rPr>
+      </w:pPr>
+      <w:r>
+        <w:rPr>
+          <w:rFonts w:ascii="Times New Roman" w:hAnsi="Times New Roman" w:cs="Times New Roman"/>
+          <w:sz w:val="28"/>
+          <w:szCs w:val="28"/>
+        </w:rPr>
+        <w:t>Docker run hello-world</w:t>
+      </w:r>
+    </w:p>
+    <w:p>
+      <w:pPr>
+        <w:rPr>
+          <w:rFonts w:ascii="Times New Roman" w:hAnsi="Times New Roman" w:cs="Times New Roman"/>
+          <w:sz w:val="28"/>
+          <w:szCs w:val="28"/>
+        </w:rPr>
+      </w:pPr>
+      <w:r>
+        <w:rPr>
+          <w:rFonts w:ascii="Times New Roman" w:hAnsi="Times New Roman" w:cs="Times New Roman"/>
+          <w:sz w:val="28"/>
+          <w:szCs w:val="28"/>
+        </w:rPr>
+        <w:drawing>
+          <wp:inline distT="0" distB="0" distL="0" distR="0" wp14:anchorId="3BA055F0" wp14:editId="1DE4390F">
+            <wp:extent cx="5943600" cy="3343275"/>
+            <wp:effectExtent l="0" t="0" r="0" b="9525"/>
+            <wp:docPr id="2" name="Picture 2"/>
+            <wp:cNvGraphicFramePr>
+              <a:graphicFrameLocks xmlns:a="http://schemas.openxmlformats.org/drawingml/2006/main" noChangeAspect="1"/>
+            </wp:cNvGraphicFramePr>
+            <a:graphic xmlns:a="http://schemas.openxmlformats.org/drawingml/2006/main">
+              <a:graphicData uri="http://schemas.openxmlformats.org/drawingml/2006/picture">
+                <pic:pic xmlns:pic="http://schemas.openxmlformats.org/drawingml/2006/picture">
+                  <pic:nvPicPr>
+                    <pic:cNvPr id="1" name=""/>
+                    <pic:cNvPicPr/>
+                  </pic:nvPicPr>
+                  <pic:blipFill>
+                    <a:blip r:embed="rId6"/>
+                    <a:stretch>
+                      <a:fillRect/>
+                    </a:stretch>
+                  </pic:blipFill>
+                  <pic:spPr>
+                    <a:xfrm>
+                      <a:off x="0" y="0"/>
+                      <a:ext cx="5943600" cy="3343275"/>
+                    </a:xfrm>
+                    <a:prstGeom prst="rect">
+                      <a:avLst/>
+                    </a:prstGeom>
+                  </pic:spPr>
+                </pic:pic>
+              </a:graphicData>
+            </a:graphic>
+          </wp:inline>
+        </w:drawing>
+      </w:r>
+    </w:p>
+    <w:p>
+      <w:pPr>
+        <w:pStyle w:val="ListParagraph"/>
+        <w:numPr>
+          <w:ilvl w:val="0"/>
+          <w:numId w:val="1"/>
+        </w:numPr>
+        <w:rPr>
+          <w:rFonts w:ascii="Times New Roman" w:hAnsi="Times New Roman" w:cs="Times New Roman"/>
+          <w:sz w:val="28"/>
+          <w:szCs w:val="28"/>
+        </w:rPr>
+      </w:pPr>
+      <w:r>
+        <w:rPr>
+          <w:rFonts w:ascii="Times New Roman" w:hAnsi="Times New Roman" w:cs="Times New Roman"/>
+          <w:sz w:val="28"/>
+          <w:szCs w:val="28"/>
+        </w:rPr>
+        <w:t>Docker pull nginx</w:t>
+      </w:r>
+    </w:p>
+    <w:p>
+      <w:pPr>
+        <w:ind w:left="360"/>
+        <w:rPr>
+          <w:rFonts w:ascii="Times New Roman" w:hAnsi="Times New Roman" w:cs="Times New Roman"/>
+          <w:sz w:val="28"/>
+          <w:szCs w:val="28"/>
+        </w:rPr>
+      </w:pPr>
+    </w:p>
+    <w:p>
+      <w:pPr>
+        <w:ind w:left="360"/>
+        <w:rPr>
+          <w:rFonts w:ascii="Times New Roman" w:hAnsi="Times New Roman" w:cs="Times New Roman"/>
+          <w:sz w:val="28"/>
+          <w:szCs w:val="28"/>
+        </w:rPr>
+      </w:pPr>
+      <w:r>
+        <w:rPr>
+          <w:rFonts w:ascii="Times New Roman" w:hAnsi="Times New Roman" w:cs="Times New Roman"/>
+          <w:sz w:val="28"/>
+          <w:szCs w:val="28"/>
+        </w:rPr>
+        <w:drawing>
+          <wp:inline distT="0" distB="0" distL="0" distR="0" wp14:anchorId="2C77988A" wp14:editId="3E5893E5">
+            <wp:extent cx="5943600" cy="3343275"/>
+            <wp:effectExtent l="0" t="0" r="0" b="9525"/>
+            <wp:docPr id="3" name="Picture 3"/>
+            <wp:cNvGraphicFramePr>
+              <a:graphicFrameLocks xmlns:a="http://schemas.openxmlformats.org/drawingml/2006/main" noChangeAspect="1"/>
+            </wp:cNvGraphicFramePr>
+            <a:graphic xmlns:a="http://schemas.openxmlformats.org/drawingml/2006/main">
+              <a:graphicData uri="http://schemas.openxmlformats.org/drawingml/2006/picture">
+                <pic:pic xmlns:pic="http://schemas.openxmlformats.org/drawingml/2006/picture">
+                  <pic:nvPicPr>
+                    <pic:cNvPr id="1" name=""/>
+                    <pic:cNvPicPr/>
+                  </pic:nvPicPr>
+                  <pic:blipFill>
+                    <a:blip r:embed="rId7"/>
+                    <a:stretch>
+                      <a:fillRect/>
+                    </a:stretch>
+                  </pic:blipFill>
+                  <pic:spPr>
+                    <a:xfrm>
+                      <a:off x="0" y="0"/>
+                      <a:ext cx="5943600" cy="3343275"/>
+                    </a:xfrm>
+                    <a:prstGeom prst="rect">
+                      <a:avLst/>
+                    </a:prstGeom>
+                  </pic:spPr>
+                </pic:pic>
+              </a:graphicData>
+            </a:graphic>
+          </wp:inline>
+        </w:drawing>
+      </w:r>
+    </w:p>
+    <w:p>
+      <w:pPr>
+        <w:pStyle w:val="ListParagraph"/>
+        <w:numPr>
+          <w:ilvl w:val="0"/>
+          <w:numId w:val="1"/>
+        </w:numPr>
+        <w:rPr>
+          <w:rFonts w:ascii="Times New Roman" w:hAnsi="Times New Roman" w:cs="Times New Roman"/>
+          <w:sz w:val="28"/>
+          <w:szCs w:val="28"/>
+        </w:rPr>
+      </w:pPr>
+      <w:r>
+        <w:rPr>
+          <w:rFonts w:ascii="Times New Roman" w:hAnsi="Times New Roman" w:cs="Times New Roman"/>
+          <w:sz w:val="28"/>
+          <w:szCs w:val="28"/>
+        </w:rPr>
+        <w:t>Docker images</w:t>
+      </w:r>
+    </w:p>
+    <w:p>
+      <w:pPr>
+        <w:rPr>
+          <w:rFonts w:ascii="Times New Roman" w:hAnsi="Times New Roman" w:cs="Times New Roman"/>
+          <w:sz w:val="28"/>
+          <w:szCs w:val="28"/>
+        </w:rPr>
+      </w:pPr>
+      <w:r>
+        <w:rPr>
+          <w:rFonts w:ascii="Times New Roman" w:hAnsi="Times New Roman" w:cs="Times New Roman"/>
+          <w:sz w:val="28"/>
+          <w:szCs w:val="28"/>
+        </w:rPr>
+        <w:drawing>
+          <wp:inline distT="0" distB="0" distL="0" distR="0" wp14:anchorId="34470D4C" wp14:editId="46D34445">
+            <wp:extent cx="5943600" cy="3343275"/>
+            <wp:effectExtent l="0" t="0" r="0" b="9525"/>
+            <wp:docPr id="4" name="Picture 4"/>
+            <wp:cNvGraphicFramePr>
+              <a:graphicFrameLocks xmlns:a="http://schemas.openxmlformats.org/drawingml/2006/main" noChangeAspect="1"/>
+            </wp:cNvGraphicFramePr>
+            <a:graphic xmlns:a="http://schemas.openxmlformats.org/drawingml/2006/main">
+              <a:graphicData uri="http://schemas.openxmlformats.org/drawingml/2006/picture">
+                <pic:pic xmlns:pic="http://schemas.openxmlformats.org/drawingml/2006/picture">
+                  <pic:nvPicPr>
+                    <pic:cNvPr id="1" name=""/>
+                    <pic:cNvPicPr/>
+                  </pic:nvPicPr>
+                  <pic:blipFill>
+                    <a:blip r:embed="rId8"/>
+                    <a:stretch>
+                      <a:fillRect/>
+                    </a:stretch>
+                  </pic:blipFill>
+                  <pic:spPr>
+                    <a:xfrm>
+                      <a:off x="0" y="0"/>
+                      <a:ext cx="5943600" cy="3343275"/>
+                    </a:xfrm>
+                    <a:prstGeom prst="rect">
+                      <a:avLst/>
+                    </a:prstGeom>
+                  </pic:spPr>
+                </pic:pic>
+              </a:graphicData>
+            </a:graphic>
+          </wp:inline>
+        </w:drawing>
+      </w:r>
+    </w:p>
+    <w:p>
+      <w:pPr>
+        <w:pStyle w:val="ListParagraph"/>
+        <w:numPr>
+          <w:ilvl w:val="0"/>
+          <w:numId w:val="1"/>
+        </w:numPr>
+        <w:rPr>
+          <w:rFonts w:ascii="Times New Roman" w:hAnsi="Times New Roman" w:cs="Times New Roman"/>
+          <w:sz w:val="28"/>
+          <w:szCs w:val="28"/>
+        </w:rPr>
+      </w:pPr>
+      <w:r>
+        <w:rPr>
+          <w:rFonts w:ascii="Times New Roman" w:hAnsi="Times New Roman" w:cs="Times New Roman"/>
+          <w:sz w:val="28"/>
+          <w:szCs w:val="28"/>
+        </w:rPr>
+        <w:t>Docker run –d nginx</w:t>
+      </w:r>
+    </w:p>
+    <w:p>
+      <w:pPr>
+        <w:rPr>
+          <w:rFonts w:ascii="Times New Roman" w:hAnsi="Times New Roman" w:cs="Times New Roman"/>
+          <w:sz w:val="28"/>
+          <w:szCs w:val="28"/>
+        </w:rPr>
+      </w:pPr>
+      <w:r>
+        <w:rPr>
+          <w:rFonts w:ascii="Times New Roman" w:hAnsi="Times New Roman" w:cs="Times New Roman"/>
+          <w:sz w:val="28"/>
+          <w:szCs w:val="28"/>
+        </w:rPr>
+        <w:lastRenderedPageBreak/>
+        <w:drawing>
+          <wp:inline distT="0" distB="0" distL="0" distR="0" wp14:anchorId="3DBCBDCC" wp14:editId="3B34DE5B">
+            <wp:extent cx="5943600" cy="3343275"/>
+            <wp:effectExtent l="0" t="0" r="0" b="9525"/>
+            <wp:docPr id="5" name="Picture 5"/>
+            <wp:cNvGraphicFramePr>
+              <a:graphicFrameLocks xmlns:a="http://schemas.openxmlformats.org/drawingml/2006/main" noChangeAspect="1"/>
+            </wp:cNvGraphicFramePr>
+            <a:graphic xmlns:a="http://schemas.openxmlformats.org/drawingml/2006/main">
+              <a:graphicData uri="http://schemas.openxmlformats.org/drawingml/2006/picture">
+                <pic:pic xmlns:pic="http://schemas.openxmlformats.org/drawingml/2006/picture">
+                  <pic:nvPicPr>
+                    <pic:cNvPr id="1" name=""/>
+                    <pic:cNvPicPr/>
+                  </pic:nvPicPr>
+                  <pic:blipFill>
+                    <a:blip r:embed="rId9"/>
+                    <a:stretch>
+                      <a:fillRect/>
+                    </a:stretch>
+                  </pic:blipFill>
+                  <pic:spPr>
+                    <a:xfrm>
+                      <a:off x="0" y="0"/>
+                      <a:ext cx="5943600" cy="3343275"/>
+                    </a:xfrm>
+                    <a:prstGeom prst="rect">
+                      <a:avLst/>
+                    </a:prstGeom>
+                  </pic:spPr>
+                </pic:pic>
+              </a:graphicData>
+            </a:graphic>
+          </wp:inline>
+        </w:drawing>
+      </w:r>
+    </w:p>
+    <w:p>
+      <w:pPr>
+        <w:pStyle w:val="ListParagraph"/>
+        <w:numPr>
+          <w:ilvl w:val="0"/>
+          <w:numId w:val="1"/>
+        </w:numPr>
+        <w:rPr>
+          <w:rFonts w:ascii="Times New Roman" w:hAnsi="Times New Roman" w:cs="Times New Roman"/>
+          <w:sz w:val="28"/>
+          <w:szCs w:val="28"/>
+        </w:rPr>
+      </w:pPr>
+      <w:r>
+        <w:rPr>
+          <w:rFonts w:ascii="Times New Roman" w:hAnsi="Times New Roman" w:cs="Times New Roman"/>
+          <w:sz w:val="28"/>
+          <w:szCs w:val="28"/>
+        </w:rPr>
+        <w:t>Docker ps</w:t>
+      </w:r>
+    </w:p>
+    <w:p>
+      <w:pPr>
+        <w:rPr>
+          <w:rFonts w:ascii="Times New Roman" w:hAnsi="Times New Roman" w:cs="Times New Roman"/>
+          <w:sz w:val="28"/>
+          <w:szCs w:val="28"/>
+        </w:rPr>
+      </w:pPr>
+      <w:r>
+        <w:rPr>
+          <w:rFonts w:ascii="Times New Roman" w:hAnsi="Times New Roman" w:cs="Times New Roman"/>
+          <w:sz w:val="28"/>
+          <w:szCs w:val="28"/>
+        </w:rPr>
+        <w:drawing>
+          <wp:inline distT="0" distB="0" distL="0" distR="0" wp14:anchorId="72607B40" wp14:editId="4BEED696">
+            <wp:extent cx="5943600" cy="3343275"/>
+            <wp:effectExtent l="0" t="0" r="0" b="9525"/>
+            <wp:docPr id="6" name="Picture 6"/>
+            <wp:cNvGraphicFramePr>
+              <a:graphicFrameLocks xmlns:a="http://schemas.openxmlformats.org/drawingml/2006/main" noChangeAspect="1"/>
+            </wp:cNvGraphicFramePr>
+            <a:graphic xmlns:a="http://schemas.openxmlformats.org/drawingml/2006/main">
+              <a:graphicData uri="http://schemas.openxmlformats.org/drawingml/2006/picture">
+                <pic:pic xmlns:pic="http://schemas.openxmlformats.org/drawingml/2006/picture">
+                  <pic:nvPicPr>
+                    <pic:cNvPr id="1" name=""/>
+                    <pic:cNvPicPr/>
+                  </pic:nvPicPr>
+                  <pic:blipFill>
+                    <a:blip r:embed="rId10"/>
+                    <a:stretch>
+                      <a:fillRect/>
+                    </a:stretch>
+                  </pic:blipFill>
+                  <pic:spPr>
+                    <a:xfrm>
+                      <a:off x="0" y="0"/>
+                      <a:ext cx="5943600" cy="3343275"/>
+                    </a:xfrm>
+                    <a:prstGeom prst="rect">
+                      <a:avLst/>
+                    </a:prstGeom>
+                  </pic:spPr>
+                </pic:pic>
+              </a:graphicData>
+            </a:graphic>
+          </wp:inline>
+        </w:drawing>
+      </w:r>
+    </w:p>
+    <w:p>
+      <w:pPr>
+        <w:pStyle w:val="ListParagraph"/>
+        <w:numPr>
+          <w:ilvl w:val="0"/>
+          <w:numId w:val="1"/>
+        </w:numPr>
+        <w:rPr>
+          <w:rFonts w:ascii="Times New Roman" w:hAnsi="Times New Roman" w:cs="Times New Roman"/>
+          <w:sz w:val="28"/>
+          <w:szCs w:val="28"/>
+        </w:rPr>
+      </w:pPr>
+      <w:r>
+        <w:rPr>
+          <w:rFonts w:ascii="Times New Roman" w:hAnsi="Times New Roman" w:cs="Times New Roman"/>
+          <w:sz w:val="28"/>
+          <w:szCs w:val="28"/>
+        </w:rPr>
+        <w:t>Docker ps –a</w:t>
+      </w:r>
+    </w:p>
+    <w:p>
+      <w:pPr>
+        <w:rPr>
+          <w:rFonts w:ascii="Times New Roman" w:hAnsi="Times New Roman" w:cs="Times New Roman"/>
+          <w:sz w:val="28"/>
+          <w:szCs w:val="28"/>
+        </w:rPr>
+      </w:pPr>
+      <w:r>
+        <w:rPr>
+          <w:rFonts w:ascii="Times New Roman" w:hAnsi="Times New Roman" w:cs="Times New Roman"/>
+          <w:sz w:val="28"/>
+          <w:szCs w:val="28"/>
+        </w:rPr>
+        <w:lastRenderedPageBreak/>
+        <w:drawing>
+          <wp:inline distT="0" distB="0" distL="0" distR="0" wp14:anchorId="375A0427" wp14:editId="10F748C2">
+            <wp:extent cx="5943600" cy="3343275"/>
+            <wp:effectExtent l="0" t="0" r="0" b="9525"/>
+            <wp:docPr id="7" name="Picture 7"/>
+            <wp:cNvGraphicFramePr>
+              <a:graphicFrameLocks xmlns:a="http://schemas.openxmlformats.org/drawingml/2006/main" noChangeAspect="1"/>
+            </wp:cNvGraphicFramePr>
+            <a:graphic xmlns:a="http://schemas.openxmlformats.org/drawingml/2006/main">
+              <a:graphicData uri="http://schemas.openxmlformats.org/drawingml/2006/picture">
+                <pic:pic xmlns:pic="http://schemas.openxmlformats.org/drawingml/2006/picture">
+                  <pic:nvPicPr>
+                    <pic:cNvPr id="1" name=""/>
+                    <pic:cNvPicPr/>
+                  </pic:nvPicPr>
+                  <pic:blipFill>
+                    <a:blip r:embed="rId11"/>
+                    <a:stretch>
+                      <a:fillRect/>
+                    </a:stretch>
+                  </pic:blipFill>
+                  <pic:spPr>
+                    <a:xfrm>
+                      <a:off x="0" y="0"/>
+                      <a:ext cx="5943600" cy="3343275"/>
+                    </a:xfrm>
+                    <a:prstGeom prst="rect">
+                      <a:avLst/>
+                    </a:prstGeom>
+                  </pic:spPr>
+                </pic:pic>
+              </a:graphicData>
+            </a:graphic>
+          </wp:inline>
+        </w:drawing>
+      </w:r>
+    </w:p>
+    <w:p>
+      <w:pPr>
+        <w:pStyle w:val="ListParagraph"/>
+        <w:numPr>
+          <w:ilvl w:val="0"/>
+          <w:numId w:val="1"/>
+        </w:numPr>
+        <w:rPr>
+          <w:rFonts w:ascii="Times New Roman" w:hAnsi="Times New Roman" w:cs="Times New Roman"/>
+          <w:sz w:val="28"/>
+          <w:szCs w:val="28"/>
+        </w:rPr>
+      </w:pPr>
+      <w:r>
+        <w:rPr>
+          <w:rFonts w:ascii="Times New Roman" w:hAnsi="Times New Roman" w:cs="Times New Roman"/>
+          <w:sz w:val="28"/>
+          <w:szCs w:val="28"/>
+        </w:rPr>
+        <w:t>Docker logs contain_Id</w:t>
+      </w:r>
+    </w:p>
+    <w:p>
+      <w:pPr>
+        <w:rPr>
+          <w:rFonts w:ascii="Times New Roman" w:hAnsi="Times New Roman" w:cs="Times New Roman"/>
+          <w:sz w:val="28"/>
+          <w:szCs w:val="28"/>
+        </w:rPr>
+      </w:pPr>
+      <w:r>
+        <w:rPr>
+          <w:rFonts w:ascii="Times New Roman" w:hAnsi="Times New Roman" w:cs="Times New Roman"/>
+          <w:sz w:val="28"/>
+          <w:szCs w:val="28"/>
+        </w:rPr>
+        <w:drawing>
+          <wp:inline distT="0" distB="0" distL="0" distR="0" wp14:anchorId="77B15F33" wp14:editId="29EA78C1">
+            <wp:extent cx="5943600" cy="3343275"/>
+            <wp:effectExtent l="0" t="0" r="0" b="9525"/>
+            <wp:docPr id="8" name="Picture 8"/>
+            <wp:cNvGraphicFramePr>
+              <a:graphicFrameLocks xmlns:a="http://schemas.openxmlformats.org/drawingml/2006/main" noChangeAspect="1"/>
+            </wp:cNvGraphicFramePr>
+            <a:graphic xmlns:a="http://schemas.openxmlformats.org/drawingml/2006/main">
+              <a:graphicData uri="http://schemas.openxmlformats.org/drawingml/2006/picture">
+                <pic:pic xmlns:pic="http://schemas.openxmlformats.org/drawingml/2006/picture">
+                  <pic:nvPicPr>
+                    <pic:cNvPr id="1" name=""/>
+                    <pic:cNvPicPr/>
+                  </pic:nvPicPr>
+                  <pic:blipFill>
+                    <a:blip r:embed="rId12"/>
+                    <a:stretch>
+                      <a:fillRect/>
+                    </a:stretch>
+                  </pic:blipFill>
+                  <pic:spPr>
+                    <a:xfrm>
+                      <a:off x="0" y="0"/>
+                      <a:ext cx="5943600" cy="3343275"/>
+                    </a:xfrm>
+                    <a:prstGeom prst="rect">
+                      <a:avLst/>
+                    </a:prstGeom>
+                  </pic:spPr>
+                </pic:pic>
+              </a:graphicData>
+            </a:graphic>
+          </wp:inline>
+        </w:drawing>
+      </w:r>
+    </w:p>
+    <w:p>
+      <w:pPr>
+        <w:pStyle w:val="ListParagraph"/>
+        <w:numPr>
+          <w:ilvl w:val="0"/>
+          <w:numId w:val="1"/>
+        </w:numPr>
+        <w:rPr>
+          <w:rFonts w:ascii="Times New Roman" w:hAnsi="Times New Roman" w:cs="Times New Roman"/>
+          <w:sz w:val="28"/>
+          <w:szCs w:val="28"/>
+        </w:rPr>
+      </w:pPr>
+      <w:r>
+        <w:rPr>
+          <w:rFonts w:ascii="Times New Roman" w:hAnsi="Times New Roman" w:cs="Times New Roman"/>
+          <w:sz w:val="28"/>
+          <w:szCs w:val="28"/>
+        </w:rPr>
+        <w:t>Docker exec –it container_id  /bin/sh</w:t>
+      </w:r>
+    </w:p>
+    <w:p>
+      <w:pPr>
+        <w:rPr>
+          <w:rFonts w:ascii="Times New Roman" w:hAnsi="Times New Roman" w:cs="Times New Roman"/>
+          <w:sz w:val="28"/>
+          <w:szCs w:val="28"/>
+        </w:rPr>
+      </w:pPr>
+      <w:r>
+        <w:rPr>
+          <w:rFonts w:ascii="Times New Roman" w:hAnsi="Times New Roman" w:cs="Times New Roman"/>
+          <w:sz w:val="28"/>
+          <w:szCs w:val="28"/>
+        </w:rPr>
+        <w:lastRenderedPageBreak/>
+        <w:drawing>
+          <wp:inline distT="0" distB="0" distL="0" distR="0" wp14:anchorId="30C00DF2" wp14:editId="40242939">
+            <wp:extent cx="5943600" cy="3343275"/>
+            <wp:effectExtent l="0" t="0" r="0" b="9525"/>
+            <wp:docPr id="10" name="Picture 10"/>
+            <wp:cNvGraphicFramePr>
+              <a:graphicFrameLocks xmlns:a="http://schemas.openxmlformats.org/drawingml/2006/main" noChangeAspect="1"/>
+            </wp:cNvGraphicFramePr>
+            <a:graphic xmlns:a="http://schemas.openxmlformats.org/drawingml/2006/main">
+              <a:graphicData uri="http://schemas.openxmlformats.org/drawingml/2006/picture">
+                <pic:pic xmlns:pic="http://schemas.openxmlformats.org/drawingml/2006/picture">
+                  <pic:nvPicPr>
+                    <pic:cNvPr id="1" name=""/>
+                    <pic:cNvPicPr/>
+                  </pic:nvPicPr>
+                  <pic:blipFill>
+                    <a:blip r:embed="rId13"/>
+                    <a:stretch>
+                      <a:fillRect/>
+                    </a:stretch>
+                  </pic:blipFill>
+                  <pic:spPr>
+                    <a:xfrm>
+                      <a:off x="0" y="0"/>
+                      <a:ext cx="5943600" cy="3343275"/>
+                    </a:xfrm>
+                    <a:prstGeom prst="rect">
+                      <a:avLst/>
+                    </a:prstGeom>
+                  </pic:spPr>
+                </pic:pic>
+              </a:graphicData>
+            </a:graphic>
+          </wp:inline>
+        </w:drawing>
+      </w:r>
+      <w:r>
+        <w:rPr>
+          <w:rFonts w:ascii="Times New Roman" w:hAnsi="Times New Roman" w:cs="Times New Roman"/>
+          <w:sz w:val="28"/>
+          <w:szCs w:val="28"/>
+        </w:rPr>
+        <w:t xml:space="preserve"> </w:t>
+      </w:r>
+    </w:p>
+    <w:p>
+      <w:pPr>
+        <w:pStyle w:val="ListParagraph"/>
+        <w:numPr>
+          <w:ilvl w:val="0"/>
+          <w:numId w:val="1"/>
+        </w:numPr>
+        <w:rPr>
+          <w:rFonts w:ascii="Times New Roman" w:hAnsi="Times New Roman" w:cs="Times New Roman"/>
+          <w:sz w:val="28"/>
+          <w:szCs w:val="28"/>
+        </w:rPr>
+      </w:pPr>
+      <w:r>
+        <w:rPr>
+          <w:rFonts w:ascii="Times New Roman" w:hAnsi="Times New Roman" w:cs="Times New Roman"/>
+          <w:sz w:val="28"/>
+          <w:szCs w:val="28"/>
+        </w:rPr>
+        <w:t>Docker stop container_id</w:t>
+      </w:r>
+    </w:p>
+    <w:p>
+      <w:pPr>
+        <w:rPr>
+          <w:rFonts w:ascii="Times New Roman" w:hAnsi="Times New Roman" w:cs="Times New Roman"/>
+          <w:sz w:val="28"/>
+          <w:szCs w:val="28"/>
+        </w:rPr>
+      </w:pPr>
+      <w:r>
+        <w:rPr>
+          <w:rFonts w:ascii="Times New Roman" w:hAnsi="Times New Roman" w:cs="Times New Roman"/>
+          <w:sz w:val="28"/>
+          <w:szCs w:val="28"/>
+        </w:rPr>
+        <w:drawing>
+          <wp:inline distT="0" distB="0" distL="0" distR="0" wp14:anchorId="69AC9BE2" wp14:editId="2F32D238">
+            <wp:extent cx="5943600" cy="3343275"/>
+            <wp:effectExtent l="0" t="0" r="0" b="9525"/>
+            <wp:docPr id="11" name="Picture 11"/>
+            <wp:cNvGraphicFramePr>
+              <a:graphicFrameLocks xmlns:a="http://schemas.openxmlformats.org/drawingml/2006/main" noChangeAspect="1"/>
+            </wp:cNvGraphicFramePr>
+            <a:graphic xmlns:a="http://schemas.openxmlformats.org/drawingml/2006/main">
+              <a:graphicData uri="http://schemas.openxmlformats.org/drawingml/2006/picture">
+                <pic:pic xmlns:pic="http://schemas.openxmlformats.org/drawingml/2006/picture">
+                  <pic:nvPicPr>
+                    <pic:cNvPr id="1" name=""/>
+                    <pic:cNvPicPr/>
+                  </pic:nvPicPr>
+                  <pic:blipFill>
+                    <a:blip r:embed="rId14"/>
+                    <a:stretch>
+                      <a:fillRect/>
+                    </a:stretch>
+                  </pic:blipFill>
+                  <pic:spPr>
+                    <a:xfrm>
+                      <a:off x="0" y="0"/>
+                      <a:ext cx="5943600" cy="3343275"/>
+                    </a:xfrm>
+                    <a:prstGeom prst="rect">
+                      <a:avLst/>
+                    </a:prstGeom>
+                  </pic:spPr>
+                </pic:pic>
+              </a:graphicData>
+            </a:graphic>
+          </wp:inline>
+        </w:drawing>
+      </w:r>
+    </w:p>
+    <w:p>
+      <w:pPr>
+        <w:pStyle w:val="ListParagraph"/>
+        <w:numPr>
+          <w:ilvl w:val="0"/>
+          <w:numId w:val="1"/>
+        </w:numPr>
+        <w:rPr>
+          <w:rFonts w:ascii="Times New Roman" w:hAnsi="Times New Roman" w:cs="Times New Roman"/>
+          <w:sz w:val="28"/>
+          <w:szCs w:val="28"/>
+        </w:rPr>
+      </w:pPr>
+      <w:r>
+        <w:rPr>
+          <w:rFonts w:ascii="Times New Roman" w:hAnsi="Times New Roman" w:cs="Times New Roman"/>
+          <w:sz w:val="28"/>
+          <w:szCs w:val="28"/>
+        </w:rPr>
+        <w:t>Docker restart contained_id</w:t>
+      </w:r>
+    </w:p>
+    <w:p>
+      <w:pPr>
+        <w:rPr>
+          <w:rFonts w:ascii="Times New Roman" w:hAnsi="Times New Roman" w:cs="Times New Roman"/>
+          <w:sz w:val="28"/>
+          <w:szCs w:val="28"/>
+        </w:rPr>
+      </w:pPr>
+      <w:r>
+        <w:rPr>
+          <w:rFonts w:ascii="Times New Roman" w:hAnsi="Times New Roman" w:cs="Times New Roman"/>
+          <w:sz w:val="28"/>
+          <w:szCs w:val="28"/>
+        </w:rPr>
+        <w:lastRenderedPageBreak/>
+        <w:drawing>
+          <wp:inline distT="0" distB="0" distL="0" distR="0" wp14:anchorId="1F2B4EEE" wp14:editId="66F335A1">
+            <wp:extent cx="5943600" cy="3343275"/>
+            <wp:effectExtent l="0" t="0" r="0" b="9525"/>
+            <wp:docPr id="12" name="Picture 12"/>
+            <wp:cNvGraphicFramePr>
+              <a:graphicFrameLocks xmlns:a="http://schemas.openxmlformats.org/drawingml/2006/main" noChangeAspect="1"/>
+            </wp:cNvGraphicFramePr>
+            <a:graphic xmlns:a="http://schemas.openxmlformats.org/drawingml/2006/main">
+              <a:graphicData uri="http://schemas.openxmlformats.org/drawingml/2006/picture">
+                <pic:pic xmlns:pic="http://schemas.openxmlformats.org/drawingml/2006/picture">
+                  <pic:nvPicPr>
+                    <pic:cNvPr id="1" name=""/>
+                    <pic:cNvPicPr/>
+                  </pic:nvPicPr>
+                  <pic:blipFill>
+                    <a:blip r:embed="rId15"/>
+                    <a:stretch>
+                      <a:fillRect/>
+                    </a:stretch>
+                  </pic:blipFill>
+                  <pic:spPr>
+                    <a:xfrm>
+                      <a:off x="0" y="0"/>
+                      <a:ext cx="5943600" cy="3343275"/>
+                    </a:xfrm>
+                    <a:prstGeom prst="rect">
+                      <a:avLst/>
+                    </a:prstGeom>
+                  </pic:spPr>
+                </pic:pic>
+              </a:graphicData>
+            </a:graphic>
+          </wp:inline>
+        </w:drawing>
+      </w:r>
+    </w:p>
+    <w:p>
+      <w:pPr>
+        <w:pStyle w:val="ListParagraph"/>
+        <w:numPr>
+          <w:ilvl w:val="0"/>
+          <w:numId w:val="1"/>
+        </w:numPr>
+        <w:rPr>
+          <w:rFonts w:ascii="Times New Roman" w:hAnsi="Times New Roman" w:cs="Times New Roman"/>
+          <w:sz w:val="28"/>
+          <w:szCs w:val="28"/>
+        </w:rPr>
+      </w:pPr>
+      <w:r>
+        <w:rPr>
+          <w:rFonts w:ascii="Times New Roman" w:hAnsi="Times New Roman" w:cs="Times New Roman"/>
+          <w:sz w:val="28"/>
+          <w:szCs w:val="28"/>
+        </w:rPr>
+        <w:t xml:space="preserve"> Docker rm contained_id</w:t>
+      </w:r>
+    </w:p>
+    <w:p>
+      <w:pPr>
+        <w:rPr>
+          <w:rFonts w:ascii="Times New Roman" w:hAnsi="Times New Roman" w:cs="Times New Roman"/>
+          <w:sz w:val="28"/>
+          <w:szCs w:val="28"/>
+        </w:rPr>
+      </w:pPr>
+      <w:r>
+        <w:rPr>
+          <w:rFonts w:ascii="Times New Roman" w:hAnsi="Times New Roman" w:cs="Times New Roman"/>
+          <w:sz w:val="28"/>
+          <w:szCs w:val="28"/>
+        </w:rPr>
+        <w:drawing>
+          <wp:inline distT="0" distB="0" distL="0" distR="0" wp14:anchorId="55003873" wp14:editId="1F5C6805">
+            <wp:extent cx="5943600" cy="3343275"/>
+            <wp:effectExtent l="0" t="0" r="0" b="9525"/>
+            <wp:docPr id="13" name="Picture 13"/>
+            <wp:cNvGraphicFramePr>
+              <a:graphicFrameLocks xmlns:a="http://schemas.openxmlformats.org/drawingml/2006/main" noChangeAspect="1"/>
+            </wp:cNvGraphicFramePr>
+            <a:graphic xmlns:a="http://schemas.openxmlformats.org/drawingml/2006/main">
+              <a:graphicData uri="http://schemas.openxmlformats.org/drawingml/2006/picture">
+                <pic:pic xmlns:pic="http://schemas.openxmlformats.org/drawingml/2006/picture">
+                  <pic:nvPicPr>
+                    <pic:cNvPr id="1" name=""/>
+                    <pic:cNvPicPr/>
+                  </pic:nvPicPr>
+                  <pic:blipFill>
+                    <a:blip r:embed="rId16"/>
+                    <a:stretch>
+                      <a:fillRect/>
+                    </a:stretch>
+                  </pic:blipFill>
+                  <pic:spPr>
+                    <a:xfrm>
+                      <a:off x="0" y="0"/>
+                      <a:ext cx="5943600" cy="3343275"/>
+                    </a:xfrm>
+                    <a:prstGeom prst="rect">
+                      <a:avLst/>
+                    </a:prstGeom>
+                  </pic:spPr>
+                </pic:pic>
+              </a:graphicData>
+            </a:graphic>
+          </wp:inline>
+        </w:drawing>
+      </w:r>
+    </w:p>
+    <w:p>
+      <w:pPr>
+        <w:pStyle w:val="ListParagraph"/>
+        <w:numPr>
+          <w:ilvl w:val="0"/>
+          <w:numId w:val="1"/>
+        </w:numPr>
+        <w:rPr>
+          <w:rFonts w:ascii="Times New Roman" w:hAnsi="Times New Roman" w:cs="Times New Roman"/>
+          <w:sz w:val="28"/>
+          <w:szCs w:val="28"/>
+        </w:rPr>
+      </w:pPr>
+      <w:r>
+        <w:rPr>
+          <w:rFonts w:ascii="Times New Roman" w:hAnsi="Times New Roman" w:cs="Times New Roman"/>
+          <w:sz w:val="28"/>
+          <w:szCs w:val="28"/>
+        </w:rPr>
+        <w:t>Docker container prune</w:t>
+      </w:r>
+    </w:p>
+    <w:p>
+      <w:pPr>
+        <w:rPr>
+          <w:rFonts w:ascii="Times New Roman" w:hAnsi="Times New Roman" w:cs="Times New Roman"/>
+          <w:sz w:val="28"/>
+          <w:szCs w:val="28"/>
+        </w:rPr>
+      </w:pPr>
+      <w:r>
+        <w:rPr>
+          <w:rFonts w:ascii="Times New Roman" w:hAnsi="Times New Roman" w:cs="Times New Roman"/>
+          <w:sz w:val="28"/>
+          <w:szCs w:val="28"/>
+        </w:rPr>
+        <w:lastRenderedPageBreak/>
+        <w:drawing>
+          <wp:inline distT="0" distB="0" distL="0" distR="0" wp14:anchorId="7A5075E0" wp14:editId="5679AC16">
+            <wp:extent cx="5943600" cy="3343275"/>
+            <wp:effectExtent l="0" t="0" r="0" b="9525"/>
+            <wp:docPr id="14" name="Picture 14"/>
+            <wp:cNvGraphicFramePr>
+              <a:graphicFrameLocks xmlns:a="http://schemas.openxmlformats.org/drawingml/2006/main" noChangeAspect="1"/>
+            </wp:cNvGraphicFramePr>
+            <a:graphic xmlns:a="http://schemas.openxmlformats.org/drawingml/2006/main">
+              <a:graphicData uri="http://schemas.openxmlformats.org/drawingml/2006/picture">
+                <pic:pic xmlns:pic="http://schemas.openxmlformats.org/drawingml/2006/picture">
+                  <pic:nvPicPr>
+                    <pic:cNvPr id="1" name=""/>
+                    <pic:cNvPicPr/>
+                  </pic:nvPicPr>
+                  <pic:blipFill>
+                    <a:blip r:embed="rId17"/>
+                    <a:stretch>
+                      <a:fillRect/>
+                    </a:stretch>
+                  </pic:blipFill>
+                  <pic:spPr>
+                    <a:xfrm>
+                      <a:off x="0" y="0"/>
+                      <a:ext cx="5943600" cy="3343275"/>
+                    </a:xfrm>
+                    <a:prstGeom prst="rect">
+                      <a:avLst/>
+                    </a:prstGeom>
+                  </pic:spPr>
+                </pic:pic>
+              </a:graphicData>
+            </a:graphic>
+          </wp:inline>
+        </w:drawing>
+      </w:r>
+    </w:p>
+    <w:p>
+      <w:pPr>
+        <w:pStyle w:val="ListParagraph"/>
+        <w:numPr>
+          <w:ilvl w:val="0"/>
+          <w:numId w:val="1"/>
+        </w:numPr>
+        <w:rPr>
+          <w:rFonts w:ascii="Times New Roman" w:hAnsi="Times New Roman" w:cs="Times New Roman"/>
+          <w:sz w:val="28"/>
+          <w:szCs w:val="28"/>
+        </w:rPr>
+      </w:pPr>
+      <w:r>
+        <w:rPr>
+          <w:rFonts w:ascii="Times New Roman" w:hAnsi="Times New Roman" w:cs="Times New Roman"/>
+          <w:sz w:val="28"/>
+          <w:szCs w:val="28"/>
+        </w:rPr>
+        <w:t>Docker rmi image_id</w:t>
+      </w:r>
+    </w:p>
+    <w:p>
+      <w:pPr>
+        <w:rPr>
+          <w:rFonts w:ascii="Times New Roman" w:hAnsi="Times New Roman" w:cs="Times New Roman"/>
+          <w:sz w:val="28"/>
+          <w:szCs w:val="28"/>
+        </w:rPr>
+      </w:pPr>
+      <w:r>
+        <w:rPr>
+          <w:rFonts w:ascii="Times New Roman" w:hAnsi="Times New Roman" w:cs="Times New Roman"/>
+          <w:sz w:val="28"/>
+          <w:szCs w:val="28"/>
+        </w:rPr>
+        <w:drawing>
+          <wp:inline distT="0" distB="0" distL="0" distR="0" wp14:anchorId="1F197CF3" wp14:editId="52D54104">
+            <wp:extent cx="5943600" cy="3343275"/>
+            <wp:effectExtent l="0" t="0" r="0" b="9525"/>
+            <wp:docPr id="15" name="Picture 15"/>
+            <wp:cNvGraphicFramePr>
+              <a:graphicFrameLocks xmlns:a="http://schemas.openxmlformats.org/drawingml/2006/main" noChangeAspect="1"/>
+            </wp:cNvGraphicFramePr>
+            <a:graphic xmlns:a="http://schemas.openxmlformats.org/drawingml/2006/main">
+              <a:graphicData uri="http://schemas.openxmlformats.org/drawingml/2006/picture">
+                <pic:pic xmlns:pic="http://schemas.openxmlformats.org/drawingml/2006/picture">
+                  <pic:nvPicPr>
+                    <pic:cNvPr id="1" name=""/>
+                    <pic:cNvPicPr/>
+                  </pic:nvPicPr>
+                  <pic:blipFill>
+                    <a:blip r:embed="rId18"/>
+                    <a:stretch>
+                      <a:fillRect/>
+                    </a:stretch>
+                  </pic:blipFill>
+                  <pic:spPr>
+                    <a:xfrm>
+                      <a:off x="0" y="0"/>
+                      <a:ext cx="5943600" cy="3343275"/>
+                    </a:xfrm>
+                    <a:prstGeom prst="rect">
+                      <a:avLst/>
+                    </a:prstGeom>
+                  </pic:spPr>
+                </pic:pic>
+              </a:graphicData>
+            </a:graphic>
+          </wp:inline>
+        </w:drawing>
+      </w:r>
+    </w:p>
+    <w:p>
+      <w:pPr>
+        <w:pStyle w:val="ListParagraph"/>
+        <w:numPr>
+          <w:ilvl w:val="0"/>
+          <w:numId w:val="1"/>
+        </w:numPr>
+        <w:rPr>
+          <w:rFonts w:ascii="Times New Roman" w:hAnsi="Times New Roman" w:cs="Times New Roman"/>
+          <w:sz w:val="28"/>
+          <w:szCs w:val="28"/>
+        </w:rPr>
+      </w:pPr>
+      <w:r>
+        <w:rPr>
+          <w:rFonts w:ascii="Times New Roman" w:hAnsi="Times New Roman" w:cs="Times New Roman"/>
+          <w:sz w:val="28"/>
+          <w:szCs w:val="28"/>
+        </w:rPr>
+        <w:t>Docker imageprune –a</w:t>
+      </w:r>
+    </w:p>
+    <w:p>
+      <w:pPr>
+        <w:rPr>
+          <w:rFonts w:ascii="Times New Roman" w:hAnsi="Times New Roman" w:cs="Times New Roman"/>
+          <w:sz w:val="28"/>
+          <w:szCs w:val="28"/>
+        </w:rPr>
+      </w:pPr>
+      <w:r>
+        <w:rPr>
+          <w:rFonts w:ascii="Times New Roman" w:hAnsi="Times New Roman" w:cs="Times New Roman"/>
+          <w:sz w:val="28"/>
+          <w:szCs w:val="28"/>
+        </w:rPr>
+        <w:lastRenderedPageBreak/>
+        <w:drawing>
+          <wp:inline distT="0" distB="0" distL="0" distR="0" wp14:anchorId="4AFA7C25" wp14:editId="3A4C5C38">
+            <wp:extent cx="5943600" cy="3343275"/>
+            <wp:effectExtent l="0" t="0" r="0" b="9525"/>
+            <wp:docPr id="16" name="Picture 16"/>
+            <wp:cNvGraphicFramePr>
+              <a:graphicFrameLocks xmlns:a="http://schemas.openxmlformats.org/drawingml/2006/main" noChangeAspect="1"/>
+            </wp:cNvGraphicFramePr>
+            <a:graphic xmlns:a="http://schemas.openxmlformats.org/drawingml/2006/main">
+              <a:graphicData uri="http://schemas.openxmlformats.org/drawingml/2006/picture">
+                <pic:pic xmlns:pic="http://schemas.openxmlformats.org/drawingml/2006/picture">
+                  <pic:nvPicPr>
+                    <pic:cNvPr id="1" name=""/>
+                    <pic:cNvPicPr/>
+                  </pic:nvPicPr>
+                  <pic:blipFill>
+                    <a:blip r:embed="rId19"/>
+                    <a:stretch>
+                      <a:fillRect/>
+                    </a:stretch>
+                  </pic:blipFill>
+                  <pic:spPr>
+                    <a:xfrm>
+                      <a:off x="0" y="0"/>
+                      <a:ext cx="5943600" cy="3343275"/>
+                    </a:xfrm>
+                    <a:prstGeom prst="rect">
+                      <a:avLst/>
+                    </a:prstGeom>
+                  </pic:spPr>
+                </pic:pic>
+              </a:graphicData>
+            </a:graphic>
+          </wp:inline>
+        </w:drawing>
+      </w:r>
+    </w:p>
+    <w:p>
+      <w:pPr>
+        <w:pStyle w:val="ListParagraph"/>
+        <w:numPr>
+          <w:ilvl w:val="0"/>
+          <w:numId w:val="1"/>
+        </w:numPr>
+        <w:rPr>
+          <w:rFonts w:ascii="Times New Roman" w:hAnsi="Times New Roman" w:cs="Times New Roman"/>
+          <w:sz w:val="28"/>
+          <w:szCs w:val="28"/>
+        </w:rPr>
+      </w:pPr>
+      <w:r>
+        <w:rPr>
+          <w:rFonts w:ascii="Times New Roman" w:hAnsi="Times New Roman" w:cs="Times New Roman"/>
+          <w:sz w:val="28"/>
+          <w:szCs w:val="28"/>
+        </w:rPr>
+        <w:t>D</w:t>
+      </w:r>
+      <w:r>
+        <w:rPr>
+          <w:rFonts w:ascii="Times New Roman" w:hAnsi="Times New Roman" w:cs="Times New Roman"/>
+          <w:sz w:val="28"/>
+          <w:szCs w:val="28"/>
+        </w:rPr>
+        <w:t>ocker run -d -p 8080:80 nginx</w:t>
+      </w:r>
+    </w:p>
+    <w:p>
+      <w:pPr>
+        <w:rPr>
+          <w:rFonts w:ascii="Times New Roman" w:hAnsi="Times New Roman" w:cs="Times New Roman"/>
+          <w:sz w:val="28"/>
+          <w:szCs w:val="28"/>
+        </w:rPr>
+      </w:pPr>
+      <w:r>
+        <w:rPr>
+          <w:rFonts w:ascii="Times New Roman" w:hAnsi="Times New Roman" w:cs="Times New Roman"/>
+          <w:sz w:val="28"/>
+          <w:szCs w:val="28"/>
+        </w:rPr>
+        <w:drawing>
+          <wp:inline distT="0" distB="0" distL="0" distR="0" wp14:anchorId="42F20B6E" wp14:editId="7328630C">
+            <wp:extent cx="5943600" cy="3343275"/>
+            <wp:effectExtent l="0" t="0" r="0" b="9525"/>
+            <wp:docPr id="17" name="Picture 17"/>
+            <wp:cNvGraphicFramePr>
+              <a:graphicFrameLocks xmlns:a="http://schemas.openxmlformats.org/drawingml/2006/main" noChangeAspect="1"/>
+            </wp:cNvGraphicFramePr>
+            <a:graphic xmlns:a="http://schemas.openxmlformats.org/drawingml/2006/main">
+              <a:graphicData uri="http://schemas.openxmlformats.org/drawingml/2006/picture">
+                <pic:pic xmlns:pic="http://schemas.openxmlformats.org/drawingml/2006/picture">
+                  <pic:nvPicPr>
+                    <pic:cNvPr id="1" name=""/>
+                    <pic:cNvPicPr/>
+                  </pic:nvPicPr>
+                  <pic:blipFill>
+                    <a:blip r:embed="rId20"/>
+                    <a:stretch>
+                      <a:fillRect/>
+                    </a:stretch>
+                  </pic:blipFill>
+                  <pic:spPr>
+                    <a:xfrm>
+                      <a:off x="0" y="0"/>
+                      <a:ext cx="5943600" cy="3343275"/>
+                    </a:xfrm>
+                    <a:prstGeom prst="rect">
+                      <a:avLst/>
+                    </a:prstGeom>
+                  </pic:spPr>
+                </pic:pic>
+              </a:graphicData>
+            </a:graphic>
+          </wp:inline>
+        </w:drawing>
+      </w:r>
+    </w:p>
+    <w:p>
+      <w:pPr>
+        <w:pStyle w:val="ListParagraph"/>
+        <w:numPr>
+          <w:ilvl w:val="0"/>
+          <w:numId w:val="1"/>
+        </w:numPr>
+        <w:rPr>
+          <w:rFonts w:ascii="Times New Roman" w:hAnsi="Times New Roman" w:cs="Times New Roman"/>
+          <w:sz w:val="28"/>
+          <w:szCs w:val="28"/>
+        </w:rPr>
+      </w:pPr>
+      <w:r>
+        <w:rPr>
+          <w:rFonts w:ascii="Times New Roman" w:hAnsi="Times New Roman" w:cs="Times New Roman"/>
+          <w:sz w:val="28"/>
+          <w:szCs w:val="28"/>
+        </w:rPr>
+        <w:t>Docker inspect container_id</w:t>
+      </w:r>
+    </w:p>
+    <w:p>
+      <w:pPr>
+        <w:rPr>
+          <w:rFonts w:ascii="Times New Roman" w:hAnsi="Times New Roman" w:cs="Times New Roman"/>
+          <w:sz w:val="28"/>
+          <w:szCs w:val="28"/>
+        </w:rPr>
+      </w:pPr>
+      <w:r>
+        <w:rPr>
+          <w:rFonts w:ascii="Times New Roman" w:hAnsi="Times New Roman" w:cs="Times New Roman"/>
+          <w:sz w:val="28"/>
+          <w:szCs w:val="28"/>
+        </w:rPr>
+        <w:lastRenderedPageBreak/>
+        <w:drawing>
+          <wp:inline distT="0" distB="0" distL="0" distR="0" wp14:anchorId="45C41545" wp14:editId="4F4B6F1A">
+            <wp:extent cx="5943600" cy="3343275"/>
+            <wp:effectExtent l="0" t="0" r="0" b="9525"/>
+            <wp:docPr id="18" name="Picture 18"/>
+            <wp:cNvGraphicFramePr>
+              <a:graphicFrameLocks xmlns:a="http://schemas.openxmlformats.org/drawingml/2006/main" noChangeAspect="1"/>
+            </wp:cNvGraphicFramePr>
+            <a:graphic xmlns:a="http://schemas.openxmlformats.org/drawingml/2006/main">
+              <a:graphicData uri="http://schemas.openxmlformats.org/drawingml/2006/picture">
+                <pic:pic xmlns:pic="http://schemas.openxmlformats.org/drawingml/2006/picture">
+                  <pic:nvPicPr>
+                    <pic:cNvPr id="1" name=""/>
+                    <pic:cNvPicPr/>
+                  </pic:nvPicPr>
+                  <pic:blipFill>
+                    <a:blip r:embed="rId21"/>
+                    <a:stretch>
+                      <a:fillRect/>
+                    </a:stretch>
+                  </pic:blipFill>
+                  <pic:spPr>
+                    <a:xfrm>
+                      <a:off x="0" y="0"/>
+                      <a:ext cx="5943600" cy="3343275"/>
+                    </a:xfrm>
+                    <a:prstGeom prst="rect">
+                      <a:avLst/>
+                    </a:prstGeom>
+                  </pic:spPr>
+                </pic:pic>
+              </a:graphicData>
+            </a:graphic>
+          </wp:inline>
+        </w:drawing>
+      </w:r>
+    </w:p>
+    <w:p>
+      <w:pPr>
+        <w:pStyle w:val="ListParagraph"/>
+        <w:numPr>
+          <w:ilvl w:val="0"/>
+          <w:numId w:val="1"/>
+        </w:numPr>
+        <w:rPr>
+          <w:rFonts w:ascii="Times New Roman" w:hAnsi="Times New Roman" w:cs="Times New Roman"/>
+          <w:sz w:val="28"/>
+          <w:szCs w:val="28"/>
+        </w:rPr>
+      </w:pPr>
+      <w:r>
+        <w:rPr>
+          <w:rFonts w:ascii="Times New Roman" w:hAnsi="Times New Roman" w:cs="Times New Roman"/>
+          <w:sz w:val="28"/>
+          <w:szCs w:val="28"/>
+        </w:rPr>
+        <w:t>Docker run –d –v mydata:/data nginx</w:t>
+      </w:r>
+    </w:p>
+    <w:p>
+      <w:pPr>
+        <w:rPr>
+          <w:rFonts w:ascii="Times New Roman" w:hAnsi="Times New Roman" w:cs="Times New Roman"/>
+          <w:sz w:val="28"/>
+          <w:szCs w:val="28"/>
+        </w:rPr>
+      </w:pPr>
+      <w:r>
+        <w:rPr>
+          <w:rFonts w:ascii="Times New Roman" w:hAnsi="Times New Roman" w:cs="Times New Roman"/>
+          <w:sz w:val="28"/>
+          <w:szCs w:val="28"/>
+        </w:rPr>
+        <w:drawing>
+          <wp:inline distT="0" distB="0" distL="0" distR="0" wp14:anchorId="490D8F84" wp14:editId="496D7C6A">
+            <wp:extent cx="5943600" cy="3343275"/>
+            <wp:effectExtent l="0" t="0" r="0" b="9525"/>
+            <wp:docPr id="19" name="Picture 19"/>
+            <wp:cNvGraphicFramePr>
+              <a:graphicFrameLocks xmlns:a="http://schemas.openxmlformats.org/drawingml/2006/main" noChangeAspect="1"/>
+            </wp:cNvGraphicFramePr>
+            <a:graphic xmlns:a="http://schemas.openxmlformats.org/drawingml/2006/main">
+              <a:graphicData uri="http://schemas.openxmlformats.org/drawingml/2006/picture">
+                <pic:pic xmlns:pic="http://schemas.openxmlformats.org/drawingml/2006/picture">
+                  <pic:nvPicPr>
+                    <pic:cNvPr id="1" name=""/>
+                    <pic:cNvPicPr/>
+                  </pic:nvPicPr>
+                  <pic:blipFill>
+                    <a:blip r:embed="rId22"/>
+                    <a:stretch>
+                      <a:fillRect/>
+                    </a:stretch>
+                  </pic:blipFill>
+                  <pic:spPr>
+                    <a:xfrm>
+                      <a:off x="0" y="0"/>
+                      <a:ext cx="5943600" cy="3343275"/>
+                    </a:xfrm>
+                    <a:prstGeom prst="rect">
+                      <a:avLst/>
+                    </a:prstGeom>
+                  </pic:spPr>
+                </pic:pic>
+              </a:graphicData>
+            </a:graphic>
+          </wp:inline>
+        </w:drawing>
+      </w:r>
+    </w:p>
+    <w:p>
+      <w:pPr>
+        <w:pStyle w:val="ListParagraph"/>
+        <w:numPr>
+          <w:ilvl w:val="0"/>
+          <w:numId w:val="1"/>
+        </w:numPr>
+        <w:rPr>
+          <w:rFonts w:ascii="Times New Roman" w:hAnsi="Times New Roman" w:cs="Times New Roman"/>
+          <w:sz w:val="28"/>
+          <w:szCs w:val="28"/>
+        </w:rPr>
+      </w:pPr>
+      <w:r>
+        <w:rPr>
+          <w:rFonts w:ascii="Times New Roman" w:hAnsi="Times New Roman" w:cs="Times New Roman"/>
+          <w:sz w:val="28"/>
+          <w:szCs w:val="28"/>
+        </w:rPr>
+        <w:t>Docker volume ls</w:t>
+      </w:r>
+    </w:p>
+    <w:p>
+      <w:pPr>
+        <w:rPr>
+          <w:rFonts w:ascii="Times New Roman" w:hAnsi="Times New Roman" w:cs="Times New Roman"/>
+          <w:sz w:val="28"/>
+          <w:szCs w:val="28"/>
+        </w:rPr>
+      </w:pPr>
+      <w:r>
+        <w:rPr>
+          <w:rFonts w:ascii="Times New Roman" w:hAnsi="Times New Roman" w:cs="Times New Roman"/>
+          <w:sz w:val="28"/>
+          <w:szCs w:val="28"/>
+        </w:rPr>
+        <w:lastRenderedPageBreak/>
+        <w:drawing>
+          <wp:inline distT="0" distB="0" distL="0" distR="0" wp14:anchorId="02DDAAF0" wp14:editId="3B6E2D7A">
+            <wp:extent cx="5943600" cy="3343275"/>
+            <wp:effectExtent l="0" t="0" r="0" b="9525"/>
+            <wp:docPr id="20" name="Picture 20"/>
+            <wp:cNvGraphicFramePr>
+              <a:graphicFrameLocks xmlns:a="http://schemas.openxmlformats.org/drawingml/2006/main" noChangeAspect="1"/>
+            </wp:cNvGraphicFramePr>
+            <a:graphic xmlns:a="http://schemas.openxmlformats.org/drawingml/2006/main">
+              <a:graphicData uri="http://schemas.openxmlformats.org/drawingml/2006/picture">
+                <pic:pic xmlns:pic="http://schemas.openxmlformats.org/drawingml/2006/picture">
+                  <pic:nvPicPr>
+                    <pic:cNvPr id="1" name=""/>
+                    <pic:cNvPicPr/>
+                  </pic:nvPicPr>
+                  <pic:blipFill>
+                    <a:blip r:embed="rId23"/>
+                    <a:stretch>
+                      <a:fillRect/>
+                    </a:stretch>
+                  </pic:blipFill>
+                  <pic:spPr>
+                    <a:xfrm>
+                      <a:off x="0" y="0"/>
+                      <a:ext cx="5943600" cy="3343275"/>
+                    </a:xfrm>
+                    <a:prstGeom prst="rect">
+                      <a:avLst/>
+                    </a:prstGeom>
+                  </pic:spPr>
+                </pic:pic>
+              </a:graphicData>
+            </a:graphic>
+          </wp:inline>
+        </w:drawing>
+      </w:r>
+    </w:p>
+    <w:p>
+      <w:pPr>
+        <w:pStyle w:val="ListParagraph"/>
+        <w:numPr>
+          <w:ilvl w:val="0"/>
+          <w:numId w:val="1"/>
+        </w:numPr>
+        <w:rPr>
+          <w:rFonts w:ascii="Times New Roman" w:hAnsi="Times New Roman" w:cs="Times New Roman"/>
+          <w:sz w:val="28"/>
+          <w:szCs w:val="28"/>
+        </w:rPr>
+      </w:pPr>
+      <w:r>
+        <w:rPr>
+          <w:rFonts w:ascii="Times New Roman" w:hAnsi="Times New Roman" w:cs="Times New Roman"/>
+          <w:sz w:val="28"/>
+          <w:szCs w:val="28"/>
+        </w:rPr>
+        <w:t>Docker volume prune</w:t>
+      </w:r>
+    </w:p>
+    <w:p>
+      <w:pPr>
+        <w:rPr>
+          <w:rFonts w:ascii="Times New Roman" w:hAnsi="Times New Roman" w:cs="Times New Roman"/>
+          <w:sz w:val="28"/>
+          <w:szCs w:val="28"/>
+        </w:rPr>
+      </w:pPr>
+      <w:r>
+        <w:rPr>
+          <w:rFonts w:ascii="Times New Roman" w:hAnsi="Times New Roman" w:cs="Times New Roman"/>
+          <w:sz w:val="28"/>
+          <w:szCs w:val="28"/>
+        </w:rPr>
+        <w:drawing>
+          <wp:inline distT="0" distB="0" distL="0" distR="0" wp14:anchorId="5F044D92" wp14:editId="3FEA7A18">
+            <wp:extent cx="5943600" cy="3343275"/>
+            <wp:effectExtent l="0" t="0" r="0" b="9525"/>
+            <wp:docPr id="21" name="Picture 21"/>
+            <wp:cNvGraphicFramePr>
+              <a:graphicFrameLocks xmlns:a="http://schemas.openxmlformats.org/drawingml/2006/main" noChangeAspect="1"/>
+            </wp:cNvGraphicFramePr>
+            <a:graphic xmlns:a="http://schemas.openxmlformats.org/drawingml/2006/main">
+              <a:graphicData uri="http://schemas.openxmlformats.org/drawingml/2006/picture">
+                <pic:pic xmlns:pic="http://schemas.openxmlformats.org/drawingml/2006/picture">
+                  <pic:nvPicPr>
+                    <pic:cNvPr id="1" name=""/>
+                    <pic:cNvPicPr/>
+                  </pic:nvPicPr>
+                  <pic:blipFill>
+                    <a:blip r:embed="rId24"/>
+                    <a:stretch>
+                      <a:fillRect/>
+                    </a:stretch>
+                  </pic:blipFill>
+                  <pic:spPr>
+                    <a:xfrm>
+                      <a:off x="0" y="0"/>
+                      <a:ext cx="5943600" cy="3343275"/>
+                    </a:xfrm>
+                    <a:prstGeom prst="rect">
+                      <a:avLst/>
+                    </a:prstGeom>
+                  </pic:spPr>
+                </pic:pic>
+              </a:graphicData>
+            </a:graphic>
+          </wp:inline>
+        </w:drawing>
+      </w:r>
+    </w:p>
+    <w:p>
+      <w:pPr>
+        <w:pStyle w:val="ListParagraph"/>
+        <w:numPr>
+          <w:ilvl w:val="0"/>
+          <w:numId w:val="1"/>
+        </w:numPr>
+        <w:rPr>
+          <w:rFonts w:ascii="Times New Roman" w:hAnsi="Times New Roman" w:cs="Times New Roman"/>
+          <w:sz w:val="28"/>
+          <w:szCs w:val="28"/>
+        </w:rPr>
+      </w:pPr>
+      <w:r>
+        <w:rPr>
+          <w:rFonts w:ascii="Times New Roman" w:hAnsi="Times New Roman" w:cs="Times New Roman"/>
+          <w:sz w:val="28"/>
+          <w:szCs w:val="28"/>
+        </w:rPr>
+        <w:t>Docker run –d</w:t>
+      </w:r>
+      <w:r>
+        <w:rPr>
+          <w:rFonts w:ascii="Times New Roman" w:hAnsi="Times New Roman" w:cs="Times New Roman"/>
+          <w:sz w:val="28"/>
+          <w:szCs w:val="28"/>
+        </w:rPr>
+        <w:t xml:space="preserve"> –name my_nginx nginx</w:t>
+      </w:r>
+    </w:p>
+    <w:p>
+      <w:pPr>
+        <w:rPr>
+          <w:rFonts w:ascii="Times New Roman" w:hAnsi="Times New Roman" w:cs="Times New Roman"/>
+          <w:sz w:val="28"/>
+          <w:szCs w:val="28"/>
+        </w:rPr>
+      </w:pPr>
+      <w:r>
+        <w:rPr>
+          <w:rFonts w:ascii="Times New Roman" w:hAnsi="Times New Roman" w:cs="Times New Roman"/>
+          <w:sz w:val="28"/>
+          <w:szCs w:val="28"/>
+        </w:rPr>
+        <w:lastRenderedPageBreak/>
+        <w:drawing>
+          <wp:inline distT="0" distB="0" distL="0" distR="0" wp14:anchorId="2F55A9CD" wp14:editId="5FC52E4D">
+            <wp:extent cx="5943600" cy="3343275"/>
+            <wp:effectExtent l="0" t="0" r="0" b="9525"/>
+            <wp:docPr id="22" name="Picture 22"/>
+            <wp:cNvGraphicFramePr>
+              <a:graphicFrameLocks xmlns:a="http://schemas.openxmlformats.org/drawingml/2006/main" noChangeAspect="1"/>
+            </wp:cNvGraphicFramePr>
+            <a:graphic xmlns:a="http://schemas.openxmlformats.org/drawingml/2006/main">
+              <a:graphicData uri="http://schemas.openxmlformats.org/drawingml/2006/picture">
+                <pic:pic xmlns:pic="http://schemas.openxmlformats.org/drawingml/2006/picture">
+                  <pic:nvPicPr>
+                    <pic:cNvPr id="1" name=""/>
+                    <pic:cNvPicPr/>
+                  </pic:nvPicPr>
+                  <pic:blipFill>
+                    <a:blip r:embed="rId25"/>
+                    <a:stretch>
+                      <a:fillRect/>
+                    </a:stretch>
+                  </pic:blipFill>
+                  <pic:spPr>
+                    <a:xfrm>
+                      <a:off x="0" y="0"/>
+                      <a:ext cx="5943600" cy="3343275"/>
+                    </a:xfrm>
+                    <a:prstGeom prst="rect">
+                      <a:avLst/>
+                    </a:prstGeom>
+                  </pic:spPr>
+                </pic:pic>
+              </a:graphicData>
+            </a:graphic>
+          </wp:inline>
+        </w:drawing>
+      </w:r>
+    </w:p>
+    <w:p>
+      <w:pPr>
+        <w:pStyle w:val="ListParagraph"/>
+        <w:numPr>
+          <w:ilvl w:val="0"/>
+          <w:numId w:val="1"/>
+        </w:numPr>
+        <w:rPr>
+          <w:rFonts w:ascii="Times New Roman" w:hAnsi="Times New Roman" w:cs="Times New Roman"/>
+          <w:sz w:val="28"/>
+          <w:szCs w:val="28"/>
+        </w:rPr>
+      </w:pPr>
+      <w:r>
+        <w:rPr>
+          <w:rFonts w:ascii="Times New Roman" w:hAnsi="Times New Roman" w:cs="Times New Roman"/>
+          <w:sz w:val="28"/>
+          <w:szCs w:val="28"/>
+        </w:rPr>
+        <w:t>Docker stats</w:t>
+      </w:r>
+    </w:p>
+    <w:p>
+      <w:pPr>
+        <w:rPr>
+          <w:rFonts w:ascii="Times New Roman" w:hAnsi="Times New Roman" w:cs="Times New Roman"/>
+          <w:sz w:val="28"/>
+          <w:szCs w:val="28"/>
+        </w:rPr>
+      </w:pPr>
+      <w:r>
+        <w:rPr>
+          <w:rFonts w:ascii="Times New Roman" w:hAnsi="Times New Roman" w:cs="Times New Roman"/>
+          <w:sz w:val="28"/>
+          <w:szCs w:val="28"/>
+        </w:rPr>
+        <w:drawing>
+          <wp:inline distT="0" distB="0" distL="0" distR="0" wp14:anchorId="5779D15B" wp14:editId="5FAC759B">
+            <wp:extent cx="5943600" cy="3343275"/>
+            <wp:effectExtent l="0" t="0" r="0" b="9525"/>
+            <wp:docPr id="23" name="Picture 23"/>
+            <wp:cNvGraphicFramePr>
+              <a:graphicFrameLocks xmlns:a="http://schemas.openxmlformats.org/drawingml/2006/main" noChangeAspect="1"/>
+            </wp:cNvGraphicFramePr>
+            <a:graphic xmlns:a="http://schemas.openxmlformats.org/drawingml/2006/main">
+              <a:graphicData uri="http://schemas.openxmlformats.org/drawingml/2006/picture">
+                <pic:pic xmlns:pic="http://schemas.openxmlformats.org/drawingml/2006/picture">
+                  <pic:nvPicPr>
+                    <pic:cNvPr id="1" name=""/>
+                    <pic:cNvPicPr/>
+                  </pic:nvPicPr>
+                  <pic:blipFill>
+                    <a:blip r:embed="rId26"/>
+                    <a:stretch>
+                      <a:fillRect/>
+                    </a:stretch>
+                  </pic:blipFill>
+                  <pic:spPr>
+                    <a:xfrm>
+                      <a:off x="0" y="0"/>
+                      <a:ext cx="5943600" cy="3343275"/>
+                    </a:xfrm>
+                    <a:prstGeom prst="rect">
+                      <a:avLst/>
+                    </a:prstGeom>
+                  </pic:spPr>
+                </pic:pic>
+              </a:graphicData>
+            </a:graphic>
+          </wp:inline>
+        </w:drawing>
+      </w:r>
+    </w:p>
+    <w:p>
+      <w:pPr>
+        <w:pStyle w:val="ListParagraph"/>
+        <w:numPr>
+          <w:ilvl w:val="0"/>
+          <w:numId w:val="1"/>
+        </w:numPr>
+        <w:rPr>
+          <w:rFonts w:ascii="Times New Roman" w:hAnsi="Times New Roman" w:cs="Times New Roman"/>
+          <w:sz w:val="28"/>
+          <w:szCs w:val="28"/>
+        </w:rPr>
+      </w:pPr>
+      <w:r>
+        <w:rPr>
+          <w:rFonts w:ascii="Times New Roman" w:hAnsi="Times New Roman" w:cs="Times New Roman"/>
+          <w:sz w:val="28"/>
+          <w:szCs w:val="28"/>
+        </w:rPr>
+        <w:t>Docker network ls</w:t>
+      </w:r>
+    </w:p>
+    <w:p>
+      <w:pPr>
+        <w:rPr>
+          <w:rFonts w:ascii="Times New Roman" w:hAnsi="Times New Roman" w:cs="Times New Roman"/>
+          <w:sz w:val="28"/>
+          <w:szCs w:val="28"/>
+        </w:rPr>
+      </w:pPr>
+      <w:r>
+        <w:rPr>
+          <w:rFonts w:ascii="Times New Roman" w:hAnsi="Times New Roman" w:cs="Times New Roman"/>
+          <w:sz w:val="28"/>
+          <w:szCs w:val="28"/>
+        </w:rPr>
+        <w:lastRenderedPageBreak/>
+        <w:drawing>
+          <wp:inline distT="0" distB="0" distL="0" distR="0" wp14:anchorId="1A006C7D" wp14:editId="2CF94E9C">
+            <wp:extent cx="5943600" cy="3343275"/>
+            <wp:effectExtent l="0" t="0" r="0" b="9525"/>
+            <wp:docPr id="24" name="Picture 24"/>
+            <wp:cNvGraphicFramePr>
+              <a:graphicFrameLocks xmlns:a="http://schemas.openxmlformats.org/drawingml/2006/main" noChangeAspect="1"/>
+            </wp:cNvGraphicFramePr>
+            <a:graphic xmlns:a="http://schemas.openxmlformats.org/drawingml/2006/main">
+              <a:graphicData uri="http://schemas.openxmlformats.org/drawingml/2006/picture">
+                <pic:pic xmlns:pic="http://schemas.openxmlformats.org/drawingml/2006/picture">
+                  <pic:nvPicPr>
+                    <pic:cNvPr id="1" name=""/>
+                    <pic:cNvPicPr/>
+                  </pic:nvPicPr>
+                  <pic:blipFill>
+                    <a:blip r:embed="rId27"/>
+                    <a:stretch>
+                      <a:fillRect/>
+                    </a:stretch>
+                  </pic:blipFill>
+                  <pic:spPr>
+                    <a:xfrm>
+                      <a:off x="0" y="0"/>
+                      <a:ext cx="5943600" cy="3343275"/>
+                    </a:xfrm>
+                    <a:prstGeom prst="rect">
+                      <a:avLst/>
+                    </a:prstGeom>
+                  </pic:spPr>
+                </pic:pic>
+              </a:graphicData>
+            </a:graphic>
+          </wp:inline>
+        </w:drawing>
+      </w:r>
+    </w:p>
+    <w:p>
+      <w:pPr>
+        <w:pStyle w:val="ListParagraph"/>
+        <w:numPr>
+          <w:ilvl w:val="0"/>
+          <w:numId w:val="1"/>
+        </w:numPr>
+        <w:rPr>
+          <w:rFonts w:ascii="Times New Roman" w:hAnsi="Times New Roman" w:cs="Times New Roman"/>
+          <w:sz w:val="28"/>
+          <w:szCs w:val="28"/>
+        </w:rPr>
+      </w:pPr>
+      <w:r>
+        <w:rPr>
+          <w:rFonts w:ascii="Times New Roman" w:hAnsi="Times New Roman" w:cs="Times New Roman"/>
+          <w:sz w:val="28"/>
+          <w:szCs w:val="28"/>
+        </w:rPr>
+        <w:t>Docker network create my_network</w:t>
+      </w:r>
+    </w:p>
+    <w:p>
+      <w:pPr>
+        <w:rPr>
+          <w:rFonts w:ascii="Times New Roman" w:hAnsi="Times New Roman" w:cs="Times New Roman"/>
+          <w:sz w:val="28"/>
+          <w:szCs w:val="28"/>
+        </w:rPr>
+      </w:pPr>
+      <w:r>
+        <w:rPr>
+          <w:rFonts w:ascii="Times New Roman" w:hAnsi="Times New Roman" w:cs="Times New Roman"/>
+          <w:sz w:val="28"/>
+          <w:szCs w:val="28"/>
+        </w:rPr>
+        <w:drawing>
+          <wp:inline distT="0" distB="0" distL="0" distR="0" wp14:anchorId="1F060B10" wp14:editId="680FF19D">
+            <wp:extent cx="5943600" cy="3343275"/>
+            <wp:effectExtent l="0" t="0" r="0" b="9525"/>
+            <wp:docPr id="26" name="Picture 26"/>
+            <wp:cNvGraphicFramePr>
+              <a:graphicFrameLocks xmlns:a="http://schemas.openxmlformats.org/drawingml/2006/main" noChangeAspect="1"/>
+            </wp:cNvGraphicFramePr>
+            <a:graphic xmlns:a="http://schemas.openxmlformats.org/drawingml/2006/main">
+              <a:graphicData uri="http://schemas.openxmlformats.org/drawingml/2006/picture">
+                <pic:pic xmlns:pic="http://schemas.openxmlformats.org/drawingml/2006/picture">
+                  <pic:nvPicPr>
+                    <pic:cNvPr id="1" name=""/>
+                    <pic:cNvPicPr/>
+                  </pic:nvPicPr>
+                  <pic:blipFill>
+                    <a:blip r:embed="rId28"/>
+                    <a:stretch>
+                      <a:fillRect/>
+                    </a:stretch>
+                  </pic:blipFill>
+                  <pic:spPr>
+                    <a:xfrm>
+                      <a:off x="0" y="0"/>
+                      <a:ext cx="5943600" cy="3343275"/>
+                    </a:xfrm>
+                    <a:prstGeom prst="rect">
+                      <a:avLst/>
+                    </a:prstGeom>
+                  </pic:spPr>
+                </pic:pic>
+              </a:graphicData>
+            </a:graphic>
+          </wp:inline>
+        </w:drawing>
+      </w:r>
+    </w:p>
+    <w:p>
+      <w:pPr>
+        <w:pStyle w:val="ListParagraph"/>
+        <w:numPr>
+          <w:ilvl w:val="0"/>
+          <w:numId w:val="1"/>
+        </w:numPr>
+        <w:rPr>
+          <w:rFonts w:ascii="Times New Roman" w:hAnsi="Times New Roman" w:cs="Times New Roman"/>
+          <w:sz w:val="28"/>
+          <w:szCs w:val="28"/>
+        </w:rPr>
+      </w:pPr>
+      <w:r>
+        <w:rPr>
+          <w:rFonts w:ascii="Times New Roman" w:hAnsi="Times New Roman" w:cs="Times New Roman"/>
+          <w:sz w:val="28"/>
+          <w:szCs w:val="28"/>
+        </w:rPr>
+        <w:t>Docker run –d –network my_network –name my_container nginx</w:t>
+      </w:r>
+    </w:p>
+    <w:p>
+      <w:pPr>
+        <w:rPr>
+          <w:rFonts w:ascii="Times New Roman" w:hAnsi="Times New Roman" w:cs="Times New Roman"/>
+          <w:sz w:val="28"/>
+          <w:szCs w:val="28"/>
+        </w:rPr>
+      </w:pPr>
+      <w:r>
+        <w:rPr>
+          <w:rFonts w:ascii="Times New Roman" w:hAnsi="Times New Roman" w:cs="Times New Roman"/>
+          <w:sz w:val="28"/>
+          <w:szCs w:val="28"/>
+        </w:rPr>
+        <w:lastRenderedPageBreak/>
+        <w:drawing>
+          <wp:inline distT="0" distB="0" distL="0" distR="0" wp14:anchorId="63587365" wp14:editId="57A3ECE8">
+            <wp:extent cx="5943600" cy="3343275"/>
+            <wp:effectExtent l="0" t="0" r="0" b="9525"/>
+            <wp:docPr id="27" name="Picture 27"/>
+            <wp:cNvGraphicFramePr>
+              <a:graphicFrameLocks xmlns:a="http://schemas.openxmlformats.org/drawingml/2006/main" noChangeAspect="1"/>
+            </wp:cNvGraphicFramePr>
+            <a:graphic xmlns:a="http://schemas.openxmlformats.org/drawingml/2006/main">
+              <a:graphicData uri="http://schemas.openxmlformats.org/drawingml/2006/picture">
+                <pic:pic xmlns:pic="http://schemas.openxmlformats.org/drawingml/2006/picture">
+                  <pic:nvPicPr>
+                    <pic:cNvPr id="1" name=""/>
+                    <pic:cNvPicPr/>
+                  </pic:nvPicPr>
+                  <pic:blipFill>
+                    <a:blip r:embed="rId29"/>
+                    <a:stretch>
+                      <a:fillRect/>
+                    </a:stretch>
+                  </pic:blipFill>
+                  <pic:spPr>
+                    <a:xfrm>
+                      <a:off x="0" y="0"/>
+                      <a:ext cx="5943600" cy="3343275"/>
+                    </a:xfrm>
+                    <a:prstGeom prst="rect">
+                      <a:avLst/>
+                    </a:prstGeom>
+                  </pic:spPr>
+                </pic:pic>
+              </a:graphicData>
+            </a:graphic>
+          </wp:inline>
+        </w:drawing>
+      </w:r>
+    </w:p>
+    <w:p>
+      <w:pPr>
+        <w:pStyle w:val="ListParagraph"/>
+        <w:numPr>
+          <w:ilvl w:val="0"/>
+          <w:numId w:val="1"/>
+        </w:numPr>
+        <w:rPr>
+          <w:rFonts w:ascii="Times New Roman" w:hAnsi="Times New Roman" w:cs="Times New Roman"/>
+          <w:sz w:val="28"/>
+          <w:szCs w:val="28"/>
+        </w:rPr>
+      </w:pPr>
+      <w:r>
+        <w:rPr>
+          <w:rFonts w:ascii="Times New Roman" w:hAnsi="Times New Roman" w:cs="Times New Roman"/>
+          <w:sz w:val="28"/>
+          <w:szCs w:val="28"/>
+        </w:rPr>
+        <w:t>Docker network connect my_network my_nginx</w:t>
+      </w:r>
+    </w:p>
+    <w:p>
+      <w:pPr>
+        <w:rPr>
+          <w:rFonts w:ascii="Times New Roman" w:hAnsi="Times New Roman" w:cs="Times New Roman"/>
+          <w:sz w:val="28"/>
+          <w:szCs w:val="28"/>
+        </w:rPr>
+      </w:pPr>
+      <w:r>
+        <w:rPr>
+          <w:rFonts w:ascii="Times New Roman" w:hAnsi="Times New Roman" w:cs="Times New Roman"/>
+          <w:sz w:val="28"/>
+          <w:szCs w:val="28"/>
+        </w:rPr>
+        <w:drawing>
+          <wp:inline distT="0" distB="0" distL="0" distR="0" wp14:anchorId="034767FA" wp14:editId="65F54005">
+            <wp:extent cx="5943600" cy="3343275"/>
+            <wp:effectExtent l="0" t="0" r="0" b="9525"/>
+            <wp:docPr id="28" name="Picture 28"/>
+            <wp:cNvGraphicFramePr>
+              <a:graphicFrameLocks xmlns:a="http://schemas.openxmlformats.org/drawingml/2006/main" noChangeAspect="1"/>
+            </wp:cNvGraphicFramePr>
+            <a:graphic xmlns:a="http://schemas.openxmlformats.org/drawingml/2006/main">
+              <a:graphicData uri="http://schemas.openxmlformats.org/drawingml/2006/picture">
+                <pic:pic xmlns:pic="http://schemas.openxmlformats.org/drawingml/2006/picture">
+                  <pic:nvPicPr>
+                    <pic:cNvPr id="1" name=""/>
+                    <pic:cNvPicPr/>
+                  </pic:nvPicPr>
+                  <pic:blipFill>
+                    <a:blip r:embed="rId30"/>
+                    <a:stretch>
+                      <a:fillRect/>
+                    </a:stretch>
+                  </pic:blipFill>
+                  <pic:spPr>
+                    <a:xfrm>
+                      <a:off x="0" y="0"/>
+                      <a:ext cx="5943600" cy="3343275"/>
+                    </a:xfrm>
+                    <a:prstGeom prst="rect">
+                      <a:avLst/>
+                    </a:prstGeom>
+                  </pic:spPr>
+                </pic:pic>
+              </a:graphicData>
+            </a:graphic>
+          </wp:inline>
+        </w:drawing>
+      </w:r>
+    </w:p>
+    <w:p>
+      <w:pPr>
+        <w:pStyle w:val="ListParagraph"/>
+        <w:numPr>
+          <w:ilvl w:val="0"/>
+          <w:numId w:val="1"/>
+        </w:numPr>
+        <w:rPr>
+          <w:rFonts w:ascii="Times New Roman" w:hAnsi="Times New Roman" w:cs="Times New Roman"/>
+          <w:sz w:val="28"/>
+          <w:szCs w:val="28"/>
+        </w:rPr>
+      </w:pPr>
+      <w:r>
+        <w:rPr>
+          <w:rFonts w:ascii="Times New Roman" w:hAnsi="Times New Roman" w:cs="Times New Roman"/>
+          <w:sz w:val="28"/>
+          <w:szCs w:val="28"/>
+        </w:rPr>
+        <w:t>Docker run –d –e MY_ENV=hello_world nginx</w:t>
+      </w:r>
+    </w:p>
+    <w:p>
+      <w:pPr>
+        <w:rPr>
+          <w:rFonts w:ascii="Times New Roman" w:hAnsi="Times New Roman" w:cs="Times New Roman"/>
+          <w:sz w:val="28"/>
+          <w:szCs w:val="28"/>
+        </w:rPr>
+      </w:pPr>
+      <w:r>
+        <w:rPr>
+          <w:rFonts w:ascii="Times New Roman" w:hAnsi="Times New Roman" w:cs="Times New Roman"/>
+          <w:sz w:val="28"/>
+          <w:szCs w:val="28"/>
+        </w:rPr>
+        <w:lastRenderedPageBreak/>
+        <w:drawing>
+          <wp:inline distT="0" distB="0" distL="0" distR="0" wp14:anchorId="6E254A8F" wp14:editId="215D213E">
+            <wp:extent cx="5943600" cy="3343275"/>
+            <wp:effectExtent l="0" t="0" r="0" b="9525"/>
+            <wp:docPr id="29" name="Picture 29"/>
+            <wp:cNvGraphicFramePr>
+              <a:graphicFrameLocks xmlns:a="http://schemas.openxmlformats.org/drawingml/2006/main" noChangeAspect="1"/>
+            </wp:cNvGraphicFramePr>
+            <a:graphic xmlns:a="http://schemas.openxmlformats.org/drawingml/2006/main">
+              <a:graphicData uri="http://schemas.openxmlformats.org/drawingml/2006/picture">
+                <pic:pic xmlns:pic="http://schemas.openxmlformats.org/drawingml/2006/picture">
+                  <pic:nvPicPr>
+                    <pic:cNvPr id="1" name=""/>
+                    <pic:cNvPicPr/>
+                  </pic:nvPicPr>
+                  <pic:blipFill>
+                    <a:blip r:embed="rId31"/>
+                    <a:stretch>
+                      <a:fillRect/>
+                    </a:stretch>
+                  </pic:blipFill>
+                  <pic:spPr>
+                    <a:xfrm>
+                      <a:off x="0" y="0"/>
+                      <a:ext cx="5943600" cy="3343275"/>
+                    </a:xfrm>
+                    <a:prstGeom prst="rect">
+                      <a:avLst/>
+                    </a:prstGeom>
+                  </pic:spPr>
+                </pic:pic>
+              </a:graphicData>
+            </a:graphic>
+          </wp:inline>
+        </w:drawing>
+      </w:r>
+    </w:p>
+    <w:p>
+      <w:pPr>
+        <w:pStyle w:val="ListParagraph"/>
+        <w:numPr>
+          <w:ilvl w:val="0"/>
+          <w:numId w:val="1"/>
+        </w:numPr>
+        <w:rPr>
+          <w:rFonts w:ascii="Times New Roman" w:hAnsi="Times New Roman" w:cs="Times New Roman"/>
+          <w:sz w:val="28"/>
+          <w:szCs w:val="28"/>
+        </w:rPr>
+      </w:pPr>
+      <w:r>
+        <w:rPr>
+          <w:rFonts w:ascii="Times New Roman" w:hAnsi="Times New Roman" w:cs="Times New Roman"/>
+          <w:sz w:val="28"/>
+          <w:szCs w:val="28"/>
+        </w:rPr>
+        <w:t>Docker logs –f my_nginx</w:t>
+      </w:r>
+    </w:p>
+    <w:p>
+      <w:pPr>
+        <w:rPr>
+          <w:rFonts w:ascii="Times New Roman" w:hAnsi="Times New Roman" w:cs="Times New Roman"/>
+          <w:sz w:val="28"/>
+          <w:szCs w:val="28"/>
+        </w:rPr>
+      </w:pPr>
+      <w:r>
+        <w:rPr>
+          <w:rFonts w:ascii="Times New Roman" w:hAnsi="Times New Roman" w:cs="Times New Roman"/>
+          <w:sz w:val="28"/>
+          <w:szCs w:val="28"/>
+        </w:rPr>
+        <w:drawing>
+          <wp:inline distT="0" distB="0" distL="0" distR="0" wp14:anchorId="4809CD8F" wp14:editId="628423BF">
+            <wp:extent cx="5943600" cy="3343275"/>
+            <wp:effectExtent l="0" t="0" r="0" b="9525"/>
+            <wp:docPr id="30" name="Picture 30"/>
+            <wp:cNvGraphicFramePr>
+              <a:graphicFrameLocks xmlns:a="http://schemas.openxmlformats.org/drawingml/2006/main" noChangeAspect="1"/>
+            </wp:cNvGraphicFramePr>
+            <a:graphic xmlns:a="http://schemas.openxmlformats.org/drawingml/2006/main">
+              <a:graphicData uri="http://schemas.openxmlformats.org/drawingml/2006/picture">
+                <pic:pic xmlns:pic="http://schemas.openxmlformats.org/drawingml/2006/picture">
+                  <pic:nvPicPr>
+                    <pic:cNvPr id="1" name=""/>
+                    <pic:cNvPicPr/>
+                  </pic:nvPicPr>
+                  <pic:blipFill>
+                    <a:blip r:embed="rId32"/>
+                    <a:stretch>
+                      <a:fillRect/>
+                    </a:stretch>
+                  </pic:blipFill>
+                  <pic:spPr>
+                    <a:xfrm>
+                      <a:off x="0" y="0"/>
+                      <a:ext cx="5943600" cy="3343275"/>
+                    </a:xfrm>
+                    <a:prstGeom prst="rect">
+                      <a:avLst/>
+                    </a:prstGeom>
+                  </pic:spPr>
+                </pic:pic>
+              </a:graphicData>
+            </a:graphic>
+          </wp:inline>
+        </w:drawing>
+      </w:r>
+    </w:p>
+    <w:p>
+      <w:pPr>
+        <w:pStyle w:val="ListParagraph"/>
+        <w:numPr>
+          <w:ilvl w:val="0"/>
+          <w:numId w:val="1"/>
+        </w:numPr>
+        <w:rPr>
+          <w:rFonts w:ascii="Times New Roman" w:hAnsi="Times New Roman" w:cs="Times New Roman"/>
+          <w:sz w:val="28"/>
+          <w:szCs w:val="28"/>
+        </w:rPr>
+      </w:pPr>
+      <w:r>
+        <w:rPr>
+          <w:rFonts w:ascii="Times New Roman" w:hAnsi="Times New Roman" w:cs="Times New Roman"/>
+          <w:sz w:val="28"/>
+          <w:szCs w:val="28"/>
+        </w:rPr>
+        <w:t>Docker build –t my_nginx_image</w:t>
+      </w:r>
+    </w:p>
+    <w:p>
+      <w:pPr>
+        <w:rPr>
+          <w:rFonts w:ascii="Times New Roman" w:hAnsi="Times New Roman" w:cs="Times New Roman"/>
+          <w:sz w:val="28"/>
+          <w:szCs w:val="28"/>
+        </w:rPr>
+      </w:pPr>
+      <w:r>
+        <w:rPr>
+          <w:rFonts w:ascii="Times New Roman" w:hAnsi="Times New Roman" w:cs="Times New Roman"/>
+          <w:sz w:val="28"/>
+          <w:szCs w:val="28"/>
+        </w:rPr>
+        <w:lastRenderedPageBreak/>
+        <w:drawing>
+          <wp:inline distT="0" distB="0" distL="0" distR="0" wp14:anchorId="455A6EE6" wp14:editId="4F433EDC">
+            <wp:extent cx="5943600" cy="3343275"/>
+            <wp:effectExtent l="0" t="0" r="0" b="9525"/>
+            <wp:docPr id="31" name="Picture 31"/>
+            <wp:cNvGraphicFramePr>
+              <a:graphicFrameLocks xmlns:a="http://schemas.openxmlformats.org/drawingml/2006/main" noChangeAspect="1"/>
+            </wp:cNvGraphicFramePr>
+            <a:graphic xmlns:a="http://schemas.openxmlformats.org/drawingml/2006/main">
+              <a:graphicData uri="http://schemas.openxmlformats.org/drawingml/2006/picture">
+                <pic:pic xmlns:pic="http://schemas.openxmlformats.org/drawingml/2006/picture">
+                  <pic:nvPicPr>
+                    <pic:cNvPr id="1" name=""/>
+                    <pic:cNvPicPr/>
+                  </pic:nvPicPr>
+                  <pic:blipFill>
+                    <a:blip r:embed="rId33"/>
+                    <a:stretch>
+                      <a:fillRect/>
+                    </a:stretch>
+                  </pic:blipFill>
+                  <pic:spPr>
+                    <a:xfrm>
+                      <a:off x="0" y="0"/>
+                      <a:ext cx="5943600" cy="3343275"/>
+                    </a:xfrm>
+                    <a:prstGeom prst="rect">
+                      <a:avLst/>
+                    </a:prstGeom>
+                  </pic:spPr>
+                </pic:pic>
+              </a:graphicData>
+            </a:graphic>
+          </wp:inline>
+        </w:drawing>
+      </w:r>
+    </w:p>
+    <w:p>
+      <w:pPr>
+        <w:pStyle w:val="ListParagraph"/>
+        <w:numPr>
+          <w:ilvl w:val="0"/>
+          <w:numId w:val="1"/>
+        </w:numPr>
+        <w:rPr>
+          <w:rFonts w:ascii="Times New Roman" w:hAnsi="Times New Roman" w:cs="Times New Roman"/>
+          <w:sz w:val="28"/>
+          <w:szCs w:val="28"/>
+        </w:rPr>
+      </w:pPr>
+      <w:r>
+        <w:rPr>
+          <w:rFonts w:ascii="Times New Roman" w:hAnsi="Times New Roman" w:cs="Times New Roman"/>
+          <w:sz w:val="28"/>
+          <w:szCs w:val="28"/>
+        </w:rPr>
+        <w:t>Docker run –d –p8080:80 my_nginx_image</w:t>
+      </w:r>
+    </w:p>
+    <w:p>
+      <w:pPr>
+        <w:rPr>
+          <w:rFonts w:ascii="Times New Roman" w:hAnsi="Times New Roman" w:cs="Times New Roman"/>
+          <w:sz w:val="28"/>
+          <w:szCs w:val="28"/>
+        </w:rPr>
+      </w:pPr>
+      <w:r>
+        <w:rPr>
+          <w:rFonts w:ascii="Times New Roman" w:hAnsi="Times New Roman" w:cs="Times New Roman"/>
+          <w:sz w:val="28"/>
+          <w:szCs w:val="28"/>
+        </w:rPr>
+        <w:drawing>
+          <wp:inline distT="0" distB="0" distL="0" distR="0" wp14:anchorId="1561A65C" wp14:editId="4DC749D6">
+            <wp:extent cx="5943600" cy="3343275"/>
+            <wp:effectExtent l="0" t="0" r="0" b="9525"/>
+            <wp:docPr id="32" name="Picture 32"/>
+            <wp:cNvGraphicFramePr>
+              <a:graphicFrameLocks xmlns:a="http://schemas.openxmlformats.org/drawingml/2006/main" noChangeAspect="1"/>
+            </wp:cNvGraphicFramePr>
+            <a:graphic xmlns:a="http://schemas.openxmlformats.org/drawingml/2006/main">
+              <a:graphicData uri="http://schemas.openxmlformats.org/drawingml/2006/picture">
+                <pic:pic xmlns:pic="http://schemas.openxmlformats.org/drawingml/2006/picture">
+                  <pic:nvPicPr>
+                    <pic:cNvPr id="1" name=""/>
+                    <pic:cNvPicPr/>
+                  </pic:nvPicPr>
+                  <pic:blipFill>
+                    <a:blip r:embed="rId34"/>
+                    <a:stretch>
+                      <a:fillRect/>
+                    </a:stretch>
+                  </pic:blipFill>
+                  <pic:spPr>
+                    <a:xfrm>
+                      <a:off x="0" y="0"/>
+                      <a:ext cx="5943600" cy="3343275"/>
+                    </a:xfrm>
+                    <a:prstGeom prst="rect">
+                      <a:avLst/>
+                    </a:prstGeom>
+                  </pic:spPr>
+                </pic:pic>
+              </a:graphicData>
+            </a:graphic>
+          </wp:inline>
+        </w:drawing>
+      </w:r>
       <w:bookmarkStart w:id="0" w:name="_GoBack"/>
       <w:bookmarkEnd w:id="0"/>
+    </w:p>
+    <w:p>
+      <w:pPr>
+        <w:rPr>
+          <w:rFonts w:ascii="Times New Roman" w:hAnsi="Times New Roman" w:cs="Times New Roman"/>
+          <w:sz w:val="28"/>
+          <w:szCs w:val="28"/>
+        </w:rPr>
+      </w:pPr>
     </w:p>
     <w:sectPr>
       <w:pgSz w:w="12240" w:h="15840"/>
@@ -14,6 +2276,103 @@
     </w:sectPr>
   </w:body>
 </w:document>
+</file>
+
+<file path=word/numbering.xml><?xml version="1.0" encoding="utf-8"?>
+<w:numbering xmlns:wpc="http://schemas.microsoft.com/office/word/2010/wordprocessingCanvas" xmlns:mc="http://schemas.openxmlformats.org/markup-compatibility/2006" xmlns:o="urn:schemas-microsoft-com:office:office" xmlns:r="http://schemas.openxmlformats.org/officeDocument/2006/relationships" xmlns:m="http://schemas.openxmlformats.org/officeDocument/2006/math" xmlns:v="urn:schemas-microsoft-com:vml" xmlns:wp14="http://schemas.microsoft.com/office/word/2010/wordprocessingDrawing" xmlns:wp="http://schemas.openxmlformats.org/drawingml/2006/wordprocessingDrawing" xmlns:w10="urn:schemas-microsoft-com:office:word" xmlns:w="http://schemas.openxmlformats.org/wordprocessingml/2006/main" xmlns:w14="http://schemas.microsoft.com/office/word/2010/wordml" xmlns:w15="http://schemas.microsoft.com/office/word/2012/wordml" xmlns:wpg="http://schemas.microsoft.com/office/word/2010/wordprocessingGroup" xmlns:wpi="http://schemas.microsoft.com/office/word/2010/wordprocessingInk" xmlns:wne="http://schemas.microsoft.com/office/word/2006/wordml" xmlns:wps="http://schemas.microsoft.com/office/word/2010/wordprocessingShape" mc:Ignorable="w14 w15 wp14">
+  <w:abstractNum w:abstractNumId="0">
+    <w:nsid w:val="7B7A522E"/>
+    <w:multiLevelType w:val="hybridMultilevel"/>
+    <w:tmpl w:val="5E8A2FAC"/>
+    <w:lvl w:ilvl="0" w:tplc="0409000F">
+      <w:start w:val="1"/>
+      <w:numFmt w:val="decimal"/>
+      <w:lvlText w:val="%1."/>
+      <w:lvlJc w:val="left"/>
+      <w:pPr>
+        <w:ind w:left="720" w:hanging="360"/>
+      </w:pPr>
+      <w:rPr>
+        <w:rFonts w:hint="default"/>
+      </w:rPr>
+    </w:lvl>
+    <w:lvl w:ilvl="1" w:tplc="04090019" w:tentative="1">
+      <w:start w:val="1"/>
+      <w:numFmt w:val="lowerLetter"/>
+      <w:lvlText w:val="%2."/>
+      <w:lvlJc w:val="left"/>
+      <w:pPr>
+        <w:ind w:left="1440" w:hanging="360"/>
+      </w:pPr>
+    </w:lvl>
+    <w:lvl w:ilvl="2" w:tplc="0409001B" w:tentative="1">
+      <w:start w:val="1"/>
+      <w:numFmt w:val="lowerRoman"/>
+      <w:lvlText w:val="%3."/>
+      <w:lvlJc w:val="right"/>
+      <w:pPr>
+        <w:ind w:left="2160" w:hanging="180"/>
+      </w:pPr>
+    </w:lvl>
+    <w:lvl w:ilvl="3" w:tplc="0409000F" w:tentative="1">
+      <w:start w:val="1"/>
+      <w:numFmt w:val="decimal"/>
+      <w:lvlText w:val="%4."/>
+      <w:lvlJc w:val="left"/>
+      <w:pPr>
+        <w:ind w:left="2880" w:hanging="360"/>
+      </w:pPr>
+    </w:lvl>
+    <w:lvl w:ilvl="4" w:tplc="04090019" w:tentative="1">
+      <w:start w:val="1"/>
+      <w:numFmt w:val="lowerLetter"/>
+      <w:lvlText w:val="%5."/>
+      <w:lvlJc w:val="left"/>
+      <w:pPr>
+        <w:ind w:left="3600" w:hanging="360"/>
+      </w:pPr>
+    </w:lvl>
+    <w:lvl w:ilvl="5" w:tplc="0409001B" w:tentative="1">
+      <w:start w:val="1"/>
+      <w:numFmt w:val="lowerRoman"/>
+      <w:lvlText w:val="%6."/>
+      <w:lvlJc w:val="right"/>
+      <w:pPr>
+        <w:ind w:left="4320" w:hanging="180"/>
+      </w:pPr>
+    </w:lvl>
+    <w:lvl w:ilvl="6" w:tplc="0409000F" w:tentative="1">
+      <w:start w:val="1"/>
+      <w:numFmt w:val="decimal"/>
+      <w:lvlText w:val="%7."/>
+      <w:lvlJc w:val="left"/>
+      <w:pPr>
+        <w:ind w:left="5040" w:hanging="360"/>
+      </w:pPr>
+    </w:lvl>
+    <w:lvl w:ilvl="7" w:tplc="04090019" w:tentative="1">
+      <w:start w:val="1"/>
+      <w:numFmt w:val="lowerLetter"/>
+      <w:lvlText w:val="%8."/>
+      <w:lvlJc w:val="left"/>
+      <w:pPr>
+        <w:ind w:left="5760" w:hanging="360"/>
+      </w:pPr>
+    </w:lvl>
+    <w:lvl w:ilvl="8" w:tplc="0409001B" w:tentative="1">
+      <w:start w:val="1"/>
+      <w:numFmt w:val="lowerRoman"/>
+      <w:lvlText w:val="%9."/>
+      <w:lvlJc w:val="right"/>
+      <w:pPr>
+        <w:ind w:left="6480" w:hanging="180"/>
+      </w:pPr>
+    </w:lvl>
+  </w:abstractNum>
+  <w:num w:numId="1">
+    <w:abstractNumId w:val="0"/>
+  </w:num>
+</w:numbering>
 </file>
 
 <file path=word/styles.xml><?xml version="1.0" encoding="utf-8"?>
@@ -437,6 +2796,17 @@
     <w:semiHidden/>
     <w:unhideWhenUsed/>
   </w:style>
+  <w:style w:type="paragraph" w:styleId="ListParagraph">
+    <w:name w:val="List Paragraph"/>
+    <w:basedOn w:val="Normal"/>
+    <w:uiPriority w:val="34"/>
+    <w:qFormat/>
+    <w:rsid w:val="002320F1"/>
+    <w:pPr>
+      <w:ind w:left="720"/>
+      <w:contextualSpacing/>
+    </w:pPr>
+  </w:style>
 </w:styles>
 </file>
 

</xml_diff>

<commit_message>
cau 29 phan 1
</commit_message>
<xml_diff>
--- a/Tuan04/nguyentrungquyen_22640121_MinhChung.docx
+++ b/Tuan04/nguyentrungquyen_22640121_MinhChung.docx
@@ -2129,7 +2129,7 @@
           <w:sz w:val="28"/>
           <w:szCs w:val="28"/>
         </w:rPr>
-        <w:t>Docker build –t my_nginx_image</w:t>
+        <w:t>File docker</w:t>
       </w:r>
     </w:p>
     <w:p>
@@ -2148,10 +2148,10 @@
         </w:rPr>
         <w:lastRenderedPageBreak/>
         <w:drawing>
-          <wp:inline distT="0" distB="0" distL="0" distR="0" wp14:anchorId="455A6EE6" wp14:editId="4F433EDC">
+          <wp:inline distT="0" distB="0" distL="0" distR="0" wp14:anchorId="05EC0249" wp14:editId="04C37A2D">
             <wp:extent cx="5943600" cy="3343275"/>
             <wp:effectExtent l="0" t="0" r="0" b="9525"/>
-            <wp:docPr id="31" name="Picture 31"/>
+            <wp:docPr id="33" name="Picture 33"/>
             <wp:cNvGraphicFramePr>
               <a:graphicFrameLocks xmlns:a="http://schemas.openxmlformats.org/drawingml/2006/main" noChangeAspect="1"/>
             </wp:cNvGraphicFramePr>
@@ -2183,6 +2183,18 @@
           </wp:inline>
         </w:drawing>
       </w:r>
+      <w:bookmarkStart w:id="0" w:name="_GoBack"/>
+      <w:bookmarkEnd w:id="0"/>
+    </w:p>
+    <w:p>
+      <w:pPr>
+        <w:ind w:left="360"/>
+        <w:rPr>
+          <w:rFonts w:ascii="Times New Roman" w:hAnsi="Times New Roman" w:cs="Times New Roman"/>
+          <w:sz w:val="28"/>
+          <w:szCs w:val="28"/>
+        </w:rPr>
+      </w:pPr>
     </w:p>
     <w:p>
       <w:pPr>
@@ -2203,7 +2215,7 @@
           <w:sz w:val="28"/>
           <w:szCs w:val="28"/>
         </w:rPr>
-        <w:t>Docker run –d –p8080:80 my_nginx_image</w:t>
+        <w:t>Docker build –t my_nginx_image</w:t>
       </w:r>
     </w:p>
     <w:p>
@@ -2221,10 +2233,10 @@
           <w:szCs w:val="28"/>
         </w:rPr>
         <w:drawing>
-          <wp:inline distT="0" distB="0" distL="0" distR="0" wp14:anchorId="1561A65C" wp14:editId="4DC749D6">
+          <wp:inline distT="0" distB="0" distL="0" distR="0" wp14:anchorId="455A6EE6" wp14:editId="4F433EDC">
             <wp:extent cx="5943600" cy="3343275"/>
             <wp:effectExtent l="0" t="0" r="0" b="9525"/>
-            <wp:docPr id="32" name="Picture 32"/>
+            <wp:docPr id="31" name="Picture 31"/>
             <wp:cNvGraphicFramePr>
               <a:graphicFrameLocks xmlns:a="http://schemas.openxmlformats.org/drawingml/2006/main" noChangeAspect="1"/>
             </wp:cNvGraphicFramePr>
@@ -2256,8 +2268,80 @@
           </wp:inline>
         </w:drawing>
       </w:r>
-      <w:bookmarkStart w:id="0" w:name="_GoBack"/>
-      <w:bookmarkEnd w:id="0"/>
+    </w:p>
+    <w:p>
+      <w:pPr>
+        <w:pStyle w:val="ListParagraph"/>
+        <w:numPr>
+          <w:ilvl w:val="0"/>
+          <w:numId w:val="1"/>
+        </w:numPr>
+        <w:rPr>
+          <w:rFonts w:ascii="Times New Roman" w:hAnsi="Times New Roman" w:cs="Times New Roman"/>
+          <w:sz w:val="28"/>
+          <w:szCs w:val="28"/>
+        </w:rPr>
+      </w:pPr>
+      <w:r>
+        <w:rPr>
+          <w:rFonts w:ascii="Times New Roman" w:hAnsi="Times New Roman" w:cs="Times New Roman"/>
+          <w:sz w:val="28"/>
+          <w:szCs w:val="28"/>
+        </w:rPr>
+        <w:t>Docker run –d –p8080:80 my_nginx_image</w:t>
+      </w:r>
+    </w:p>
+    <w:p>
+      <w:pPr>
+        <w:rPr>
+          <w:rFonts w:ascii="Times New Roman" w:hAnsi="Times New Roman" w:cs="Times New Roman"/>
+          <w:sz w:val="28"/>
+          <w:szCs w:val="28"/>
+        </w:rPr>
+      </w:pPr>
+      <w:r>
+        <w:rPr>
+          <w:rFonts w:ascii="Times New Roman" w:hAnsi="Times New Roman" w:cs="Times New Roman"/>
+          <w:sz w:val="28"/>
+          <w:szCs w:val="28"/>
+        </w:rPr>
+        <w:lastRenderedPageBreak/>
+        <w:drawing>
+          <wp:inline distT="0" distB="0" distL="0" distR="0" wp14:anchorId="1561A65C" wp14:editId="4DC749D6">
+            <wp:extent cx="5943600" cy="3343275"/>
+            <wp:effectExtent l="0" t="0" r="0" b="9525"/>
+            <wp:docPr id="32" name="Picture 32"/>
+            <wp:cNvGraphicFramePr>
+              <a:graphicFrameLocks xmlns:a="http://schemas.openxmlformats.org/drawingml/2006/main" noChangeAspect="1"/>
+            </wp:cNvGraphicFramePr>
+            <a:graphic xmlns:a="http://schemas.openxmlformats.org/drawingml/2006/main">
+              <a:graphicData uri="http://schemas.openxmlformats.org/drawingml/2006/picture">
+                <pic:pic xmlns:pic="http://schemas.openxmlformats.org/drawingml/2006/picture">
+                  <pic:nvPicPr>
+                    <pic:cNvPr id="1" name=""/>
+                    <pic:cNvPicPr/>
+                  </pic:nvPicPr>
+                  <pic:blipFill>
+                    <a:blip r:embed="rId35"/>
+                    <a:stretch>
+                      <a:fillRect/>
+                    </a:stretch>
+                  </pic:blipFill>
+                  <pic:spPr>
+                    <a:xfrm>
+                      <a:off x="0" y="0"/>
+                      <a:ext cx="5943600" cy="3343275"/>
+                    </a:xfrm>
+                    <a:prstGeom prst="rect">
+                      <a:avLst/>
+                    </a:prstGeom>
+                  </pic:spPr>
+                </pic:pic>
+              </a:graphicData>
+            </a:graphic>
+          </wp:inline>
+        </w:drawing>
+      </w:r>
     </w:p>
     <w:p>
       <w:pPr>

</xml_diff>

<commit_message>
Phan 2: bai1, bai2, bai3
</commit_message>
<xml_diff>
--- a/Tuan04/nguyentrungquyen_22640121_MinhChung.docx
+++ b/Tuan04/nguyentrungquyen_22640121_MinhChung.docx
@@ -1,6 +1,6 @@
 
 <file path=word/document.xml><?xml version="1.0" encoding="utf-8"?>
-<w:document xmlns:wpc="http://schemas.microsoft.com/office/word/2010/wordprocessingCanvas" xmlns:mc="http://schemas.openxmlformats.org/markup-compatibility/2006" xmlns:o="urn:schemas-microsoft-com:office:office" xmlns:r="http://schemas.openxmlformats.org/officeDocument/2006/relationships" xmlns:m="http://schemas.openxmlformats.org/officeDocument/2006/math" xmlns:v="urn:schemas-microsoft-com:vml" xmlns:wp14="http://schemas.microsoft.com/office/word/2010/wordprocessingDrawing" xmlns:wp="http://schemas.openxmlformats.org/drawingml/2006/wordprocessingDrawing" xmlns:w10="urn:schemas-microsoft-com:office:word" xmlns:w="http://schemas.openxmlformats.org/wordprocessingml/2006/main" xmlns:w14="http://schemas.microsoft.com/office/word/2010/wordml" xmlns:w15="http://schemas.microsoft.com/office/word/2012/wordml" xmlns:wpg="http://schemas.microsoft.com/office/word/2010/wordprocessingGroup" xmlns:wpi="http://schemas.microsoft.com/office/word/2010/wordprocessingInk" xmlns:wne="http://schemas.microsoft.com/office/word/2006/wordml" xmlns:wps="http://schemas.microsoft.com/office/word/2010/wordprocessingShape" mc:Ignorable="w14 w15 wp14">
+<w:document xmlns:wpc="http://schemas.microsoft.com/office/word/2010/wordprocessingCanvas" xmlns:cx="http://schemas.microsoft.com/office/drawing/2014/chartex" xmlns:cx1="http://schemas.microsoft.com/office/drawing/2015/9/8/chartex" xmlns:cx2="http://schemas.microsoft.com/office/drawing/2015/10/21/chartex" xmlns:cx3="http://schemas.microsoft.com/office/drawing/2016/5/9/chartex" xmlns:cx4="http://schemas.microsoft.com/office/drawing/2016/5/10/chartex" xmlns:cx5="http://schemas.microsoft.com/office/drawing/2016/5/11/chartex" xmlns:cx6="http://schemas.microsoft.com/office/drawing/2016/5/12/chartex" xmlns:cx7="http://schemas.microsoft.com/office/drawing/2016/5/13/chartex" xmlns:cx8="http://schemas.microsoft.com/office/drawing/2016/5/14/chartex" xmlns:mc="http://schemas.openxmlformats.org/markup-compatibility/2006" xmlns:aink="http://schemas.microsoft.com/office/drawing/2016/ink" xmlns:am3d="http://schemas.microsoft.com/office/drawing/2017/model3d" xmlns:o="urn:schemas-microsoft-com:office:office" xmlns:r="http://schemas.openxmlformats.org/officeDocument/2006/relationships" xmlns:m="http://schemas.openxmlformats.org/officeDocument/2006/math" xmlns:v="urn:schemas-microsoft-com:vml" xmlns:wp14="http://schemas.microsoft.com/office/word/2010/wordprocessingDrawing" xmlns:wp="http://schemas.openxmlformats.org/drawingml/2006/wordprocessingDrawing" xmlns:w10="urn:schemas-microsoft-com:office:word" xmlns:w="http://schemas.openxmlformats.org/wordprocessingml/2006/main" xmlns:w14="http://schemas.microsoft.com/office/word/2010/wordml" xmlns:w15="http://schemas.microsoft.com/office/word/2012/wordml" xmlns:w16cex="http://schemas.microsoft.com/office/word/2018/wordml/cex" xmlns:w16cid="http://schemas.microsoft.com/office/word/2016/wordml/cid" xmlns:w16="http://schemas.microsoft.com/office/word/2018/wordml" xmlns:w16sdtdh="http://schemas.microsoft.com/office/word/2020/wordml/sdtdatahash" xmlns:w16se="http://schemas.microsoft.com/office/word/2015/wordml/symex" xmlns:wpg="http://schemas.microsoft.com/office/word/2010/wordprocessingGroup" xmlns:wpi="http://schemas.microsoft.com/office/word/2010/wordprocessingInk" xmlns:wne="http://schemas.microsoft.com/office/word/2006/wordml" xmlns:wps="http://schemas.microsoft.com/office/word/2010/wordprocessingShape" mc:Ignorable="w14 w15 w16se w16cid w16 w16cex w16sdtdh wp14">
   <w:body>
     <w:p>
       <w:pPr>
@@ -21,7 +21,7 @@
     </w:p>
     <w:p>
       <w:pPr>
-        <w:pStyle w:val="ListParagraph"/>
+        <w:pStyle w:val="oancuaDanhsach"/>
         <w:numPr>
           <w:ilvl w:val="0"/>
           <w:numId w:val="1"/>
@@ -52,11 +52,12 @@
       <w:r>
         <w:rPr>
           <w:rFonts w:ascii="Times New Roman" w:hAnsi="Times New Roman" w:cs="Times New Roman"/>
+          <w:noProof/>
           <w:sz w:val="28"/>
           <w:szCs w:val="28"/>
         </w:rPr>
         <w:drawing>
-          <wp:inline distT="0" distB="0" distL="0" distR="0" wp14:anchorId="2DEA8DA6" wp14:editId="366B870C">
+          <wp:inline distT="0" distB="0" distL="0" distR="0" wp14:anchorId="236B5E72" wp14:editId="6913006C">
             <wp:extent cx="5943600" cy="3343275"/>
             <wp:effectExtent l="0" t="0" r="0" b="9525"/>
             <wp:docPr id="1" name="Picture 1"/>
@@ -94,7 +95,7 @@
     </w:p>
     <w:p>
       <w:pPr>
-        <w:pStyle w:val="ListParagraph"/>
+        <w:pStyle w:val="oancuaDanhsach"/>
         <w:numPr>
           <w:ilvl w:val="0"/>
           <w:numId w:val="1"/>
@@ -125,11 +126,12 @@
       <w:r>
         <w:rPr>
           <w:rFonts w:ascii="Times New Roman" w:hAnsi="Times New Roman" w:cs="Times New Roman"/>
+          <w:noProof/>
           <w:sz w:val="28"/>
           <w:szCs w:val="28"/>
         </w:rPr>
         <w:drawing>
-          <wp:inline distT="0" distB="0" distL="0" distR="0" wp14:anchorId="3BA055F0" wp14:editId="1DE4390F">
+          <wp:inline distT="0" distB="0" distL="0" distR="0" wp14:anchorId="1904143E" wp14:editId="4C893C4E">
             <wp:extent cx="5943600" cy="3343275"/>
             <wp:effectExtent l="0" t="0" r="0" b="9525"/>
             <wp:docPr id="2" name="Picture 2"/>
@@ -167,7 +169,7 @@
     </w:p>
     <w:p>
       <w:pPr>
-        <w:pStyle w:val="ListParagraph"/>
+        <w:pStyle w:val="oancuaDanhsach"/>
         <w:numPr>
           <w:ilvl w:val="0"/>
           <w:numId w:val="1"/>
@@ -209,11 +211,12 @@
       <w:r>
         <w:rPr>
           <w:rFonts w:ascii="Times New Roman" w:hAnsi="Times New Roman" w:cs="Times New Roman"/>
+          <w:noProof/>
           <w:sz w:val="28"/>
           <w:szCs w:val="28"/>
         </w:rPr>
         <w:drawing>
-          <wp:inline distT="0" distB="0" distL="0" distR="0" wp14:anchorId="2C77988A" wp14:editId="3E5893E5">
+          <wp:inline distT="0" distB="0" distL="0" distR="0" wp14:anchorId="47DB5580" wp14:editId="446BEF2F">
             <wp:extent cx="5943600" cy="3343275"/>
             <wp:effectExtent l="0" t="0" r="0" b="9525"/>
             <wp:docPr id="3" name="Picture 3"/>
@@ -251,7 +254,7 @@
     </w:p>
     <w:p>
       <w:pPr>
-        <w:pStyle w:val="ListParagraph"/>
+        <w:pStyle w:val="oancuaDanhsach"/>
         <w:numPr>
           <w:ilvl w:val="0"/>
           <w:numId w:val="1"/>
@@ -282,11 +285,12 @@
       <w:r>
         <w:rPr>
           <w:rFonts w:ascii="Times New Roman" w:hAnsi="Times New Roman" w:cs="Times New Roman"/>
+          <w:noProof/>
           <w:sz w:val="28"/>
           <w:szCs w:val="28"/>
         </w:rPr>
         <w:drawing>
-          <wp:inline distT="0" distB="0" distL="0" distR="0" wp14:anchorId="34470D4C" wp14:editId="46D34445">
+          <wp:inline distT="0" distB="0" distL="0" distR="0" wp14:anchorId="7BC3B630" wp14:editId="1E3140A8">
             <wp:extent cx="5943600" cy="3343275"/>
             <wp:effectExtent l="0" t="0" r="0" b="9525"/>
             <wp:docPr id="4" name="Picture 4"/>
@@ -324,7 +328,7 @@
     </w:p>
     <w:p>
       <w:pPr>
-        <w:pStyle w:val="ListParagraph"/>
+        <w:pStyle w:val="oancuaDanhsach"/>
         <w:numPr>
           <w:ilvl w:val="0"/>
           <w:numId w:val="1"/>
@@ -355,12 +359,13 @@
       <w:r>
         <w:rPr>
           <w:rFonts w:ascii="Times New Roman" w:hAnsi="Times New Roman" w:cs="Times New Roman"/>
+          <w:noProof/>
           <w:sz w:val="28"/>
           <w:szCs w:val="28"/>
         </w:rPr>
         <w:lastRenderedPageBreak/>
         <w:drawing>
-          <wp:inline distT="0" distB="0" distL="0" distR="0" wp14:anchorId="3DBCBDCC" wp14:editId="3B34DE5B">
+          <wp:inline distT="0" distB="0" distL="0" distR="0" wp14:anchorId="628A3230" wp14:editId="6AB44E60">
             <wp:extent cx="5943600" cy="3343275"/>
             <wp:effectExtent l="0" t="0" r="0" b="9525"/>
             <wp:docPr id="5" name="Picture 5"/>
@@ -398,7 +403,7 @@
     </w:p>
     <w:p>
       <w:pPr>
-        <w:pStyle w:val="ListParagraph"/>
+        <w:pStyle w:val="oancuaDanhsach"/>
         <w:numPr>
           <w:ilvl w:val="0"/>
           <w:numId w:val="1"/>
@@ -429,11 +434,12 @@
       <w:r>
         <w:rPr>
           <w:rFonts w:ascii="Times New Roman" w:hAnsi="Times New Roman" w:cs="Times New Roman"/>
+          <w:noProof/>
           <w:sz w:val="28"/>
           <w:szCs w:val="28"/>
         </w:rPr>
         <w:drawing>
-          <wp:inline distT="0" distB="0" distL="0" distR="0" wp14:anchorId="72607B40" wp14:editId="4BEED696">
+          <wp:inline distT="0" distB="0" distL="0" distR="0" wp14:anchorId="222FAB25" wp14:editId="19C55DFF">
             <wp:extent cx="5943600" cy="3343275"/>
             <wp:effectExtent l="0" t="0" r="0" b="9525"/>
             <wp:docPr id="6" name="Picture 6"/>
@@ -471,7 +477,7 @@
     </w:p>
     <w:p>
       <w:pPr>
-        <w:pStyle w:val="ListParagraph"/>
+        <w:pStyle w:val="oancuaDanhsach"/>
         <w:numPr>
           <w:ilvl w:val="0"/>
           <w:numId w:val="1"/>
@@ -502,12 +508,13 @@
       <w:r>
         <w:rPr>
           <w:rFonts w:ascii="Times New Roman" w:hAnsi="Times New Roman" w:cs="Times New Roman"/>
+          <w:noProof/>
           <w:sz w:val="28"/>
           <w:szCs w:val="28"/>
         </w:rPr>
         <w:lastRenderedPageBreak/>
         <w:drawing>
-          <wp:inline distT="0" distB="0" distL="0" distR="0" wp14:anchorId="375A0427" wp14:editId="10F748C2">
+          <wp:inline distT="0" distB="0" distL="0" distR="0" wp14:anchorId="43B3B1EA" wp14:editId="5FBD3346">
             <wp:extent cx="5943600" cy="3343275"/>
             <wp:effectExtent l="0" t="0" r="0" b="9525"/>
             <wp:docPr id="7" name="Picture 7"/>
@@ -545,7 +552,7 @@
     </w:p>
     <w:p>
       <w:pPr>
-        <w:pStyle w:val="ListParagraph"/>
+        <w:pStyle w:val="oancuaDanhsach"/>
         <w:numPr>
           <w:ilvl w:val="0"/>
           <w:numId w:val="1"/>
@@ -576,11 +583,12 @@
       <w:r>
         <w:rPr>
           <w:rFonts w:ascii="Times New Roman" w:hAnsi="Times New Roman" w:cs="Times New Roman"/>
+          <w:noProof/>
           <w:sz w:val="28"/>
           <w:szCs w:val="28"/>
         </w:rPr>
         <w:drawing>
-          <wp:inline distT="0" distB="0" distL="0" distR="0" wp14:anchorId="77B15F33" wp14:editId="29EA78C1">
+          <wp:inline distT="0" distB="0" distL="0" distR="0" wp14:anchorId="7864F964" wp14:editId="54C05FEC">
             <wp:extent cx="5943600" cy="3343275"/>
             <wp:effectExtent l="0" t="0" r="0" b="9525"/>
             <wp:docPr id="8" name="Picture 8"/>
@@ -618,7 +626,7 @@
     </w:p>
     <w:p>
       <w:pPr>
-        <w:pStyle w:val="ListParagraph"/>
+        <w:pStyle w:val="oancuaDanhsach"/>
         <w:numPr>
           <w:ilvl w:val="0"/>
           <w:numId w:val="1"/>
@@ -649,12 +657,13 @@
       <w:r>
         <w:rPr>
           <w:rFonts w:ascii="Times New Roman" w:hAnsi="Times New Roman" w:cs="Times New Roman"/>
+          <w:noProof/>
           <w:sz w:val="28"/>
           <w:szCs w:val="28"/>
         </w:rPr>
         <w:lastRenderedPageBreak/>
         <w:drawing>
-          <wp:inline distT="0" distB="0" distL="0" distR="0" wp14:anchorId="30C00DF2" wp14:editId="40242939">
+          <wp:inline distT="0" distB="0" distL="0" distR="0" wp14:anchorId="732CBE78" wp14:editId="1693E45A">
             <wp:extent cx="5943600" cy="3343275"/>
             <wp:effectExtent l="0" t="0" r="0" b="9525"/>
             <wp:docPr id="10" name="Picture 10"/>
@@ -700,7 +709,7 @@
     </w:p>
     <w:p>
       <w:pPr>
-        <w:pStyle w:val="ListParagraph"/>
+        <w:pStyle w:val="oancuaDanhsach"/>
         <w:numPr>
           <w:ilvl w:val="0"/>
           <w:numId w:val="1"/>
@@ -731,11 +740,12 @@
       <w:r>
         <w:rPr>
           <w:rFonts w:ascii="Times New Roman" w:hAnsi="Times New Roman" w:cs="Times New Roman"/>
+          <w:noProof/>
           <w:sz w:val="28"/>
           <w:szCs w:val="28"/>
         </w:rPr>
         <w:drawing>
-          <wp:inline distT="0" distB="0" distL="0" distR="0" wp14:anchorId="69AC9BE2" wp14:editId="2F32D238">
+          <wp:inline distT="0" distB="0" distL="0" distR="0" wp14:anchorId="42AC13C2" wp14:editId="5E7EC2C1">
             <wp:extent cx="5943600" cy="3343275"/>
             <wp:effectExtent l="0" t="0" r="0" b="9525"/>
             <wp:docPr id="11" name="Picture 11"/>
@@ -773,7 +783,7 @@
     </w:p>
     <w:p>
       <w:pPr>
-        <w:pStyle w:val="ListParagraph"/>
+        <w:pStyle w:val="oancuaDanhsach"/>
         <w:numPr>
           <w:ilvl w:val="0"/>
           <w:numId w:val="1"/>
@@ -804,12 +814,13 @@
       <w:r>
         <w:rPr>
           <w:rFonts w:ascii="Times New Roman" w:hAnsi="Times New Roman" w:cs="Times New Roman"/>
+          <w:noProof/>
           <w:sz w:val="28"/>
           <w:szCs w:val="28"/>
         </w:rPr>
         <w:lastRenderedPageBreak/>
         <w:drawing>
-          <wp:inline distT="0" distB="0" distL="0" distR="0" wp14:anchorId="1F2B4EEE" wp14:editId="66F335A1">
+          <wp:inline distT="0" distB="0" distL="0" distR="0" wp14:anchorId="400258AE" wp14:editId="3510DAA3">
             <wp:extent cx="5943600" cy="3343275"/>
             <wp:effectExtent l="0" t="0" r="0" b="9525"/>
             <wp:docPr id="12" name="Picture 12"/>
@@ -847,7 +858,7 @@
     </w:p>
     <w:p>
       <w:pPr>
-        <w:pStyle w:val="ListParagraph"/>
+        <w:pStyle w:val="oancuaDanhsach"/>
         <w:numPr>
           <w:ilvl w:val="0"/>
           <w:numId w:val="1"/>
@@ -878,11 +889,12 @@
       <w:r>
         <w:rPr>
           <w:rFonts w:ascii="Times New Roman" w:hAnsi="Times New Roman" w:cs="Times New Roman"/>
+          <w:noProof/>
           <w:sz w:val="28"/>
           <w:szCs w:val="28"/>
         </w:rPr>
         <w:drawing>
-          <wp:inline distT="0" distB="0" distL="0" distR="0" wp14:anchorId="55003873" wp14:editId="1F5C6805">
+          <wp:inline distT="0" distB="0" distL="0" distR="0" wp14:anchorId="62A0675E" wp14:editId="3EAA7E47">
             <wp:extent cx="5943600" cy="3343275"/>
             <wp:effectExtent l="0" t="0" r="0" b="9525"/>
             <wp:docPr id="13" name="Picture 13"/>
@@ -920,7 +932,7 @@
     </w:p>
     <w:p>
       <w:pPr>
-        <w:pStyle w:val="ListParagraph"/>
+        <w:pStyle w:val="oancuaDanhsach"/>
         <w:numPr>
           <w:ilvl w:val="0"/>
           <w:numId w:val="1"/>
@@ -951,12 +963,13 @@
       <w:r>
         <w:rPr>
           <w:rFonts w:ascii="Times New Roman" w:hAnsi="Times New Roman" w:cs="Times New Roman"/>
+          <w:noProof/>
           <w:sz w:val="28"/>
           <w:szCs w:val="28"/>
         </w:rPr>
         <w:lastRenderedPageBreak/>
         <w:drawing>
-          <wp:inline distT="0" distB="0" distL="0" distR="0" wp14:anchorId="7A5075E0" wp14:editId="5679AC16">
+          <wp:inline distT="0" distB="0" distL="0" distR="0" wp14:anchorId="2DBB50AC" wp14:editId="06129906">
             <wp:extent cx="5943600" cy="3343275"/>
             <wp:effectExtent l="0" t="0" r="0" b="9525"/>
             <wp:docPr id="14" name="Picture 14"/>
@@ -994,7 +1007,7 @@
     </w:p>
     <w:p>
       <w:pPr>
-        <w:pStyle w:val="ListParagraph"/>
+        <w:pStyle w:val="oancuaDanhsach"/>
         <w:numPr>
           <w:ilvl w:val="0"/>
           <w:numId w:val="1"/>
@@ -1025,11 +1038,12 @@
       <w:r>
         <w:rPr>
           <w:rFonts w:ascii="Times New Roman" w:hAnsi="Times New Roman" w:cs="Times New Roman"/>
+          <w:noProof/>
           <w:sz w:val="28"/>
           <w:szCs w:val="28"/>
         </w:rPr>
         <w:drawing>
-          <wp:inline distT="0" distB="0" distL="0" distR="0" wp14:anchorId="1F197CF3" wp14:editId="52D54104">
+          <wp:inline distT="0" distB="0" distL="0" distR="0" wp14:anchorId="12853A0C" wp14:editId="1C10A10C">
             <wp:extent cx="5943600" cy="3343275"/>
             <wp:effectExtent l="0" t="0" r="0" b="9525"/>
             <wp:docPr id="15" name="Picture 15"/>
@@ -1067,7 +1081,7 @@
     </w:p>
     <w:p>
       <w:pPr>
-        <w:pStyle w:val="ListParagraph"/>
+        <w:pStyle w:val="oancuaDanhsach"/>
         <w:numPr>
           <w:ilvl w:val="0"/>
           <w:numId w:val="1"/>
@@ -1098,12 +1112,13 @@
       <w:r>
         <w:rPr>
           <w:rFonts w:ascii="Times New Roman" w:hAnsi="Times New Roman" w:cs="Times New Roman"/>
+          <w:noProof/>
           <w:sz w:val="28"/>
           <w:szCs w:val="28"/>
         </w:rPr>
         <w:lastRenderedPageBreak/>
         <w:drawing>
-          <wp:inline distT="0" distB="0" distL="0" distR="0" wp14:anchorId="4AFA7C25" wp14:editId="3A4C5C38">
+          <wp:inline distT="0" distB="0" distL="0" distR="0" wp14:anchorId="44FF1629" wp14:editId="090203B5">
             <wp:extent cx="5943600" cy="3343275"/>
             <wp:effectExtent l="0" t="0" r="0" b="9525"/>
             <wp:docPr id="16" name="Picture 16"/>
@@ -1141,7 +1156,7 @@
     </w:p>
     <w:p>
       <w:pPr>
-        <w:pStyle w:val="ListParagraph"/>
+        <w:pStyle w:val="oancuaDanhsach"/>
         <w:numPr>
           <w:ilvl w:val="0"/>
           <w:numId w:val="1"/>
@@ -1180,11 +1195,12 @@
       <w:r>
         <w:rPr>
           <w:rFonts w:ascii="Times New Roman" w:hAnsi="Times New Roman" w:cs="Times New Roman"/>
+          <w:noProof/>
           <w:sz w:val="28"/>
           <w:szCs w:val="28"/>
         </w:rPr>
         <w:drawing>
-          <wp:inline distT="0" distB="0" distL="0" distR="0" wp14:anchorId="42F20B6E" wp14:editId="7328630C">
+          <wp:inline distT="0" distB="0" distL="0" distR="0" wp14:anchorId="2D54DDF1" wp14:editId="2BD34051">
             <wp:extent cx="5943600" cy="3343275"/>
             <wp:effectExtent l="0" t="0" r="0" b="9525"/>
             <wp:docPr id="17" name="Picture 17"/>
@@ -1222,7 +1238,7 @@
     </w:p>
     <w:p>
       <w:pPr>
-        <w:pStyle w:val="ListParagraph"/>
+        <w:pStyle w:val="oancuaDanhsach"/>
         <w:numPr>
           <w:ilvl w:val="0"/>
           <w:numId w:val="1"/>
@@ -1253,12 +1269,13 @@
       <w:r>
         <w:rPr>
           <w:rFonts w:ascii="Times New Roman" w:hAnsi="Times New Roman" w:cs="Times New Roman"/>
+          <w:noProof/>
           <w:sz w:val="28"/>
           <w:szCs w:val="28"/>
         </w:rPr>
         <w:lastRenderedPageBreak/>
         <w:drawing>
-          <wp:inline distT="0" distB="0" distL="0" distR="0" wp14:anchorId="45C41545" wp14:editId="4F4B6F1A">
+          <wp:inline distT="0" distB="0" distL="0" distR="0" wp14:anchorId="62572E21" wp14:editId="45918580">
             <wp:extent cx="5943600" cy="3343275"/>
             <wp:effectExtent l="0" t="0" r="0" b="9525"/>
             <wp:docPr id="18" name="Picture 18"/>
@@ -1296,7 +1313,7 @@
     </w:p>
     <w:p>
       <w:pPr>
-        <w:pStyle w:val="ListParagraph"/>
+        <w:pStyle w:val="oancuaDanhsach"/>
         <w:numPr>
           <w:ilvl w:val="0"/>
           <w:numId w:val="1"/>
@@ -1327,11 +1344,12 @@
       <w:r>
         <w:rPr>
           <w:rFonts w:ascii="Times New Roman" w:hAnsi="Times New Roman" w:cs="Times New Roman"/>
+          <w:noProof/>
           <w:sz w:val="28"/>
           <w:szCs w:val="28"/>
         </w:rPr>
         <w:drawing>
-          <wp:inline distT="0" distB="0" distL="0" distR="0" wp14:anchorId="490D8F84" wp14:editId="496D7C6A">
+          <wp:inline distT="0" distB="0" distL="0" distR="0" wp14:anchorId="7ABB4D59" wp14:editId="7E9344F7">
             <wp:extent cx="5943600" cy="3343275"/>
             <wp:effectExtent l="0" t="0" r="0" b="9525"/>
             <wp:docPr id="19" name="Picture 19"/>
@@ -1369,7 +1387,7 @@
     </w:p>
     <w:p>
       <w:pPr>
-        <w:pStyle w:val="ListParagraph"/>
+        <w:pStyle w:val="oancuaDanhsach"/>
         <w:numPr>
           <w:ilvl w:val="0"/>
           <w:numId w:val="1"/>
@@ -1400,12 +1418,13 @@
       <w:r>
         <w:rPr>
           <w:rFonts w:ascii="Times New Roman" w:hAnsi="Times New Roman" w:cs="Times New Roman"/>
+          <w:noProof/>
           <w:sz w:val="28"/>
           <w:szCs w:val="28"/>
         </w:rPr>
         <w:lastRenderedPageBreak/>
         <w:drawing>
-          <wp:inline distT="0" distB="0" distL="0" distR="0" wp14:anchorId="02DDAAF0" wp14:editId="3B6E2D7A">
+          <wp:inline distT="0" distB="0" distL="0" distR="0" wp14:anchorId="72C9BED3" wp14:editId="40AA91AC">
             <wp:extent cx="5943600" cy="3343275"/>
             <wp:effectExtent l="0" t="0" r="0" b="9525"/>
             <wp:docPr id="20" name="Picture 20"/>
@@ -1443,7 +1462,7 @@
     </w:p>
     <w:p>
       <w:pPr>
-        <w:pStyle w:val="ListParagraph"/>
+        <w:pStyle w:val="oancuaDanhsach"/>
         <w:numPr>
           <w:ilvl w:val="0"/>
           <w:numId w:val="1"/>
@@ -1474,11 +1493,12 @@
       <w:r>
         <w:rPr>
           <w:rFonts w:ascii="Times New Roman" w:hAnsi="Times New Roman" w:cs="Times New Roman"/>
+          <w:noProof/>
           <w:sz w:val="28"/>
           <w:szCs w:val="28"/>
         </w:rPr>
         <w:drawing>
-          <wp:inline distT="0" distB="0" distL="0" distR="0" wp14:anchorId="5F044D92" wp14:editId="3FEA7A18">
+          <wp:inline distT="0" distB="0" distL="0" distR="0" wp14:anchorId="6AA35869" wp14:editId="1783A7B0">
             <wp:extent cx="5943600" cy="3343275"/>
             <wp:effectExtent l="0" t="0" r="0" b="9525"/>
             <wp:docPr id="21" name="Picture 21"/>
@@ -1516,7 +1536,7 @@
     </w:p>
     <w:p>
       <w:pPr>
-        <w:pStyle w:val="ListParagraph"/>
+        <w:pStyle w:val="oancuaDanhsach"/>
         <w:numPr>
           <w:ilvl w:val="0"/>
           <w:numId w:val="1"/>
@@ -1555,12 +1575,13 @@
       <w:r>
         <w:rPr>
           <w:rFonts w:ascii="Times New Roman" w:hAnsi="Times New Roman" w:cs="Times New Roman"/>
+          <w:noProof/>
           <w:sz w:val="28"/>
           <w:szCs w:val="28"/>
         </w:rPr>
         <w:lastRenderedPageBreak/>
         <w:drawing>
-          <wp:inline distT="0" distB="0" distL="0" distR="0" wp14:anchorId="2F55A9CD" wp14:editId="5FC52E4D">
+          <wp:inline distT="0" distB="0" distL="0" distR="0" wp14:anchorId="30C4C1DC" wp14:editId="074DF43C">
             <wp:extent cx="5943600" cy="3343275"/>
             <wp:effectExtent l="0" t="0" r="0" b="9525"/>
             <wp:docPr id="22" name="Picture 22"/>
@@ -1598,7 +1619,7 @@
     </w:p>
     <w:p>
       <w:pPr>
-        <w:pStyle w:val="ListParagraph"/>
+        <w:pStyle w:val="oancuaDanhsach"/>
         <w:numPr>
           <w:ilvl w:val="0"/>
           <w:numId w:val="1"/>
@@ -1629,11 +1650,12 @@
       <w:r>
         <w:rPr>
           <w:rFonts w:ascii="Times New Roman" w:hAnsi="Times New Roman" w:cs="Times New Roman"/>
+          <w:noProof/>
           <w:sz w:val="28"/>
           <w:szCs w:val="28"/>
         </w:rPr>
         <w:drawing>
-          <wp:inline distT="0" distB="0" distL="0" distR="0" wp14:anchorId="5779D15B" wp14:editId="5FAC759B">
+          <wp:inline distT="0" distB="0" distL="0" distR="0" wp14:anchorId="549F5712" wp14:editId="7FDC2CFE">
             <wp:extent cx="5943600" cy="3343275"/>
             <wp:effectExtent l="0" t="0" r="0" b="9525"/>
             <wp:docPr id="23" name="Picture 23"/>
@@ -1671,7 +1693,7 @@
     </w:p>
     <w:p>
       <w:pPr>
-        <w:pStyle w:val="ListParagraph"/>
+        <w:pStyle w:val="oancuaDanhsach"/>
         <w:numPr>
           <w:ilvl w:val="0"/>
           <w:numId w:val="1"/>
@@ -1702,12 +1724,13 @@
       <w:r>
         <w:rPr>
           <w:rFonts w:ascii="Times New Roman" w:hAnsi="Times New Roman" w:cs="Times New Roman"/>
+          <w:noProof/>
           <w:sz w:val="28"/>
           <w:szCs w:val="28"/>
         </w:rPr>
         <w:lastRenderedPageBreak/>
         <w:drawing>
-          <wp:inline distT="0" distB="0" distL="0" distR="0" wp14:anchorId="1A006C7D" wp14:editId="2CF94E9C">
+          <wp:inline distT="0" distB="0" distL="0" distR="0" wp14:anchorId="3CB71C36" wp14:editId="57C21AE8">
             <wp:extent cx="5943600" cy="3343275"/>
             <wp:effectExtent l="0" t="0" r="0" b="9525"/>
             <wp:docPr id="24" name="Picture 24"/>
@@ -1745,7 +1768,7 @@
     </w:p>
     <w:p>
       <w:pPr>
-        <w:pStyle w:val="ListParagraph"/>
+        <w:pStyle w:val="oancuaDanhsach"/>
         <w:numPr>
           <w:ilvl w:val="0"/>
           <w:numId w:val="1"/>
@@ -1776,11 +1799,12 @@
       <w:r>
         <w:rPr>
           <w:rFonts w:ascii="Times New Roman" w:hAnsi="Times New Roman" w:cs="Times New Roman"/>
+          <w:noProof/>
           <w:sz w:val="28"/>
           <w:szCs w:val="28"/>
         </w:rPr>
         <w:drawing>
-          <wp:inline distT="0" distB="0" distL="0" distR="0" wp14:anchorId="1F060B10" wp14:editId="680FF19D">
+          <wp:inline distT="0" distB="0" distL="0" distR="0" wp14:anchorId="4C8F2793" wp14:editId="2AEDFE75">
             <wp:extent cx="5943600" cy="3343275"/>
             <wp:effectExtent l="0" t="0" r="0" b="9525"/>
             <wp:docPr id="26" name="Picture 26"/>
@@ -1818,7 +1842,7 @@
     </w:p>
     <w:p>
       <w:pPr>
-        <w:pStyle w:val="ListParagraph"/>
+        <w:pStyle w:val="oancuaDanhsach"/>
         <w:numPr>
           <w:ilvl w:val="0"/>
           <w:numId w:val="1"/>
@@ -1849,12 +1873,13 @@
       <w:r>
         <w:rPr>
           <w:rFonts w:ascii="Times New Roman" w:hAnsi="Times New Roman" w:cs="Times New Roman"/>
+          <w:noProof/>
           <w:sz w:val="28"/>
           <w:szCs w:val="28"/>
         </w:rPr>
         <w:lastRenderedPageBreak/>
         <w:drawing>
-          <wp:inline distT="0" distB="0" distL="0" distR="0" wp14:anchorId="63587365" wp14:editId="57A3ECE8">
+          <wp:inline distT="0" distB="0" distL="0" distR="0" wp14:anchorId="07478FFF" wp14:editId="5F6BD3AB">
             <wp:extent cx="5943600" cy="3343275"/>
             <wp:effectExtent l="0" t="0" r="0" b="9525"/>
             <wp:docPr id="27" name="Picture 27"/>
@@ -1892,7 +1917,7 @@
     </w:p>
     <w:p>
       <w:pPr>
-        <w:pStyle w:val="ListParagraph"/>
+        <w:pStyle w:val="oancuaDanhsach"/>
         <w:numPr>
           <w:ilvl w:val="0"/>
           <w:numId w:val="1"/>
@@ -1923,11 +1948,12 @@
       <w:r>
         <w:rPr>
           <w:rFonts w:ascii="Times New Roman" w:hAnsi="Times New Roman" w:cs="Times New Roman"/>
+          <w:noProof/>
           <w:sz w:val="28"/>
           <w:szCs w:val="28"/>
         </w:rPr>
         <w:drawing>
-          <wp:inline distT="0" distB="0" distL="0" distR="0" wp14:anchorId="034767FA" wp14:editId="65F54005">
+          <wp:inline distT="0" distB="0" distL="0" distR="0" wp14:anchorId="46A44381" wp14:editId="26BE736C">
             <wp:extent cx="5943600" cy="3343275"/>
             <wp:effectExtent l="0" t="0" r="0" b="9525"/>
             <wp:docPr id="28" name="Picture 28"/>
@@ -1965,7 +1991,7 @@
     </w:p>
     <w:p>
       <w:pPr>
-        <w:pStyle w:val="ListParagraph"/>
+        <w:pStyle w:val="oancuaDanhsach"/>
         <w:numPr>
           <w:ilvl w:val="0"/>
           <w:numId w:val="1"/>
@@ -1996,12 +2022,13 @@
       <w:r>
         <w:rPr>
           <w:rFonts w:ascii="Times New Roman" w:hAnsi="Times New Roman" w:cs="Times New Roman"/>
+          <w:noProof/>
           <w:sz w:val="28"/>
           <w:szCs w:val="28"/>
         </w:rPr>
         <w:lastRenderedPageBreak/>
         <w:drawing>
-          <wp:inline distT="0" distB="0" distL="0" distR="0" wp14:anchorId="6E254A8F" wp14:editId="215D213E">
+          <wp:inline distT="0" distB="0" distL="0" distR="0" wp14:anchorId="735EBB9D" wp14:editId="14507DE2">
             <wp:extent cx="5943600" cy="3343275"/>
             <wp:effectExtent l="0" t="0" r="0" b="9525"/>
             <wp:docPr id="29" name="Picture 29"/>
@@ -2039,7 +2066,7 @@
     </w:p>
     <w:p>
       <w:pPr>
-        <w:pStyle w:val="ListParagraph"/>
+        <w:pStyle w:val="oancuaDanhsach"/>
         <w:numPr>
           <w:ilvl w:val="0"/>
           <w:numId w:val="1"/>
@@ -2070,11 +2097,12 @@
       <w:r>
         <w:rPr>
           <w:rFonts w:ascii="Times New Roman" w:hAnsi="Times New Roman" w:cs="Times New Roman"/>
+          <w:noProof/>
           <w:sz w:val="28"/>
           <w:szCs w:val="28"/>
         </w:rPr>
         <w:drawing>
-          <wp:inline distT="0" distB="0" distL="0" distR="0" wp14:anchorId="4809CD8F" wp14:editId="628423BF">
+          <wp:inline distT="0" distB="0" distL="0" distR="0" wp14:anchorId="6EFA06B7" wp14:editId="08E07C7E">
             <wp:extent cx="5943600" cy="3343275"/>
             <wp:effectExtent l="0" t="0" r="0" b="9525"/>
             <wp:docPr id="30" name="Picture 30"/>
@@ -2112,7 +2140,7 @@
     </w:p>
     <w:p>
       <w:pPr>
-        <w:pStyle w:val="ListParagraph"/>
+        <w:pStyle w:val="oancuaDanhsach"/>
         <w:numPr>
           <w:ilvl w:val="0"/>
           <w:numId w:val="1"/>
@@ -2143,12 +2171,13 @@
       <w:r>
         <w:rPr>
           <w:rFonts w:ascii="Times New Roman" w:hAnsi="Times New Roman" w:cs="Times New Roman"/>
+          <w:noProof/>
           <w:sz w:val="28"/>
           <w:szCs w:val="28"/>
         </w:rPr>
         <w:lastRenderedPageBreak/>
         <w:drawing>
-          <wp:inline distT="0" distB="0" distL="0" distR="0" wp14:anchorId="05EC0249" wp14:editId="04C37A2D">
+          <wp:inline distT="0" distB="0" distL="0" distR="0" wp14:anchorId="2714915E" wp14:editId="5B198156">
             <wp:extent cx="5943600" cy="3343275"/>
             <wp:effectExtent l="0" t="0" r="0" b="9525"/>
             <wp:docPr id="33" name="Picture 33"/>
@@ -2183,8 +2212,6 @@
           </wp:inline>
         </w:drawing>
       </w:r>
-      <w:bookmarkStart w:id="0" w:name="_GoBack"/>
-      <w:bookmarkEnd w:id="0"/>
     </w:p>
     <w:p>
       <w:pPr>
@@ -2198,7 +2225,7 @@
     </w:p>
     <w:p>
       <w:pPr>
-        <w:pStyle w:val="ListParagraph"/>
+        <w:pStyle w:val="oancuaDanhsach"/>
         <w:numPr>
           <w:ilvl w:val="0"/>
           <w:numId w:val="1"/>
@@ -2229,11 +2256,12 @@
       <w:r>
         <w:rPr>
           <w:rFonts w:ascii="Times New Roman" w:hAnsi="Times New Roman" w:cs="Times New Roman"/>
+          <w:noProof/>
           <w:sz w:val="28"/>
           <w:szCs w:val="28"/>
         </w:rPr>
         <w:drawing>
-          <wp:inline distT="0" distB="0" distL="0" distR="0" wp14:anchorId="455A6EE6" wp14:editId="4F433EDC">
+          <wp:inline distT="0" distB="0" distL="0" distR="0" wp14:anchorId="7C83B74D" wp14:editId="641BF6DD">
             <wp:extent cx="5943600" cy="3343275"/>
             <wp:effectExtent l="0" t="0" r="0" b="9525"/>
             <wp:docPr id="31" name="Picture 31"/>
@@ -2271,7 +2299,7 @@
     </w:p>
     <w:p>
       <w:pPr>
-        <w:pStyle w:val="ListParagraph"/>
+        <w:pStyle w:val="oancuaDanhsach"/>
         <w:numPr>
           <w:ilvl w:val="0"/>
           <w:numId w:val="1"/>
@@ -2302,12 +2330,13 @@
       <w:r>
         <w:rPr>
           <w:rFonts w:ascii="Times New Roman" w:hAnsi="Times New Roman" w:cs="Times New Roman"/>
+          <w:noProof/>
           <w:sz w:val="28"/>
           <w:szCs w:val="28"/>
         </w:rPr>
         <w:lastRenderedPageBreak/>
         <w:drawing>
-          <wp:inline distT="0" distB="0" distL="0" distR="0" wp14:anchorId="1561A65C" wp14:editId="4DC749D6">
+          <wp:inline distT="0" distB="0" distL="0" distR="0" wp14:anchorId="1FDA59B9" wp14:editId="16B0D518">
             <wp:extent cx="5943600" cy="3343275"/>
             <wp:effectExtent l="0" t="0" r="0" b="9525"/>
             <wp:docPr id="32" name="Picture 32"/>
@@ -2351,6 +2380,506 @@
           <w:szCs w:val="28"/>
         </w:rPr>
       </w:pPr>
+      <w:r>
+        <w:rPr>
+          <w:rFonts w:ascii="Times New Roman" w:hAnsi="Times New Roman" w:cs="Times New Roman"/>
+          <w:sz w:val="28"/>
+          <w:szCs w:val="28"/>
+        </w:rPr>
+        <w:t>Phần 2:</w:t>
+      </w:r>
+    </w:p>
+    <w:p>
+      <w:pPr>
+        <w:rPr>
+          <w:rFonts w:ascii="Times New Roman" w:hAnsi="Times New Roman" w:cs="Times New Roman"/>
+          <w:sz w:val="28"/>
+          <w:szCs w:val="28"/>
+        </w:rPr>
+      </w:pPr>
+      <w:r>
+        <w:rPr>
+          <w:rFonts w:ascii="Times New Roman" w:hAnsi="Times New Roman" w:cs="Times New Roman"/>
+          <w:sz w:val="28"/>
+          <w:szCs w:val="28"/>
+        </w:rPr>
+        <w:t>Bài 1:</w:t>
+      </w:r>
+    </w:p>
+    <w:p>
+      <w:pPr>
+        <w:pStyle w:val="oancuaDanhsach"/>
+        <w:numPr>
+          <w:ilvl w:val="0"/>
+          <w:numId w:val="2"/>
+        </w:numPr>
+        <w:rPr>
+          <w:rFonts w:ascii="Times New Roman" w:hAnsi="Times New Roman" w:cs="Times New Roman"/>
+          <w:sz w:val="28"/>
+          <w:szCs w:val="28"/>
+        </w:rPr>
+      </w:pPr>
+      <w:r>
+        <w:rPr>
+          <w:rFonts w:ascii="Times New Roman" w:hAnsi="Times New Roman" w:cs="Times New Roman"/>
+          <w:sz w:val="28"/>
+          <w:szCs w:val="28"/>
+        </w:rPr>
+        <w:t>Docker build and run</w:t>
+      </w:r>
+    </w:p>
+    <w:p>
+      <w:pPr>
+        <w:rPr>
+          <w:rFonts w:ascii="Times New Roman" w:hAnsi="Times New Roman" w:cs="Times New Roman"/>
+          <w:sz w:val="28"/>
+          <w:szCs w:val="28"/>
+        </w:rPr>
+      </w:pPr>
+      <w:r>
+        <w:rPr>
+          <w:rFonts w:ascii="Times New Roman" w:hAnsi="Times New Roman" w:cs="Times New Roman"/>
+          <w:sz w:val="28"/>
+          <w:szCs w:val="28"/>
+        </w:rPr>
+        <w:drawing>
+          <wp:inline distT="0" distB="0" distL="0" distR="0" wp14:anchorId="64795DB3" wp14:editId="0FA43D12">
+            <wp:extent cx="5943600" cy="3333115"/>
+            <wp:effectExtent l="0" t="0" r="0" b="635"/>
+            <wp:docPr id="25" name="Hình ảnh 25"/>
+            <wp:cNvGraphicFramePr>
+              <a:graphicFrameLocks xmlns:a="http://schemas.openxmlformats.org/drawingml/2006/main" noChangeAspect="1"/>
+            </wp:cNvGraphicFramePr>
+            <a:graphic xmlns:a="http://schemas.openxmlformats.org/drawingml/2006/main">
+              <a:graphicData uri="http://schemas.openxmlformats.org/drawingml/2006/picture">
+                <pic:pic xmlns:pic="http://schemas.openxmlformats.org/drawingml/2006/picture">
+                  <pic:nvPicPr>
+                    <pic:cNvPr id="1" name=""/>
+                    <pic:cNvPicPr/>
+                  </pic:nvPicPr>
+                  <pic:blipFill>
+                    <a:blip r:embed="rId36"/>
+                    <a:stretch>
+                      <a:fillRect/>
+                    </a:stretch>
+                  </pic:blipFill>
+                  <pic:spPr>
+                    <a:xfrm>
+                      <a:off x="0" y="0"/>
+                      <a:ext cx="5943600" cy="3333115"/>
+                    </a:xfrm>
+                    <a:prstGeom prst="rect">
+                      <a:avLst/>
+                    </a:prstGeom>
+                  </pic:spPr>
+                </pic:pic>
+              </a:graphicData>
+            </a:graphic>
+          </wp:inline>
+        </w:drawing>
+      </w:r>
+    </w:p>
+    <w:p>
+      <w:pPr>
+        <w:rPr>
+          <w:rFonts w:ascii="Times New Roman" w:hAnsi="Times New Roman" w:cs="Times New Roman"/>
+          <w:sz w:val="28"/>
+          <w:szCs w:val="28"/>
+        </w:rPr>
+      </w:pPr>
+      <w:r>
+        <w:rPr>
+          <w:rFonts w:ascii="Times New Roman" w:hAnsi="Times New Roman" w:cs="Times New Roman"/>
+          <w:sz w:val="28"/>
+          <w:szCs w:val="28"/>
+        </w:rPr>
+        <w:lastRenderedPageBreak/>
+        <w:drawing>
+          <wp:inline distT="0" distB="0" distL="0" distR="0" wp14:anchorId="6A72B76C" wp14:editId="781F0877">
+            <wp:extent cx="5943600" cy="3344545"/>
+            <wp:effectExtent l="0" t="0" r="0" b="8255"/>
+            <wp:docPr id="34" name="Hình ảnh 34"/>
+            <wp:cNvGraphicFramePr>
+              <a:graphicFrameLocks xmlns:a="http://schemas.openxmlformats.org/drawingml/2006/main" noChangeAspect="1"/>
+            </wp:cNvGraphicFramePr>
+            <a:graphic xmlns:a="http://schemas.openxmlformats.org/drawingml/2006/main">
+              <a:graphicData uri="http://schemas.openxmlformats.org/drawingml/2006/picture">
+                <pic:pic xmlns:pic="http://schemas.openxmlformats.org/drawingml/2006/picture">
+                  <pic:nvPicPr>
+                    <pic:cNvPr id="1" name=""/>
+                    <pic:cNvPicPr/>
+                  </pic:nvPicPr>
+                  <pic:blipFill>
+                    <a:blip r:embed="rId37"/>
+                    <a:stretch>
+                      <a:fillRect/>
+                    </a:stretch>
+                  </pic:blipFill>
+                  <pic:spPr>
+                    <a:xfrm>
+                      <a:off x="0" y="0"/>
+                      <a:ext cx="5943600" cy="3344545"/>
+                    </a:xfrm>
+                    <a:prstGeom prst="rect">
+                      <a:avLst/>
+                    </a:prstGeom>
+                  </pic:spPr>
+                </pic:pic>
+              </a:graphicData>
+            </a:graphic>
+          </wp:inline>
+        </w:drawing>
+      </w:r>
+    </w:p>
+    <w:p>
+      <w:pPr>
+        <w:rPr>
+          <w:rFonts w:ascii="Times New Roman" w:hAnsi="Times New Roman" w:cs="Times New Roman"/>
+          <w:sz w:val="28"/>
+          <w:szCs w:val="28"/>
+        </w:rPr>
+      </w:pPr>
+      <w:r>
+        <w:rPr>
+          <w:rFonts w:ascii="Times New Roman" w:hAnsi="Times New Roman" w:cs="Times New Roman"/>
+          <w:sz w:val="28"/>
+          <w:szCs w:val="28"/>
+        </w:rPr>
+        <w:t>Bài 2:</w:t>
+      </w:r>
+    </w:p>
+    <w:p>
+      <w:pPr>
+        <w:pStyle w:val="oancuaDanhsach"/>
+        <w:numPr>
+          <w:ilvl w:val="0"/>
+          <w:numId w:val="3"/>
+        </w:numPr>
+        <w:rPr>
+          <w:rFonts w:ascii="Times New Roman" w:hAnsi="Times New Roman" w:cs="Times New Roman"/>
+          <w:sz w:val="28"/>
+          <w:szCs w:val="28"/>
+        </w:rPr>
+      </w:pPr>
+      <w:r>
+        <w:rPr>
+          <w:rFonts w:ascii="Times New Roman" w:hAnsi="Times New Roman" w:cs="Times New Roman"/>
+          <w:sz w:val="28"/>
+          <w:szCs w:val="28"/>
+        </w:rPr>
+        <w:t>Docker build and run</w:t>
+      </w:r>
+    </w:p>
+    <w:p>
+      <w:pPr>
+        <w:rPr>
+          <w:rFonts w:ascii="Times New Roman" w:hAnsi="Times New Roman" w:cs="Times New Roman"/>
+          <w:sz w:val="28"/>
+          <w:szCs w:val="28"/>
+        </w:rPr>
+      </w:pPr>
+      <w:r>
+        <w:rPr>
+          <w:rFonts w:ascii="Times New Roman" w:hAnsi="Times New Roman" w:cs="Times New Roman"/>
+          <w:sz w:val="28"/>
+          <w:szCs w:val="28"/>
+        </w:rPr>
+        <w:drawing>
+          <wp:inline distT="0" distB="0" distL="0" distR="0" wp14:anchorId="71AEBBE1" wp14:editId="2E1BBB4A">
+            <wp:extent cx="5943600" cy="3335655"/>
+            <wp:effectExtent l="0" t="0" r="0" b="0"/>
+            <wp:docPr id="35" name="Hình ảnh 35"/>
+            <wp:cNvGraphicFramePr>
+              <a:graphicFrameLocks xmlns:a="http://schemas.openxmlformats.org/drawingml/2006/main" noChangeAspect="1"/>
+            </wp:cNvGraphicFramePr>
+            <a:graphic xmlns:a="http://schemas.openxmlformats.org/drawingml/2006/main">
+              <a:graphicData uri="http://schemas.openxmlformats.org/drawingml/2006/picture">
+                <pic:pic xmlns:pic="http://schemas.openxmlformats.org/drawingml/2006/picture">
+                  <pic:nvPicPr>
+                    <pic:cNvPr id="1" name=""/>
+                    <pic:cNvPicPr/>
+                  </pic:nvPicPr>
+                  <pic:blipFill>
+                    <a:blip r:embed="rId38"/>
+                    <a:stretch>
+                      <a:fillRect/>
+                    </a:stretch>
+                  </pic:blipFill>
+                  <pic:spPr>
+                    <a:xfrm>
+                      <a:off x="0" y="0"/>
+                      <a:ext cx="5943600" cy="3335655"/>
+                    </a:xfrm>
+                    <a:prstGeom prst="rect">
+                      <a:avLst/>
+                    </a:prstGeom>
+                  </pic:spPr>
+                </pic:pic>
+              </a:graphicData>
+            </a:graphic>
+          </wp:inline>
+        </w:drawing>
+      </w:r>
+    </w:p>
+    <w:p>
+      <w:pPr>
+        <w:rPr>
+          <w:rFonts w:ascii="Times New Roman" w:hAnsi="Times New Roman" w:cs="Times New Roman"/>
+          <w:sz w:val="28"/>
+          <w:szCs w:val="28"/>
+        </w:rPr>
+      </w:pPr>
+      <w:r>
+        <w:rPr>
+          <w:rFonts w:ascii="Times New Roman" w:hAnsi="Times New Roman" w:cs="Times New Roman"/>
+          <w:sz w:val="28"/>
+          <w:szCs w:val="28"/>
+        </w:rPr>
+        <w:lastRenderedPageBreak/>
+        <w:drawing>
+          <wp:inline distT="0" distB="0" distL="0" distR="0" wp14:anchorId="3F537BEA" wp14:editId="4D37E21C">
+            <wp:extent cx="5943600" cy="3347085"/>
+            <wp:effectExtent l="0" t="0" r="0" b="5715"/>
+            <wp:docPr id="36" name="Hình ảnh 36"/>
+            <wp:cNvGraphicFramePr>
+              <a:graphicFrameLocks xmlns:a="http://schemas.openxmlformats.org/drawingml/2006/main" noChangeAspect="1"/>
+            </wp:cNvGraphicFramePr>
+            <a:graphic xmlns:a="http://schemas.openxmlformats.org/drawingml/2006/main">
+              <a:graphicData uri="http://schemas.openxmlformats.org/drawingml/2006/picture">
+                <pic:pic xmlns:pic="http://schemas.openxmlformats.org/drawingml/2006/picture">
+                  <pic:nvPicPr>
+                    <pic:cNvPr id="1" name=""/>
+                    <pic:cNvPicPr/>
+                  </pic:nvPicPr>
+                  <pic:blipFill>
+                    <a:blip r:embed="rId39"/>
+                    <a:stretch>
+                      <a:fillRect/>
+                    </a:stretch>
+                  </pic:blipFill>
+                  <pic:spPr>
+                    <a:xfrm>
+                      <a:off x="0" y="0"/>
+                      <a:ext cx="5943600" cy="3347085"/>
+                    </a:xfrm>
+                    <a:prstGeom prst="rect">
+                      <a:avLst/>
+                    </a:prstGeom>
+                  </pic:spPr>
+                </pic:pic>
+              </a:graphicData>
+            </a:graphic>
+          </wp:inline>
+        </w:drawing>
+      </w:r>
+    </w:p>
+    <w:p>
+      <w:pPr>
+        <w:rPr>
+          <w:rFonts w:ascii="Times New Roman" w:hAnsi="Times New Roman" w:cs="Times New Roman"/>
+          <w:sz w:val="28"/>
+          <w:szCs w:val="28"/>
+        </w:rPr>
+      </w:pPr>
+      <w:r>
+        <w:rPr>
+          <w:rFonts w:ascii="Times New Roman" w:hAnsi="Times New Roman" w:cs="Times New Roman"/>
+          <w:sz w:val="28"/>
+          <w:szCs w:val="28"/>
+        </w:rPr>
+        <w:t>Bài 3:</w:t>
+      </w:r>
+    </w:p>
+    <w:p>
+      <w:pPr>
+        <w:pStyle w:val="oancuaDanhsach"/>
+        <w:numPr>
+          <w:ilvl w:val="0"/>
+          <w:numId w:val="4"/>
+        </w:numPr>
+        <w:rPr>
+          <w:rFonts w:ascii="Times New Roman" w:hAnsi="Times New Roman" w:cs="Times New Roman"/>
+          <w:sz w:val="28"/>
+          <w:szCs w:val="28"/>
+        </w:rPr>
+      </w:pPr>
+      <w:r>
+        <w:rPr>
+          <w:rFonts w:ascii="Times New Roman" w:hAnsi="Times New Roman" w:cs="Times New Roman"/>
+          <w:sz w:val="28"/>
+          <w:szCs w:val="28"/>
+        </w:rPr>
+        <w:t>Docker build and run</w:t>
+      </w:r>
+    </w:p>
+    <w:p>
+      <w:pPr>
+        <w:rPr>
+          <w:rFonts w:ascii="Times New Roman" w:hAnsi="Times New Roman" w:cs="Times New Roman"/>
+          <w:sz w:val="28"/>
+          <w:szCs w:val="28"/>
+        </w:rPr>
+      </w:pPr>
+      <w:r>
+        <w:rPr>
+          <w:rFonts w:ascii="Times New Roman" w:hAnsi="Times New Roman" w:cs="Times New Roman"/>
+          <w:sz w:val="28"/>
+          <w:szCs w:val="28"/>
+        </w:rPr>
+        <w:drawing>
+          <wp:inline distT="0" distB="0" distL="0" distR="0" wp14:anchorId="2C0B4FD1" wp14:editId="293E6053">
+            <wp:extent cx="5943600" cy="3336925"/>
+            <wp:effectExtent l="0" t="0" r="0" b="0"/>
+            <wp:docPr id="37" name="Hình ảnh 37"/>
+            <wp:cNvGraphicFramePr>
+              <a:graphicFrameLocks xmlns:a="http://schemas.openxmlformats.org/drawingml/2006/main" noChangeAspect="1"/>
+            </wp:cNvGraphicFramePr>
+            <a:graphic xmlns:a="http://schemas.openxmlformats.org/drawingml/2006/main">
+              <a:graphicData uri="http://schemas.openxmlformats.org/drawingml/2006/picture">
+                <pic:pic xmlns:pic="http://schemas.openxmlformats.org/drawingml/2006/picture">
+                  <pic:nvPicPr>
+                    <pic:cNvPr id="1" name=""/>
+                    <pic:cNvPicPr/>
+                  </pic:nvPicPr>
+                  <pic:blipFill>
+                    <a:blip r:embed="rId40"/>
+                    <a:stretch>
+                      <a:fillRect/>
+                    </a:stretch>
+                  </pic:blipFill>
+                  <pic:spPr>
+                    <a:xfrm>
+                      <a:off x="0" y="0"/>
+                      <a:ext cx="5943600" cy="3336925"/>
+                    </a:xfrm>
+                    <a:prstGeom prst="rect">
+                      <a:avLst/>
+                    </a:prstGeom>
+                  </pic:spPr>
+                </pic:pic>
+              </a:graphicData>
+            </a:graphic>
+          </wp:inline>
+        </w:drawing>
+      </w:r>
+    </w:p>
+    <w:p>
+      <w:pPr>
+        <w:rPr>
+          <w:rFonts w:ascii="Times New Roman" w:hAnsi="Times New Roman" w:cs="Times New Roman"/>
+          <w:sz w:val="28"/>
+          <w:szCs w:val="28"/>
+        </w:rPr>
+      </w:pPr>
+      <w:r>
+        <w:rPr>
+          <w:rFonts w:ascii="Times New Roman" w:hAnsi="Times New Roman" w:cs="Times New Roman"/>
+          <w:sz w:val="28"/>
+          <w:szCs w:val="28"/>
+        </w:rPr>
+        <w:lastRenderedPageBreak/>
+        <w:drawing>
+          <wp:inline distT="0" distB="0" distL="0" distR="0" wp14:anchorId="63F19BC9" wp14:editId="664DA018">
+            <wp:extent cx="5943600" cy="3338830"/>
+            <wp:effectExtent l="0" t="0" r="0" b="0"/>
+            <wp:docPr id="38" name="Hình ảnh 38"/>
+            <wp:cNvGraphicFramePr>
+              <a:graphicFrameLocks xmlns:a="http://schemas.openxmlformats.org/drawingml/2006/main" noChangeAspect="1"/>
+            </wp:cNvGraphicFramePr>
+            <a:graphic xmlns:a="http://schemas.openxmlformats.org/drawingml/2006/main">
+              <a:graphicData uri="http://schemas.openxmlformats.org/drawingml/2006/picture">
+                <pic:pic xmlns:pic="http://schemas.openxmlformats.org/drawingml/2006/picture">
+                  <pic:nvPicPr>
+                    <pic:cNvPr id="1" name=""/>
+                    <pic:cNvPicPr/>
+                  </pic:nvPicPr>
+                  <pic:blipFill>
+                    <a:blip r:embed="rId41"/>
+                    <a:stretch>
+                      <a:fillRect/>
+                    </a:stretch>
+                  </pic:blipFill>
+                  <pic:spPr>
+                    <a:xfrm>
+                      <a:off x="0" y="0"/>
+                      <a:ext cx="5943600" cy="3338830"/>
+                    </a:xfrm>
+                    <a:prstGeom prst="rect">
+                      <a:avLst/>
+                    </a:prstGeom>
+                  </pic:spPr>
+                </pic:pic>
+              </a:graphicData>
+            </a:graphic>
+          </wp:inline>
+        </w:drawing>
+      </w:r>
+    </w:p>
+    <w:p>
+      <w:pPr>
+        <w:rPr>
+          <w:rFonts w:ascii="Times New Roman" w:hAnsi="Times New Roman" w:cs="Times New Roman"/>
+          <w:sz w:val="28"/>
+          <w:szCs w:val="28"/>
+        </w:rPr>
+      </w:pPr>
+      <w:r>
+        <w:rPr>
+          <w:rFonts w:ascii="Times New Roman" w:hAnsi="Times New Roman" w:cs="Times New Roman"/>
+          <w:sz w:val="28"/>
+          <w:szCs w:val="28"/>
+        </w:rPr>
+        <w:t>Bài 4:</w:t>
+      </w:r>
+    </w:p>
+    <w:p>
+      <w:pPr>
+        <w:pStyle w:val="oancuaDanhsach"/>
+        <w:numPr>
+          <w:ilvl w:val="0"/>
+          <w:numId w:val="5"/>
+        </w:numPr>
+        <w:rPr>
+          <w:rFonts w:ascii="Times New Roman" w:hAnsi="Times New Roman" w:cs="Times New Roman"/>
+          <w:sz w:val="28"/>
+          <w:szCs w:val="28"/>
+        </w:rPr>
+      </w:pPr>
+      <w:r>
+        <w:rPr>
+          <w:rFonts w:ascii="Times New Roman" w:hAnsi="Times New Roman" w:cs="Times New Roman"/>
+          <w:sz w:val="28"/>
+          <w:szCs w:val="28"/>
+        </w:rPr>
+        <w:t>Docker build and run</w:t>
+      </w:r>
+    </w:p>
+    <w:p>
+      <w:pPr>
+        <w:rPr>
+          <w:rFonts w:ascii="Times New Roman" w:hAnsi="Times New Roman" w:cs="Times New Roman"/>
+          <w:sz w:val="28"/>
+          <w:szCs w:val="28"/>
+        </w:rPr>
+      </w:pPr>
+    </w:p>
+    <w:p>
+      <w:pPr>
+        <w:rPr>
+          <w:rFonts w:ascii="Times New Roman" w:hAnsi="Times New Roman" w:cs="Times New Roman"/>
+          <w:sz w:val="28"/>
+          <w:szCs w:val="28"/>
+        </w:rPr>
+      </w:pPr>
+    </w:p>
+    <w:p>
+      <w:pPr>
+        <w:rPr>
+          <w:rFonts w:ascii="Times New Roman" w:hAnsi="Times New Roman" w:cs="Times New Roman"/>
+          <w:sz w:val="28"/>
+          <w:szCs w:val="28"/>
+        </w:rPr>
+      </w:pPr>
     </w:p>
     <w:sectPr>
       <w:pgSz w:w="12240" w:h="15840"/>
@@ -2363,8 +2892,364 @@
 </file>
 
 <file path=word/numbering.xml><?xml version="1.0" encoding="utf-8"?>
-<w:numbering xmlns:wpc="http://schemas.microsoft.com/office/word/2010/wordprocessingCanvas" xmlns:mc="http://schemas.openxmlformats.org/markup-compatibility/2006" xmlns:o="urn:schemas-microsoft-com:office:office" xmlns:r="http://schemas.openxmlformats.org/officeDocument/2006/relationships" xmlns:m="http://schemas.openxmlformats.org/officeDocument/2006/math" xmlns:v="urn:schemas-microsoft-com:vml" xmlns:wp14="http://schemas.microsoft.com/office/word/2010/wordprocessingDrawing" xmlns:wp="http://schemas.openxmlformats.org/drawingml/2006/wordprocessingDrawing" xmlns:w10="urn:schemas-microsoft-com:office:word" xmlns:w="http://schemas.openxmlformats.org/wordprocessingml/2006/main" xmlns:w14="http://schemas.microsoft.com/office/word/2010/wordml" xmlns:w15="http://schemas.microsoft.com/office/word/2012/wordml" xmlns:wpg="http://schemas.microsoft.com/office/word/2010/wordprocessingGroup" xmlns:wpi="http://schemas.microsoft.com/office/word/2010/wordprocessingInk" xmlns:wne="http://schemas.microsoft.com/office/word/2006/wordml" xmlns:wps="http://schemas.microsoft.com/office/word/2010/wordprocessingShape" mc:Ignorable="w14 w15 wp14">
-  <w:abstractNum w:abstractNumId="0">
+<w:numbering xmlns:wpc="http://schemas.microsoft.com/office/word/2010/wordprocessingCanvas" xmlns:cx="http://schemas.microsoft.com/office/drawing/2014/chartex" xmlns:cx1="http://schemas.microsoft.com/office/drawing/2015/9/8/chartex" xmlns:cx2="http://schemas.microsoft.com/office/drawing/2015/10/21/chartex" xmlns:cx3="http://schemas.microsoft.com/office/drawing/2016/5/9/chartex" xmlns:cx4="http://schemas.microsoft.com/office/drawing/2016/5/10/chartex" xmlns:cx5="http://schemas.microsoft.com/office/drawing/2016/5/11/chartex" xmlns:cx6="http://schemas.microsoft.com/office/drawing/2016/5/12/chartex" xmlns:cx7="http://schemas.microsoft.com/office/drawing/2016/5/13/chartex" xmlns:cx8="http://schemas.microsoft.com/office/drawing/2016/5/14/chartex" xmlns:mc="http://schemas.openxmlformats.org/markup-compatibility/2006" xmlns:aink="http://schemas.microsoft.com/office/drawing/2016/ink" xmlns:am3d="http://schemas.microsoft.com/office/drawing/2017/model3d" xmlns:o="urn:schemas-microsoft-com:office:office" xmlns:r="http://schemas.openxmlformats.org/officeDocument/2006/relationships" xmlns:m="http://schemas.openxmlformats.org/officeDocument/2006/math" xmlns:v="urn:schemas-microsoft-com:vml" xmlns:wp14="http://schemas.microsoft.com/office/word/2010/wordprocessingDrawing" xmlns:wp="http://schemas.openxmlformats.org/drawingml/2006/wordprocessingDrawing" xmlns:w10="urn:schemas-microsoft-com:office:word" xmlns:w="http://schemas.openxmlformats.org/wordprocessingml/2006/main" xmlns:w14="http://schemas.microsoft.com/office/word/2010/wordml" xmlns:w15="http://schemas.microsoft.com/office/word/2012/wordml" xmlns:w16cex="http://schemas.microsoft.com/office/word/2018/wordml/cex" xmlns:w16cid="http://schemas.microsoft.com/office/word/2016/wordml/cid" xmlns:w16="http://schemas.microsoft.com/office/word/2018/wordml" xmlns:w16sdtdh="http://schemas.microsoft.com/office/word/2020/wordml/sdtdatahash" xmlns:w16se="http://schemas.microsoft.com/office/word/2015/wordml/symex" xmlns:wpg="http://schemas.microsoft.com/office/word/2010/wordprocessingGroup" xmlns:wpi="http://schemas.microsoft.com/office/word/2010/wordprocessingInk" xmlns:wne="http://schemas.microsoft.com/office/word/2006/wordml" xmlns:wps="http://schemas.microsoft.com/office/word/2010/wordprocessingShape" mc:Ignorable="w14 w15 w16se w16cid w16 w16cex w16sdtdh wp14">
+  <w:abstractNum w:abstractNumId="0" w15:restartNumberingAfterBreak="0">
+    <w:nsid w:val="17B8212E"/>
+    <w:multiLevelType w:val="hybridMultilevel"/>
+    <w:tmpl w:val="5D808A16"/>
+    <w:lvl w:ilvl="0" w:tplc="04090019">
+      <w:start w:val="1"/>
+      <w:numFmt w:val="lowerLetter"/>
+      <w:lvlText w:val="%1."/>
+      <w:lvlJc w:val="left"/>
+      <w:pPr>
+        <w:ind w:left="720" w:hanging="360"/>
+      </w:pPr>
+      <w:rPr>
+        <w:rFonts w:hint="default"/>
+      </w:rPr>
+    </w:lvl>
+    <w:lvl w:ilvl="1" w:tplc="04090019" w:tentative="1">
+      <w:start w:val="1"/>
+      <w:numFmt w:val="lowerLetter"/>
+      <w:lvlText w:val="%2."/>
+      <w:lvlJc w:val="left"/>
+      <w:pPr>
+        <w:ind w:left="1440" w:hanging="360"/>
+      </w:pPr>
+    </w:lvl>
+    <w:lvl w:ilvl="2" w:tplc="0409001B" w:tentative="1">
+      <w:start w:val="1"/>
+      <w:numFmt w:val="lowerRoman"/>
+      <w:lvlText w:val="%3."/>
+      <w:lvlJc w:val="right"/>
+      <w:pPr>
+        <w:ind w:left="2160" w:hanging="180"/>
+      </w:pPr>
+    </w:lvl>
+    <w:lvl w:ilvl="3" w:tplc="0409000F" w:tentative="1">
+      <w:start w:val="1"/>
+      <w:numFmt w:val="decimal"/>
+      <w:lvlText w:val="%4."/>
+      <w:lvlJc w:val="left"/>
+      <w:pPr>
+        <w:ind w:left="2880" w:hanging="360"/>
+      </w:pPr>
+    </w:lvl>
+    <w:lvl w:ilvl="4" w:tplc="04090019" w:tentative="1">
+      <w:start w:val="1"/>
+      <w:numFmt w:val="lowerLetter"/>
+      <w:lvlText w:val="%5."/>
+      <w:lvlJc w:val="left"/>
+      <w:pPr>
+        <w:ind w:left="3600" w:hanging="360"/>
+      </w:pPr>
+    </w:lvl>
+    <w:lvl w:ilvl="5" w:tplc="0409001B" w:tentative="1">
+      <w:start w:val="1"/>
+      <w:numFmt w:val="lowerRoman"/>
+      <w:lvlText w:val="%6."/>
+      <w:lvlJc w:val="right"/>
+      <w:pPr>
+        <w:ind w:left="4320" w:hanging="180"/>
+      </w:pPr>
+    </w:lvl>
+    <w:lvl w:ilvl="6" w:tplc="0409000F" w:tentative="1">
+      <w:start w:val="1"/>
+      <w:numFmt w:val="decimal"/>
+      <w:lvlText w:val="%7."/>
+      <w:lvlJc w:val="left"/>
+      <w:pPr>
+        <w:ind w:left="5040" w:hanging="360"/>
+      </w:pPr>
+    </w:lvl>
+    <w:lvl w:ilvl="7" w:tplc="04090019" w:tentative="1">
+      <w:start w:val="1"/>
+      <w:numFmt w:val="lowerLetter"/>
+      <w:lvlText w:val="%8."/>
+      <w:lvlJc w:val="left"/>
+      <w:pPr>
+        <w:ind w:left="5760" w:hanging="360"/>
+      </w:pPr>
+    </w:lvl>
+    <w:lvl w:ilvl="8" w:tplc="0409001B" w:tentative="1">
+      <w:start w:val="1"/>
+      <w:numFmt w:val="lowerRoman"/>
+      <w:lvlText w:val="%9."/>
+      <w:lvlJc w:val="right"/>
+      <w:pPr>
+        <w:ind w:left="6480" w:hanging="180"/>
+      </w:pPr>
+    </w:lvl>
+  </w:abstractNum>
+  <w:abstractNum w:abstractNumId="1" w15:restartNumberingAfterBreak="0">
+    <w:nsid w:val="23620F4E"/>
+    <w:multiLevelType w:val="hybridMultilevel"/>
+    <w:tmpl w:val="89D09572"/>
+    <w:lvl w:ilvl="0" w:tplc="04090019">
+      <w:start w:val="1"/>
+      <w:numFmt w:val="lowerLetter"/>
+      <w:lvlText w:val="%1."/>
+      <w:lvlJc w:val="left"/>
+      <w:pPr>
+        <w:ind w:left="720" w:hanging="360"/>
+      </w:pPr>
+      <w:rPr>
+        <w:rFonts w:hint="default"/>
+      </w:rPr>
+    </w:lvl>
+    <w:lvl w:ilvl="1" w:tplc="04090019" w:tentative="1">
+      <w:start w:val="1"/>
+      <w:numFmt w:val="lowerLetter"/>
+      <w:lvlText w:val="%2."/>
+      <w:lvlJc w:val="left"/>
+      <w:pPr>
+        <w:ind w:left="1440" w:hanging="360"/>
+      </w:pPr>
+    </w:lvl>
+    <w:lvl w:ilvl="2" w:tplc="0409001B" w:tentative="1">
+      <w:start w:val="1"/>
+      <w:numFmt w:val="lowerRoman"/>
+      <w:lvlText w:val="%3."/>
+      <w:lvlJc w:val="right"/>
+      <w:pPr>
+        <w:ind w:left="2160" w:hanging="180"/>
+      </w:pPr>
+    </w:lvl>
+    <w:lvl w:ilvl="3" w:tplc="0409000F" w:tentative="1">
+      <w:start w:val="1"/>
+      <w:numFmt w:val="decimal"/>
+      <w:lvlText w:val="%4."/>
+      <w:lvlJc w:val="left"/>
+      <w:pPr>
+        <w:ind w:left="2880" w:hanging="360"/>
+      </w:pPr>
+    </w:lvl>
+    <w:lvl w:ilvl="4" w:tplc="04090019" w:tentative="1">
+      <w:start w:val="1"/>
+      <w:numFmt w:val="lowerLetter"/>
+      <w:lvlText w:val="%5."/>
+      <w:lvlJc w:val="left"/>
+      <w:pPr>
+        <w:ind w:left="3600" w:hanging="360"/>
+      </w:pPr>
+    </w:lvl>
+    <w:lvl w:ilvl="5" w:tplc="0409001B" w:tentative="1">
+      <w:start w:val="1"/>
+      <w:numFmt w:val="lowerRoman"/>
+      <w:lvlText w:val="%6."/>
+      <w:lvlJc w:val="right"/>
+      <w:pPr>
+        <w:ind w:left="4320" w:hanging="180"/>
+      </w:pPr>
+    </w:lvl>
+    <w:lvl w:ilvl="6" w:tplc="0409000F" w:tentative="1">
+      <w:start w:val="1"/>
+      <w:numFmt w:val="decimal"/>
+      <w:lvlText w:val="%7."/>
+      <w:lvlJc w:val="left"/>
+      <w:pPr>
+        <w:ind w:left="5040" w:hanging="360"/>
+      </w:pPr>
+    </w:lvl>
+    <w:lvl w:ilvl="7" w:tplc="04090019" w:tentative="1">
+      <w:start w:val="1"/>
+      <w:numFmt w:val="lowerLetter"/>
+      <w:lvlText w:val="%8."/>
+      <w:lvlJc w:val="left"/>
+      <w:pPr>
+        <w:ind w:left="5760" w:hanging="360"/>
+      </w:pPr>
+    </w:lvl>
+    <w:lvl w:ilvl="8" w:tplc="0409001B" w:tentative="1">
+      <w:start w:val="1"/>
+      <w:numFmt w:val="lowerRoman"/>
+      <w:lvlText w:val="%9."/>
+      <w:lvlJc w:val="right"/>
+      <w:pPr>
+        <w:ind w:left="6480" w:hanging="180"/>
+      </w:pPr>
+    </w:lvl>
+  </w:abstractNum>
+  <w:abstractNum w:abstractNumId="2" w15:restartNumberingAfterBreak="0">
+    <w:nsid w:val="23C029C4"/>
+    <w:multiLevelType w:val="hybridMultilevel"/>
+    <w:tmpl w:val="F2F434A8"/>
+    <w:lvl w:ilvl="0" w:tplc="04090019">
+      <w:start w:val="1"/>
+      <w:numFmt w:val="lowerLetter"/>
+      <w:lvlText w:val="%1."/>
+      <w:lvlJc w:val="left"/>
+      <w:pPr>
+        <w:ind w:left="720" w:hanging="360"/>
+      </w:pPr>
+      <w:rPr>
+        <w:rFonts w:hint="default"/>
+      </w:rPr>
+    </w:lvl>
+    <w:lvl w:ilvl="1" w:tplc="04090019" w:tentative="1">
+      <w:start w:val="1"/>
+      <w:numFmt w:val="lowerLetter"/>
+      <w:lvlText w:val="%2."/>
+      <w:lvlJc w:val="left"/>
+      <w:pPr>
+        <w:ind w:left="1440" w:hanging="360"/>
+      </w:pPr>
+    </w:lvl>
+    <w:lvl w:ilvl="2" w:tplc="0409001B" w:tentative="1">
+      <w:start w:val="1"/>
+      <w:numFmt w:val="lowerRoman"/>
+      <w:lvlText w:val="%3."/>
+      <w:lvlJc w:val="right"/>
+      <w:pPr>
+        <w:ind w:left="2160" w:hanging="180"/>
+      </w:pPr>
+    </w:lvl>
+    <w:lvl w:ilvl="3" w:tplc="0409000F" w:tentative="1">
+      <w:start w:val="1"/>
+      <w:numFmt w:val="decimal"/>
+      <w:lvlText w:val="%4."/>
+      <w:lvlJc w:val="left"/>
+      <w:pPr>
+        <w:ind w:left="2880" w:hanging="360"/>
+      </w:pPr>
+    </w:lvl>
+    <w:lvl w:ilvl="4" w:tplc="04090019" w:tentative="1">
+      <w:start w:val="1"/>
+      <w:numFmt w:val="lowerLetter"/>
+      <w:lvlText w:val="%5."/>
+      <w:lvlJc w:val="left"/>
+      <w:pPr>
+        <w:ind w:left="3600" w:hanging="360"/>
+      </w:pPr>
+    </w:lvl>
+    <w:lvl w:ilvl="5" w:tplc="0409001B" w:tentative="1">
+      <w:start w:val="1"/>
+      <w:numFmt w:val="lowerRoman"/>
+      <w:lvlText w:val="%6."/>
+      <w:lvlJc w:val="right"/>
+      <w:pPr>
+        <w:ind w:left="4320" w:hanging="180"/>
+      </w:pPr>
+    </w:lvl>
+    <w:lvl w:ilvl="6" w:tplc="0409000F" w:tentative="1">
+      <w:start w:val="1"/>
+      <w:numFmt w:val="decimal"/>
+      <w:lvlText w:val="%7."/>
+      <w:lvlJc w:val="left"/>
+      <w:pPr>
+        <w:ind w:left="5040" w:hanging="360"/>
+      </w:pPr>
+    </w:lvl>
+    <w:lvl w:ilvl="7" w:tplc="04090019" w:tentative="1">
+      <w:start w:val="1"/>
+      <w:numFmt w:val="lowerLetter"/>
+      <w:lvlText w:val="%8."/>
+      <w:lvlJc w:val="left"/>
+      <w:pPr>
+        <w:ind w:left="5760" w:hanging="360"/>
+      </w:pPr>
+    </w:lvl>
+    <w:lvl w:ilvl="8" w:tplc="0409001B" w:tentative="1">
+      <w:start w:val="1"/>
+      <w:numFmt w:val="lowerRoman"/>
+      <w:lvlText w:val="%9."/>
+      <w:lvlJc w:val="right"/>
+      <w:pPr>
+        <w:ind w:left="6480" w:hanging="180"/>
+      </w:pPr>
+    </w:lvl>
+  </w:abstractNum>
+  <w:abstractNum w:abstractNumId="3" w15:restartNumberingAfterBreak="0">
+    <w:nsid w:val="3E3F38F0"/>
+    <w:multiLevelType w:val="hybridMultilevel"/>
+    <w:tmpl w:val="CA2A211E"/>
+    <w:lvl w:ilvl="0" w:tplc="04090019">
+      <w:start w:val="1"/>
+      <w:numFmt w:val="lowerLetter"/>
+      <w:lvlText w:val="%1."/>
+      <w:lvlJc w:val="left"/>
+      <w:pPr>
+        <w:ind w:left="720" w:hanging="360"/>
+      </w:pPr>
+      <w:rPr>
+        <w:rFonts w:hint="default"/>
+      </w:rPr>
+    </w:lvl>
+    <w:lvl w:ilvl="1" w:tplc="04090019" w:tentative="1">
+      <w:start w:val="1"/>
+      <w:numFmt w:val="lowerLetter"/>
+      <w:lvlText w:val="%2."/>
+      <w:lvlJc w:val="left"/>
+      <w:pPr>
+        <w:ind w:left="1440" w:hanging="360"/>
+      </w:pPr>
+    </w:lvl>
+    <w:lvl w:ilvl="2" w:tplc="0409001B" w:tentative="1">
+      <w:start w:val="1"/>
+      <w:numFmt w:val="lowerRoman"/>
+      <w:lvlText w:val="%3."/>
+      <w:lvlJc w:val="right"/>
+      <w:pPr>
+        <w:ind w:left="2160" w:hanging="180"/>
+      </w:pPr>
+    </w:lvl>
+    <w:lvl w:ilvl="3" w:tplc="0409000F" w:tentative="1">
+      <w:start w:val="1"/>
+      <w:numFmt w:val="decimal"/>
+      <w:lvlText w:val="%4."/>
+      <w:lvlJc w:val="left"/>
+      <w:pPr>
+        <w:ind w:left="2880" w:hanging="360"/>
+      </w:pPr>
+    </w:lvl>
+    <w:lvl w:ilvl="4" w:tplc="04090019" w:tentative="1">
+      <w:start w:val="1"/>
+      <w:numFmt w:val="lowerLetter"/>
+      <w:lvlText w:val="%5."/>
+      <w:lvlJc w:val="left"/>
+      <w:pPr>
+        <w:ind w:left="3600" w:hanging="360"/>
+      </w:pPr>
+    </w:lvl>
+    <w:lvl w:ilvl="5" w:tplc="0409001B" w:tentative="1">
+      <w:start w:val="1"/>
+      <w:numFmt w:val="lowerRoman"/>
+      <w:lvlText w:val="%6."/>
+      <w:lvlJc w:val="right"/>
+      <w:pPr>
+        <w:ind w:left="4320" w:hanging="180"/>
+      </w:pPr>
+    </w:lvl>
+    <w:lvl w:ilvl="6" w:tplc="0409000F" w:tentative="1">
+      <w:start w:val="1"/>
+      <w:numFmt w:val="decimal"/>
+      <w:lvlText w:val="%7."/>
+      <w:lvlJc w:val="left"/>
+      <w:pPr>
+        <w:ind w:left="5040" w:hanging="360"/>
+      </w:pPr>
+    </w:lvl>
+    <w:lvl w:ilvl="7" w:tplc="04090019" w:tentative="1">
+      <w:start w:val="1"/>
+      <w:numFmt w:val="lowerLetter"/>
+      <w:lvlText w:val="%8."/>
+      <w:lvlJc w:val="left"/>
+      <w:pPr>
+        <w:ind w:left="5760" w:hanging="360"/>
+      </w:pPr>
+    </w:lvl>
+    <w:lvl w:ilvl="8" w:tplc="0409001B" w:tentative="1">
+      <w:start w:val="1"/>
+      <w:numFmt w:val="lowerRoman"/>
+      <w:lvlText w:val="%9."/>
+      <w:lvlJc w:val="right"/>
+      <w:pPr>
+        <w:ind w:left="6480" w:hanging="180"/>
+      </w:pPr>
+    </w:lvl>
+  </w:abstractNum>
+  <w:abstractNum w:abstractNumId="4" w15:restartNumberingAfterBreak="0">
     <w:nsid w:val="7B7A522E"/>
     <w:multiLevelType w:val="hybridMultilevel"/>
     <w:tmpl w:val="5E8A2FAC"/>
@@ -2454,13 +3339,25 @@
     </w:lvl>
   </w:abstractNum>
   <w:num w:numId="1">
+    <w:abstractNumId w:val="4"/>
+  </w:num>
+  <w:num w:numId="2">
+    <w:abstractNumId w:val="1"/>
+  </w:num>
+  <w:num w:numId="3">
     <w:abstractNumId w:val="0"/>
+  </w:num>
+  <w:num w:numId="4">
+    <w:abstractNumId w:val="3"/>
+  </w:num>
+  <w:num w:numId="5">
+    <w:abstractNumId w:val="2"/>
   </w:num>
 </w:numbering>
 </file>
 
 <file path=word/styles.xml><?xml version="1.0" encoding="utf-8"?>
-<w:styles xmlns:mc="http://schemas.openxmlformats.org/markup-compatibility/2006" xmlns:r="http://schemas.openxmlformats.org/officeDocument/2006/relationships" xmlns:w="http://schemas.openxmlformats.org/wordprocessingml/2006/main" xmlns:w14="http://schemas.microsoft.com/office/word/2010/wordml" xmlns:w15="http://schemas.microsoft.com/office/word/2012/wordml" mc:Ignorable="w14 w15">
+<w:styles xmlns:mc="http://schemas.openxmlformats.org/markup-compatibility/2006" xmlns:r="http://schemas.openxmlformats.org/officeDocument/2006/relationships" xmlns:w="http://schemas.openxmlformats.org/wordprocessingml/2006/main" xmlns:w14="http://schemas.microsoft.com/office/word/2010/wordml" xmlns:w15="http://schemas.microsoft.com/office/word/2012/wordml" xmlns:w16cex="http://schemas.microsoft.com/office/word/2018/wordml/cex" xmlns:w16cid="http://schemas.microsoft.com/office/word/2016/wordml/cid" xmlns:w16="http://schemas.microsoft.com/office/word/2018/wordml" xmlns:w16sdtdh="http://schemas.microsoft.com/office/word/2020/wordml/sdtdatahash" xmlns:w16se="http://schemas.microsoft.com/office/word/2015/wordml/symex" mc:Ignorable="w14 w15 w16se w16cid w16 w16cex w16sdtdh">
   <w:docDefaults>
     <w:rPrDefault>
       <w:rPr>
@@ -2476,7 +3373,7 @@
       </w:pPr>
     </w:pPrDefault>
   </w:docDefaults>
-  <w:latentStyles w:defLockedState="0" w:defUIPriority="99" w:defSemiHidden="0" w:defUnhideWhenUsed="0" w:defQFormat="0" w:count="371">
+  <w:latentStyles w:defLockedState="0" w:defUIPriority="99" w:defSemiHidden="0" w:defUnhideWhenUsed="0" w:defQFormat="0" w:count="376">
     <w:lsdException w:name="Normal" w:uiPriority="0" w:qFormat="1"/>
     <w:lsdException w:name="heading 1" w:uiPriority="9" w:qFormat="1"/>
     <w:lsdException w:name="heading 2" w:semiHidden="1" w:uiPriority="9" w:unhideWhenUsed="1" w:qFormat="1"/>
@@ -2582,7 +3479,6 @@
     <w:lsdException w:name="HTML Sample" w:semiHidden="1" w:unhideWhenUsed="1"/>
     <w:lsdException w:name="HTML Typewriter" w:semiHidden="1" w:unhideWhenUsed="1"/>
     <w:lsdException w:name="HTML Variable" w:semiHidden="1" w:unhideWhenUsed="1"/>
-    <w:lsdException w:name="Normal Table" w:semiHidden="1" w:unhideWhenUsed="1"/>
     <w:lsdException w:name="annotation subject" w:semiHidden="1" w:unhideWhenUsed="1"/>
     <w:lsdException w:name="No List" w:semiHidden="1" w:unhideWhenUsed="1"/>
     <w:lsdException w:name="Outline List 1" w:semiHidden="1" w:unhideWhenUsed="1"/>
@@ -2625,11 +3521,8 @@
     <w:lsdException w:name="Table Contemporary" w:semiHidden="1" w:unhideWhenUsed="1"/>
     <w:lsdException w:name="Table Elegant" w:semiHidden="1" w:unhideWhenUsed="1"/>
     <w:lsdException w:name="Table Professional" w:semiHidden="1" w:unhideWhenUsed="1"/>
-    <w:lsdException w:name="Table Subtle 1" w:semiHidden="1" w:unhideWhenUsed="1"/>
     <w:lsdException w:name="Table Subtle 2" w:semiHidden="1" w:unhideWhenUsed="1"/>
     <w:lsdException w:name="Table Web 1" w:semiHidden="1" w:unhideWhenUsed="1"/>
-    <w:lsdException w:name="Table Web 2" w:semiHidden="1" w:unhideWhenUsed="1"/>
-    <w:lsdException w:name="Table Web 3" w:semiHidden="1" w:unhideWhenUsed="1"/>
     <w:lsdException w:name="Balloon Text" w:semiHidden="1" w:unhideWhenUsed="1"/>
     <w:lsdException w:name="Table Grid" w:uiPriority="39"/>
     <w:lsdException w:name="Table Theme" w:semiHidden="1" w:unhideWhenUsed="1"/>
@@ -2848,18 +3741,23 @@
     <w:lsdException w:name="List Table 5 Dark Accent 6" w:uiPriority="50"/>
     <w:lsdException w:name="List Table 6 Colorful Accent 6" w:uiPriority="51"/>
     <w:lsdException w:name="List Table 7 Colorful Accent 6" w:uiPriority="52"/>
+    <w:lsdException w:name="Mention" w:semiHidden="1" w:unhideWhenUsed="1"/>
+    <w:lsdException w:name="Smart Hyperlink" w:semiHidden="1" w:unhideWhenUsed="1"/>
+    <w:lsdException w:name="Hashtag" w:semiHidden="1" w:unhideWhenUsed="1"/>
+    <w:lsdException w:name="Unresolved Mention" w:semiHidden="1" w:unhideWhenUsed="1"/>
+    <w:lsdException w:name="Smart Link" w:semiHidden="1" w:unhideWhenUsed="1"/>
   </w:latentStyles>
-  <w:style w:type="paragraph" w:default="1" w:styleId="Normal">
+  <w:style w:type="paragraph" w:default="1" w:styleId="Binhthng">
     <w:name w:val="Normal"/>
     <w:qFormat/>
   </w:style>
-  <w:style w:type="character" w:default="1" w:styleId="DefaultParagraphFont">
+  <w:style w:type="character" w:default="1" w:styleId="Phngmcinhcuaoanvn">
     <w:name w:val="Default Paragraph Font"/>
     <w:uiPriority w:val="1"/>
     <w:semiHidden/>
     <w:unhideWhenUsed/>
   </w:style>
-  <w:style w:type="table" w:default="1" w:styleId="TableNormal">
+  <w:style w:type="table" w:default="1" w:styleId="BangThngthng">
     <w:name w:val="Normal Table"/>
     <w:uiPriority w:val="99"/>
     <w:semiHidden/>
@@ -2874,15 +3772,15 @@
       </w:tblCellMar>
     </w:tblPr>
   </w:style>
-  <w:style w:type="numbering" w:default="1" w:styleId="NoList">
+  <w:style w:type="numbering" w:default="1" w:styleId="Khngco">
     <w:name w:val="No List"/>
     <w:uiPriority w:val="99"/>
     <w:semiHidden/>
     <w:unhideWhenUsed/>
   </w:style>
-  <w:style w:type="paragraph" w:styleId="ListParagraph">
+  <w:style w:type="paragraph" w:styleId="oancuaDanhsach">
     <w:name w:val="List Paragraph"/>
-    <w:basedOn w:val="Normal"/>
+    <w:basedOn w:val="Binhthng"/>
     <w:uiPriority w:val="34"/>
     <w:qFormat/>
     <w:rsid w:val="002320F1"/>

</xml_diff>